<commit_message>
Word Nohalez: gráfico nativo editable, filas alineadas, más aire y saltos de página limpios
Co-Authored-By: Claude Opus 5.5 <noreply@anthropic.com>
Claude-Session: https://claude.ai/code/session_01FcFWpQUzG6fc2uAuLecbPp
</commit_message>
<xml_diff>
--- a/entregas/renovare/presupuesto-nohalez/PRESUPUESTO NOHALEZ - SV-0045-03.docx
+++ b/entregas/renovare/presupuesto-nohalez/PRESUPUESTO NOHALEZ - SV-0045-03.docx
@@ -193,7 +193,7 @@
                 <w:sz w:val="15"/>
                 <w:szCs w:val="15"/>
               </w:rPr>
-              <w:t xml:space="preserve">624 892 643 · renovaredyb@gmail.com</w:t>
+              <w:t xml:space="preserve">624 892 643 · renovaredyb@gmail.com</w:t>
             </w:r>
           </w:p>
         </w:tc>
@@ -302,7 +302,7 @@
           </w:tcPr>
           <w:p>
             <w:pPr>
-              <w:keepNext/>
+              <w:keepNext w:val="false"/>
               <w:keepLines/>
               <w:spacing w:after="0" w:before="0" w:line="193" w:lineRule="atLeast"/>
             </w:pPr>
@@ -360,7 +360,7 @@
           </w:tcPr>
           <w:p>
             <w:pPr>
-              <w:keepNext/>
+              <w:keepNext w:val="false"/>
               <w:keepLines/>
               <w:spacing w:after="0" w:before="0" w:line="193" w:lineRule="atLeast"/>
             </w:pPr>
@@ -413,7 +413,7 @@
           </w:tcPr>
           <w:p>
             <w:pPr>
-              <w:keepNext/>
+              <w:keepNext w:val="false"/>
               <w:keepLines/>
               <w:spacing w:after="0" w:before="0" w:line="193" w:lineRule="atLeast"/>
             </w:pPr>
@@ -466,7 +466,7 @@
           </w:tcPr>
           <w:p>
             <w:pPr>
-              <w:keepNext/>
+              <w:keepNext w:val="false"/>
               <w:keepLines/>
               <w:spacing w:after="0" w:before="0" w:line="193" w:lineRule="atLeast"/>
             </w:pPr>
@@ -519,7 +519,7 @@
           </w:tcPr>
           <w:p>
             <w:pPr>
-              <w:keepNext/>
+              <w:keepNext w:val="false"/>
               <w:keepLines/>
               <w:spacing w:after="0" w:before="0" w:line="193" w:lineRule="atLeast"/>
             </w:pPr>
@@ -949,6 +949,22 @@
         </w:tc>
       </w:tr>
     </w:tbl>
+    <w:p>
+      <w:pPr>
+        <w:keepLines/>
+        <w:spacing w:after="0" w:before="340" w:line="20" w:lineRule="exact"/>
+      </w:pPr>
+      <w:r>
+        <w:rPr>
+          <w:rFonts w:ascii="Inter" w:cs="Inter" w:eastAsia="Inter" w:hAnsi="Inter"/>
+          <w:color w:val="1C1A16"/>
+          <w:kern w:val="2"/>
+          <w:sz w:val="4"/>
+          <w:szCs w:val="4"/>
+        </w:rPr>
+        <w:t xml:space="preserve"/>
+      </w:r>
+    </w:p>
     <w:tbl>
       <w:tblPr>
         <w:tblW w:type="dxa" w:w="9638"/>
@@ -970,9 +986,11 @@
         </w:tblCellMar>
       </w:tblPr>
       <w:tblGrid>
-        <w:gridCol w:w="4592"/>
+        <w:gridCol w:w="2098"/>
+        <w:gridCol w:w="2494"/>
         <w:gridCol w:w="454"/>
-        <w:gridCol w:w="4592"/>
+        <w:gridCol w:w="1644"/>
+        <w:gridCol w:w="2948"/>
       </w:tblGrid>
       <w:tr>
         <w:trPr>
@@ -981,296 +999,7 @@
         <w:tc>
           <w:tcPr>
             <w:tcW w:type="dxa" w:w="4592"/>
-            <w:tcBorders>
-              <w:top w:val="nil" w:color="auto" w:sz="0"/>
-              <w:left w:val="nil" w:color="auto" w:sz="0"/>
-              <w:bottom w:val="nil" w:color="auto" w:sz="0"/>
-              <w:right w:val="nil" w:color="auto" w:sz="0"/>
-            </w:tcBorders>
-            <w:tcMar>
-              <w:top w:type="dxa" w:w="283"/>
-              <w:left w:type="dxa" w:w="0"/>
-              <w:bottom w:type="dxa" w:w="0"/>
-              <w:right w:type="dxa" w:w="0"/>
-            </w:tcMar>
-            <w:vAlign w:val="top"/>
-          </w:tcPr>
-          <w:p>
-            <w:pPr>
-              <w:keepNext/>
-              <w:keepLines/>
-              <w:spacing w:after="91" w:before="0" w:line="280" w:lineRule="atLeast"/>
-            </w:pPr>
-            <w:r>
-              <w:rPr>
-                <w:rFonts w:ascii="Arial" w:cs="Arial" w:eastAsia="Arial" w:hAnsi="Arial"/>
-                <w:color w:val="BA9A58"/>
-                <w:kern w:val="2"/>
-                <w:sz w:val="22"/>
-                <w:szCs w:val="22"/>
-              </w:rPr>
-              <w:t xml:space="preserve">■</w:t>
-            </w:r>
-            <w:r>
-              <w:rPr>
-                <w:rFonts w:ascii="Inter SemiBold" w:cs="Inter SemiBold" w:eastAsia="Inter SemiBold" w:hAnsi="Inter SemiBold"/>
-                <w:color w:val="1C1A16"/>
-                <w:kern w:val="2"/>
-                <w:sz w:val="20"/>
-                <w:szCs w:val="20"/>
-              </w:rPr>
-              <w:t xml:space="preserve"> Alcance principal</w:t>
-            </w:r>
-          </w:p>
-          <w:tbl>
-            <w:tblPr>
-              <w:tblW w:type="dxa" w:w="4592"/>
-              <w:tblInd w:type="dxa" w:w="0"/>
-              <w:tblBorders>
-                <w:top w:val="nil" w:color="auto" w:sz="0"/>
-                <w:left w:val="nil" w:color="auto" w:sz="0"/>
-                <w:bottom w:val="nil" w:color="auto" w:sz="0"/>
-                <w:right w:val="nil" w:color="auto" w:sz="0"/>
-                <w:insideH w:val="nil" w:color="auto" w:sz="0"/>
-                <w:insideV w:val="nil" w:color="auto" w:sz="0"/>
-              </w:tblBorders>
-              <w:tblLayout w:type="fixed"/>
-              <w:tblCellMar>
-                <w:top w:type="dxa" w:w="0"/>
-                <w:left w:type="dxa" w:w="0"/>
-                <w:bottom w:type="dxa" w:w="0"/>
-                <w:right w:type="dxa" w:w="0"/>
-              </w:tblCellMar>
-            </w:tblPr>
-            <w:tblGrid>
-              <w:gridCol w:w="1701"/>
-              <w:gridCol w:w="2891"/>
-            </w:tblGrid>
-            <w:tr>
-              <w:trPr>
-                <w:cantSplit/>
-              </w:trPr>
-              <w:tc>
-                <w:tcPr>
-                  <w:tcW w:type="dxa" w:w="1701"/>
-                  <w:tcBorders>
-                    <w:top w:val="nil" w:color="auto" w:sz="0"/>
-                    <w:left w:val="nil" w:color="auto" w:sz="0"/>
-                    <w:bottom w:val="single" w:color="E2DBCD" w:sz="4"/>
-                    <w:right w:val="nil" w:color="auto" w:sz="0"/>
-                  </w:tcBorders>
-                  <w:tcMar>
-                    <w:top w:type="dxa" w:w="68"/>
-                    <w:left w:type="dxa" w:w="0"/>
-                    <w:bottom w:type="dxa" w:w="68"/>
-                    <w:right w:type="dxa" w:w="57"/>
-                  </w:tcMar>
-                  <w:vAlign w:val="top"/>
-                </w:tcPr>
-                <w:p>
-                  <w:pPr>
-                    <w:keepLines/>
-                    <w:spacing w:after="0" w:before="0" w:line="280" w:lineRule="atLeast"/>
-                  </w:pPr>
-                  <w:r>
-                    <w:rPr>
-                      <w:rFonts w:ascii="Inter" w:cs="Inter" w:eastAsia="Inter" w:hAnsi="Inter"/>
-                      <w:color w:val="625B50"/>
-                      <w:kern w:val="2"/>
-                      <w:sz w:val="19"/>
-                      <w:szCs w:val="19"/>
-                    </w:rPr>
-                    <w:t xml:space="preserve">Espacios</w:t>
-                  </w:r>
-                </w:p>
-              </w:tc>
-              <w:tc>
-                <w:tcPr>
-                  <w:tcW w:type="dxa" w:w="2891"/>
-                  <w:tcBorders>
-                    <w:top w:val="nil" w:color="auto" w:sz="0"/>
-                    <w:left w:val="nil" w:color="auto" w:sz="0"/>
-                    <w:bottom w:val="single" w:color="E2DBCD" w:sz="4"/>
-                    <w:right w:val="nil" w:color="auto" w:sz="0"/>
-                  </w:tcBorders>
-                  <w:tcMar>
-                    <w:top w:type="dxa" w:w="68"/>
-                    <w:left w:type="dxa" w:w="0"/>
-                    <w:bottom w:type="dxa" w:w="68"/>
-                    <w:right w:type="dxa" w:w="0"/>
-                  </w:tcMar>
-                  <w:vAlign w:val="top"/>
-                </w:tcPr>
-                <w:p>
-                  <w:pPr>
-                    <w:keepLines/>
-                    <w:spacing w:after="0" w:before="0" w:line="280" w:lineRule="atLeast"/>
-                  </w:pPr>
-                  <w:r>
-                    <w:rPr>
-                      <w:rFonts w:ascii="Inter Medium" w:cs="Inter Medium" w:eastAsia="Inter Medium" w:hAnsi="Inter Medium"/>
-                      <w:color w:val="1C1A16"/>
-                      <w:kern w:val="2"/>
-                      <w:sz w:val="19"/>
-                      <w:szCs w:val="19"/>
-                    </w:rPr>
-                    <w:t xml:space="preserve">Salón, baño, cocina y habitaciones</w:t>
-                  </w:r>
-                </w:p>
-              </w:tc>
-            </w:tr>
-            <w:tr>
-              <w:trPr>
-                <w:cantSplit/>
-              </w:trPr>
-              <w:tc>
-                <w:tcPr>
-                  <w:tcW w:type="dxa" w:w="1701"/>
-                  <w:tcBorders>
-                    <w:top w:val="nil" w:color="auto" w:sz="0"/>
-                    <w:left w:val="nil" w:color="auto" w:sz="0"/>
-                    <w:bottom w:val="single" w:color="E2DBCD" w:sz="4"/>
-                    <w:right w:val="nil" w:color="auto" w:sz="0"/>
-                  </w:tcBorders>
-                  <w:tcMar>
-                    <w:top w:type="dxa" w:w="68"/>
-                    <w:left w:type="dxa" w:w="0"/>
-                    <w:bottom w:type="dxa" w:w="68"/>
-                    <w:right w:type="dxa" w:w="57"/>
-                  </w:tcMar>
-                  <w:vAlign w:val="top"/>
-                </w:tcPr>
-                <w:p>
-                  <w:pPr>
-                    <w:keepLines/>
-                    <w:spacing w:after="0" w:before="0" w:line="280" w:lineRule="atLeast"/>
-                  </w:pPr>
-                  <w:r>
-                    <w:rPr>
-                      <w:rFonts w:ascii="Inter" w:cs="Inter" w:eastAsia="Inter" w:hAnsi="Inter"/>
-                      <w:color w:val="625B50"/>
-                      <w:kern w:val="2"/>
-                      <w:sz w:val="19"/>
-                      <w:szCs w:val="19"/>
-                    </w:rPr>
-                    <w:t xml:space="preserve">Superficie intervenida</w:t>
-                  </w:r>
-                </w:p>
-              </w:tc>
-              <w:tc>
-                <w:tcPr>
-                  <w:tcW w:type="dxa" w:w="2891"/>
-                  <w:tcBorders>
-                    <w:top w:val="nil" w:color="auto" w:sz="0"/>
-                    <w:left w:val="nil" w:color="auto" w:sz="0"/>
-                    <w:bottom w:val="single" w:color="E2DBCD" w:sz="4"/>
-                    <w:right w:val="nil" w:color="auto" w:sz="0"/>
-                  </w:tcBorders>
-                  <w:tcMar>
-                    <w:top w:type="dxa" w:w="68"/>
-                    <w:left w:type="dxa" w:w="0"/>
-                    <w:bottom w:type="dxa" w:w="68"/>
-                    <w:right w:type="dxa" w:w="0"/>
-                  </w:tcMar>
-                  <w:vAlign w:val="top"/>
-                </w:tcPr>
-                <w:p>
-                  <w:pPr>
-                    <w:keepLines/>
-                    <w:spacing w:after="0" w:before="0" w:line="280" w:lineRule="atLeast"/>
-                  </w:pPr>
-                  <w:r>
-                    <w:rPr>
-                      <w:rFonts w:ascii="Inter Medium" w:cs="Inter Medium" w:eastAsia="Inter Medium" w:hAnsi="Inter Medium"/>
-                      <w:color w:val="1C1A16"/>
-                      <w:kern w:val="2"/>
-                      <w:sz w:val="19"/>
-                      <w:szCs w:val="19"/>
-                    </w:rPr>
-                    <w:t xml:space="preserve">75 m²</w:t>
-                  </w:r>
-                </w:p>
-              </w:tc>
-            </w:tr>
-            <w:tr>
-              <w:trPr>
-                <w:cantSplit/>
-              </w:trPr>
-              <w:tc>
-                <w:tcPr>
-                  <w:tcW w:type="dxa" w:w="1701"/>
-                  <w:tcBorders>
-                    <w:top w:val="nil" w:color="auto" w:sz="0"/>
-                    <w:left w:val="nil" w:color="auto" w:sz="0"/>
-                    <w:bottom w:val="single" w:color="E2DBCD" w:sz="4"/>
-                    <w:right w:val="nil" w:color="auto" w:sz="0"/>
-                  </w:tcBorders>
-                  <w:tcMar>
-                    <w:top w:type="dxa" w:w="68"/>
-                    <w:left w:type="dxa" w:w="0"/>
-                    <w:bottom w:type="dxa" w:w="68"/>
-                    <w:right w:type="dxa" w:w="57"/>
-                  </w:tcMar>
-                  <w:vAlign w:val="top"/>
-                </w:tcPr>
-                <w:p>
-                  <w:pPr>
-                    <w:keepLines/>
-                    <w:spacing w:after="0" w:before="0" w:line="280" w:lineRule="atLeast"/>
-                  </w:pPr>
-                  <w:r>
-                    <w:rPr>
-                      <w:rFonts w:ascii="Inter" w:cs="Inter" w:eastAsia="Inter" w:hAnsi="Inter"/>
-                      <w:color w:val="625B50"/>
-                      <w:kern w:val="2"/>
-                      <w:sz w:val="19"/>
-                      <w:szCs w:val="19"/>
-                    </w:rPr>
-                    <w:t xml:space="preserve">Tipo de inmueble</w:t>
-                  </w:r>
-                </w:p>
-              </w:tc>
-              <w:tc>
-                <w:tcPr>
-                  <w:tcW w:type="dxa" w:w="2891"/>
-                  <w:tcBorders>
-                    <w:top w:val="nil" w:color="auto" w:sz="0"/>
-                    <w:left w:val="nil" w:color="auto" w:sz="0"/>
-                    <w:bottom w:val="single" w:color="E2DBCD" w:sz="4"/>
-                    <w:right w:val="nil" w:color="auto" w:sz="0"/>
-                  </w:tcBorders>
-                  <w:tcMar>
-                    <w:top w:type="dxa" w:w="68"/>
-                    <w:left w:type="dxa" w:w="0"/>
-                    <w:bottom w:type="dxa" w:w="68"/>
-                    <w:right w:type="dxa" w:w="0"/>
-                  </w:tcMar>
-                  <w:vAlign w:val="top"/>
-                </w:tcPr>
-                <w:p>
-                  <w:pPr>
-                    <w:keepLines/>
-                    <w:spacing w:after="0" w:before="0" w:line="280" w:lineRule="atLeast"/>
-                  </w:pPr>
-                  <w:r>
-                    <w:rPr>
-                      <w:rFonts w:ascii="Inter Medium" w:cs="Inter Medium" w:eastAsia="Inter Medium" w:hAnsi="Inter Medium"/>
-                      <w:color w:val="1C1A16"/>
-                      <w:kern w:val="2"/>
-                      <w:sz w:val="19"/>
-                      <w:szCs w:val="19"/>
-                    </w:rPr>
-                    <w:t xml:space="preserve">Apartamento</w:t>
-                  </w:r>
-                </w:p>
-              </w:tc>
-            </w:tr>
-          </w:tbl>
-          <w:p/>
-        </w:tc>
-        <w:tc>
-          <w:tcPr>
-            <w:tcW w:type="dxa" w:w="454"/>
+            <w:gridSpan w:val="2"/>
             <w:tcBorders>
               <w:top w:val="nil" w:color="auto" w:sz="0"/>
               <w:left w:val="nil" w:color="auto" w:sz="0"/>
@@ -1287,24 +1016,35 @@
           </w:tcPr>
           <w:p>
             <w:pPr>
-              <w:keepLines/>
-              <w:spacing w:after="0" w:before="0" w:line="20" w:lineRule="exact"/>
-            </w:pPr>
-            <w:r>
-              <w:rPr>
-                <w:rFonts w:ascii="Inter" w:cs="Inter" w:eastAsia="Inter" w:hAnsi="Inter"/>
-                <w:color w:val="1C1A16"/>
-                <w:kern w:val="2"/>
-                <w:sz w:val="4"/>
-                <w:szCs w:val="4"/>
-              </w:rPr>
-              <w:t xml:space="preserve"/>
-            </w:r>
-          </w:p>
-        </w:tc>
-        <w:tc>
-          <w:tcPr>
-            <w:tcW w:type="dxa" w:w="4592"/>
+              <w:keepNext/>
+              <w:keepLines/>
+              <w:spacing w:after="85" w:before="0" w:line="280" w:lineRule="atLeast"/>
+            </w:pPr>
+            <w:r>
+              <w:rPr>
+                <w:rFonts w:ascii="Arial" w:cs="Arial" w:eastAsia="Arial" w:hAnsi="Arial"/>
+                <w:color w:val="BA9A58"/>
+                <w:kern w:val="2"/>
+                <w:sz w:val="22"/>
+                <w:szCs w:val="22"/>
+              </w:rPr>
+              <w:t xml:space="preserve">■</w:t>
+            </w:r>
+            <w:r>
+              <w:rPr>
+                <w:rFonts w:ascii="Inter SemiBold" w:cs="Inter SemiBold" w:eastAsia="Inter SemiBold" w:hAnsi="Inter SemiBold"/>
+                <w:color w:val="1C1A16"/>
+                <w:kern w:val="2"/>
+                <w:sz w:val="20"/>
+                <w:szCs w:val="20"/>
+              </w:rPr>
+              <w:t xml:space="preserve"> Alcance principal</w:t>
+            </w:r>
+          </w:p>
+        </w:tc>
+        <w:tc>
+          <w:tcPr>
+            <w:tcW w:type="dxa" w:w="454"/>
             <w:tcBorders>
               <w:top w:val="nil" w:color="auto" w:sz="0"/>
               <w:left w:val="nil" w:color="auto" w:sz="0"/>
@@ -1312,7 +1052,7 @@
               <w:right w:val="nil" w:color="auto" w:sz="0"/>
             </w:tcBorders>
             <w:tcMar>
-              <w:top w:type="dxa" w:w="283"/>
+              <w:top w:type="dxa" w:w="0"/>
               <w:left w:type="dxa" w:w="0"/>
               <w:bottom w:type="dxa" w:w="0"/>
               <w:right w:type="dxa" w:w="0"/>
@@ -1321,9 +1061,44 @@
           </w:tcPr>
           <w:p>
             <w:pPr>
+              <w:keepLines/>
+              <w:spacing w:after="0" w:before="0" w:line="20" w:lineRule="exact"/>
+            </w:pPr>
+            <w:r>
+              <w:rPr>
+                <w:rFonts w:ascii="Inter" w:cs="Inter" w:eastAsia="Inter" w:hAnsi="Inter"/>
+                <w:color w:val="1C1A16"/>
+                <w:kern w:val="2"/>
+                <w:sz w:val="4"/>
+                <w:szCs w:val="4"/>
+              </w:rPr>
+              <w:t xml:space="preserve"/>
+            </w:r>
+          </w:p>
+        </w:tc>
+        <w:tc>
+          <w:tcPr>
+            <w:tcW w:type="dxa" w:w="4592"/>
+            <w:gridSpan w:val="2"/>
+            <w:tcBorders>
+              <w:top w:val="nil" w:color="auto" w:sz="0"/>
+              <w:left w:val="nil" w:color="auto" w:sz="0"/>
+              <w:bottom w:val="nil" w:color="auto" w:sz="0"/>
+              <w:right w:val="nil" w:color="auto" w:sz="0"/>
+            </w:tcBorders>
+            <w:tcMar>
+              <w:top w:type="dxa" w:w="0"/>
+              <w:left w:type="dxa" w:w="0"/>
+              <w:bottom w:type="dxa" w:w="0"/>
+              <w:right w:type="dxa" w:w="0"/>
+            </w:tcMar>
+            <w:vAlign w:val="top"/>
+          </w:tcPr>
+          <w:p>
+            <w:pPr>
               <w:keepNext/>
               <w:keepLines/>
-              <w:spacing w:after="91" w:before="0" w:line="280" w:lineRule="atLeast"/>
+              <w:spacing w:after="85" w:before="0" w:line="280" w:lineRule="atLeast"/>
             </w:pPr>
             <w:r>
               <w:rPr>
@@ -1346,324 +1121,706 @@
               <w:t xml:space="preserve"> Planificación</w:t>
             </w:r>
           </w:p>
-          <w:tbl>
-            <w:tblPr>
-              <w:tblW w:type="dxa" w:w="4592"/>
-              <w:tblInd w:type="dxa" w:w="0"/>
-              <w:tblBorders>
-                <w:top w:val="nil" w:color="auto" w:sz="0"/>
-                <w:left w:val="nil" w:color="auto" w:sz="0"/>
-                <w:bottom w:val="nil" w:color="auto" w:sz="0"/>
-                <w:right w:val="nil" w:color="auto" w:sz="0"/>
-                <w:insideH w:val="nil" w:color="auto" w:sz="0"/>
-                <w:insideV w:val="nil" w:color="auto" w:sz="0"/>
-              </w:tblBorders>
-              <w:tblLayout w:type="fixed"/>
-              <w:tblCellMar>
-                <w:top w:type="dxa" w:w="0"/>
-                <w:left w:type="dxa" w:w="0"/>
-                <w:bottom w:type="dxa" w:w="0"/>
-                <w:right w:type="dxa" w:w="0"/>
-              </w:tblCellMar>
-            </w:tblPr>
-            <w:tblGrid>
-              <w:gridCol w:w="1701"/>
-              <w:gridCol w:w="2891"/>
-            </w:tblGrid>
-            <w:tr>
-              <w:trPr>
-                <w:cantSplit/>
-              </w:trPr>
-              <w:tc>
-                <w:tcPr>
-                  <w:tcW w:type="dxa" w:w="1701"/>
-                  <w:tcBorders>
-                    <w:top w:val="nil" w:color="auto" w:sz="0"/>
-                    <w:left w:val="nil" w:color="auto" w:sz="0"/>
-                    <w:bottom w:val="single" w:color="E2DBCD" w:sz="4"/>
-                    <w:right w:val="nil" w:color="auto" w:sz="0"/>
-                  </w:tcBorders>
-                  <w:tcMar>
-                    <w:top w:type="dxa" w:w="68"/>
-                    <w:left w:type="dxa" w:w="0"/>
-                    <w:bottom w:type="dxa" w:w="68"/>
-                    <w:right w:type="dxa" w:w="57"/>
-                  </w:tcMar>
-                  <w:vAlign w:val="top"/>
-                </w:tcPr>
-                <w:p>
-                  <w:pPr>
-                    <w:keepLines/>
-                    <w:spacing w:after="0" w:before="0" w:line="280" w:lineRule="atLeast"/>
-                  </w:pPr>
-                  <w:r>
-                    <w:rPr>
-                      <w:rFonts w:ascii="Inter" w:cs="Inter" w:eastAsia="Inter" w:hAnsi="Inter"/>
-                      <w:color w:val="625B50"/>
-                      <w:kern w:val="2"/>
-                      <w:sz w:val="19"/>
-                      <w:szCs w:val="19"/>
-                    </w:rPr>
-                    <w:t xml:space="preserve">Duración base</w:t>
-                  </w:r>
-                </w:p>
-              </w:tc>
-              <w:tc>
-                <w:tcPr>
-                  <w:tcW w:type="dxa" w:w="2891"/>
-                  <w:tcBorders>
-                    <w:top w:val="nil" w:color="auto" w:sz="0"/>
-                    <w:left w:val="nil" w:color="auto" w:sz="0"/>
-                    <w:bottom w:val="single" w:color="E2DBCD" w:sz="4"/>
-                    <w:right w:val="nil" w:color="auto" w:sz="0"/>
-                  </w:tcBorders>
-                  <w:tcMar>
-                    <w:top w:type="dxa" w:w="68"/>
-                    <w:left w:type="dxa" w:w="0"/>
-                    <w:bottom w:type="dxa" w:w="68"/>
-                    <w:right w:type="dxa" w:w="0"/>
-                  </w:tcMar>
-                  <w:vAlign w:val="top"/>
-                </w:tcPr>
-                <w:p>
-                  <w:pPr>
-                    <w:keepLines/>
-                    <w:spacing w:after="0" w:before="0" w:line="280" w:lineRule="atLeast"/>
-                  </w:pPr>
-                  <w:r>
-                    <w:rPr>
-                      <w:rFonts w:ascii="Inter Medium" w:cs="Inter Medium" w:eastAsia="Inter Medium" w:hAnsi="Inter Medium"/>
-                      <w:color w:val="1C1A16"/>
-                      <w:kern w:val="2"/>
-                      <w:sz w:val="19"/>
-                      <w:szCs w:val="19"/>
-                    </w:rPr>
-                    <w:t xml:space="preserve">10⁠–⁠12 semanas</w:t>
-                  </w:r>
-                </w:p>
-              </w:tc>
-            </w:tr>
-            <w:tr>
-              <w:trPr>
-                <w:cantSplit/>
-              </w:trPr>
-              <w:tc>
-                <w:tcPr>
-                  <w:tcW w:type="dxa" w:w="1701"/>
-                  <w:tcBorders>
-                    <w:top w:val="nil" w:color="auto" w:sz="0"/>
-                    <w:left w:val="nil" w:color="auto" w:sz="0"/>
-                    <w:bottom w:val="single" w:color="E2DBCD" w:sz="4"/>
-                    <w:right w:val="nil" w:color="auto" w:sz="0"/>
-                  </w:tcBorders>
-                  <w:tcMar>
-                    <w:top w:type="dxa" w:w="68"/>
-                    <w:left w:type="dxa" w:w="0"/>
-                    <w:bottom w:type="dxa" w:w="68"/>
-                    <w:right w:type="dxa" w:w="57"/>
-                  </w:tcMar>
-                  <w:vAlign w:val="top"/>
-                </w:tcPr>
-                <w:p>
-                  <w:pPr>
-                    <w:keepLines/>
-                    <w:spacing w:after="0" w:before="0" w:line="280" w:lineRule="atLeast"/>
-                  </w:pPr>
-                  <w:r>
-                    <w:rPr>
-                      <w:rFonts w:ascii="Inter" w:cs="Inter" w:eastAsia="Inter" w:hAnsi="Inter"/>
-                      <w:color w:val="625B50"/>
-                      <w:kern w:val="2"/>
-                      <w:sz w:val="19"/>
-                      <w:szCs w:val="19"/>
-                    </w:rPr>
-                    <w:t xml:space="preserve">Inicio previsto</w:t>
-                  </w:r>
-                </w:p>
-              </w:tc>
-              <w:tc>
-                <w:tcPr>
-                  <w:tcW w:type="dxa" w:w="2891"/>
-                  <w:tcBorders>
-                    <w:top w:val="nil" w:color="auto" w:sz="0"/>
-                    <w:left w:val="nil" w:color="auto" w:sz="0"/>
-                    <w:bottom w:val="single" w:color="E2DBCD" w:sz="4"/>
-                    <w:right w:val="nil" w:color="auto" w:sz="0"/>
-                  </w:tcBorders>
-                  <w:tcMar>
-                    <w:top w:type="dxa" w:w="68"/>
-                    <w:left w:type="dxa" w:w="0"/>
-                    <w:bottom w:type="dxa" w:w="68"/>
-                    <w:right w:type="dxa" w:w="0"/>
-                  </w:tcMar>
-                  <w:vAlign w:val="top"/>
-                </w:tcPr>
-                <w:p>
-                  <w:pPr>
-                    <w:keepLines/>
-                    <w:spacing w:after="0" w:before="0" w:line="280" w:lineRule="atLeast"/>
-                  </w:pPr>
-                  <w:r>
-                    <w:rPr>
-                      <w:rFonts w:ascii="Inter Medium" w:cs="Inter Medium" w:eastAsia="Inter Medium" w:hAnsi="Inter Medium"/>
-                      <w:color w:val="1C1A16"/>
-                      <w:kern w:val="2"/>
-                      <w:sz w:val="19"/>
-                      <w:szCs w:val="19"/>
-                    </w:rPr>
-                    <w:t xml:space="preserve">2 de noviembre de 2026</w:t>
-                  </w:r>
-                </w:p>
-              </w:tc>
-            </w:tr>
-            <w:tr>
-              <w:trPr>
-                <w:cantSplit/>
-              </w:trPr>
-              <w:tc>
-                <w:tcPr>
-                  <w:tcW w:type="dxa" w:w="1701"/>
-                  <w:tcBorders>
-                    <w:top w:val="nil" w:color="auto" w:sz="0"/>
-                    <w:left w:val="nil" w:color="auto" w:sz="0"/>
-                    <w:bottom w:val="single" w:color="E2DBCD" w:sz="4"/>
-                    <w:right w:val="nil" w:color="auto" w:sz="0"/>
-                  </w:tcBorders>
-                  <w:tcMar>
-                    <w:top w:type="dxa" w:w="68"/>
-                    <w:left w:type="dxa" w:w="0"/>
-                    <w:bottom w:type="dxa" w:w="68"/>
-                    <w:right w:type="dxa" w:w="57"/>
-                  </w:tcMar>
-                  <w:vAlign w:val="top"/>
-                </w:tcPr>
-                <w:p>
-                  <w:pPr>
-                    <w:keepLines/>
-                    <w:spacing w:after="0" w:before="0" w:line="280" w:lineRule="atLeast"/>
-                  </w:pPr>
-                  <w:r>
-                    <w:rPr>
-                      <w:rFonts w:ascii="Inter" w:cs="Inter" w:eastAsia="Inter" w:hAnsi="Inter"/>
-                      <w:color w:val="625B50"/>
-                      <w:kern w:val="2"/>
-                      <w:sz w:val="19"/>
-                      <w:szCs w:val="19"/>
-                    </w:rPr>
-                    <w:t xml:space="preserve">Responsable</w:t>
-                  </w:r>
-                </w:p>
-              </w:tc>
-              <w:tc>
-                <w:tcPr>
-                  <w:tcW w:type="dxa" w:w="2891"/>
-                  <w:tcBorders>
-                    <w:top w:val="nil" w:color="auto" w:sz="0"/>
-                    <w:left w:val="nil" w:color="auto" w:sz="0"/>
-                    <w:bottom w:val="single" w:color="E2DBCD" w:sz="4"/>
-                    <w:right w:val="nil" w:color="auto" w:sz="0"/>
-                  </w:tcBorders>
-                  <w:tcMar>
-                    <w:top w:type="dxa" w:w="68"/>
-                    <w:left w:type="dxa" w:w="0"/>
-                    <w:bottom w:type="dxa" w:w="68"/>
-                    <w:right w:type="dxa" w:w="0"/>
-                  </w:tcMar>
-                  <w:vAlign w:val="top"/>
-                </w:tcPr>
-                <w:p>
-                  <w:pPr>
-                    <w:keepLines/>
-                    <w:spacing w:after="0" w:before="0" w:line="280" w:lineRule="atLeast"/>
-                  </w:pPr>
-                  <w:r>
-                    <w:rPr>
-                      <w:rFonts w:ascii="Inter Medium" w:cs="Inter Medium" w:eastAsia="Inter Medium" w:hAnsi="Inter Medium"/>
-                      <w:color w:val="1C1A16"/>
-                      <w:kern w:val="2"/>
-                      <w:sz w:val="19"/>
-                      <w:szCs w:val="19"/>
-                    </w:rPr>
-                    <w:t xml:space="preserve">Sebastián Vanegas · Jefe de obra</w:t>
-                  </w:r>
-                </w:p>
-              </w:tc>
-            </w:tr>
-            <w:tr>
-              <w:trPr>
-                <w:cantSplit/>
-              </w:trPr>
-              <w:tc>
-                <w:tcPr>
-                  <w:tcW w:type="dxa" w:w="1701"/>
-                  <w:tcBorders>
-                    <w:top w:val="nil" w:color="auto" w:sz="0"/>
-                    <w:left w:val="nil" w:color="auto" w:sz="0"/>
-                    <w:bottom w:val="single" w:color="E2DBCD" w:sz="4"/>
-                    <w:right w:val="nil" w:color="auto" w:sz="0"/>
-                  </w:tcBorders>
-                  <w:tcMar>
-                    <w:top w:type="dxa" w:w="68"/>
-                    <w:left w:type="dxa" w:w="0"/>
-                    <w:bottom w:type="dxa" w:w="68"/>
-                    <w:right w:type="dxa" w:w="57"/>
-                  </w:tcMar>
-                  <w:vAlign w:val="top"/>
-                </w:tcPr>
-                <w:p>
-                  <w:pPr>
-                    <w:keepLines/>
-                    <w:spacing w:after="0" w:before="0" w:line="280" w:lineRule="atLeast"/>
-                  </w:pPr>
-                  <w:r>
-                    <w:rPr>
-                      <w:rFonts w:ascii="Inter" w:cs="Inter" w:eastAsia="Inter" w:hAnsi="Inter"/>
-                      <w:color w:val="625B50"/>
-                      <w:kern w:val="2"/>
-                      <w:sz w:val="19"/>
-                      <w:szCs w:val="19"/>
-                    </w:rPr>
-                    <w:t xml:space="preserve">Contacto</w:t>
-                  </w:r>
-                </w:p>
-              </w:tc>
-              <w:tc>
-                <w:tcPr>
-                  <w:tcW w:type="dxa" w:w="2891"/>
-                  <w:tcBorders>
-                    <w:top w:val="nil" w:color="auto" w:sz="0"/>
-                    <w:left w:val="nil" w:color="auto" w:sz="0"/>
-                    <w:bottom w:val="single" w:color="E2DBCD" w:sz="4"/>
-                    <w:right w:val="nil" w:color="auto" w:sz="0"/>
-                  </w:tcBorders>
-                  <w:tcMar>
-                    <w:top w:type="dxa" w:w="68"/>
-                    <w:left w:type="dxa" w:w="0"/>
-                    <w:bottom w:type="dxa" w:w="68"/>
-                    <w:right w:type="dxa" w:w="0"/>
-                  </w:tcMar>
-                  <w:vAlign w:val="top"/>
-                </w:tcPr>
-                <w:p>
-                  <w:pPr>
-                    <w:keepLines/>
-                    <w:spacing w:after="0" w:before="0" w:line="280" w:lineRule="atLeast"/>
-                  </w:pPr>
-                  <w:r>
-                    <w:rPr>
-                      <w:rFonts w:ascii="Inter Medium" w:cs="Inter Medium" w:eastAsia="Inter Medium" w:hAnsi="Inter Medium"/>
-                      <w:color w:val="1C1A16"/>
-                      <w:kern w:val="2"/>
-                      <w:sz w:val="19"/>
-                      <w:szCs w:val="19"/>
-                    </w:rPr>
-                    <w:t xml:space="preserve">624 892 643</w:t>
-                  </w:r>
-                </w:p>
-              </w:tc>
-            </w:tr>
-          </w:tbl>
-          <w:p/>
+        </w:tc>
+      </w:tr>
+      <w:tr>
+        <w:trPr>
+          <w:cantSplit/>
+        </w:trPr>
+        <w:tc>
+          <w:tcPr>
+            <w:tcW w:type="dxa" w:w="2098"/>
+            <w:tcBorders>
+              <w:top w:val="nil" w:color="auto" w:sz="0"/>
+              <w:left w:val="nil" w:color="auto" w:sz="0"/>
+              <w:bottom w:val="single" w:color="E2DBCD" w:sz="4"/>
+              <w:right w:val="nil" w:color="auto" w:sz="0"/>
+            </w:tcBorders>
+            <w:tcMar>
+              <w:top w:type="dxa" w:w="85"/>
+              <w:left w:type="dxa" w:w="0"/>
+              <w:bottom w:type="dxa" w:w="85"/>
+              <w:right w:type="dxa" w:w="113"/>
+            </w:tcMar>
+            <w:vAlign w:val="center"/>
+          </w:tcPr>
+          <w:p>
+            <w:pPr>
+              <w:keepLines/>
+              <w:spacing w:after="0" w:before="0" w:line="280" w:lineRule="atLeast"/>
+            </w:pPr>
+            <w:r>
+              <w:rPr>
+                <w:rFonts w:ascii="Inter" w:cs="Inter" w:eastAsia="Inter" w:hAnsi="Inter"/>
+                <w:color w:val="625B50"/>
+                <w:kern w:val="2"/>
+                <w:sz w:val="19"/>
+                <w:szCs w:val="19"/>
+              </w:rPr>
+              <w:t xml:space="preserve">Espacios</w:t>
+            </w:r>
+          </w:p>
+        </w:tc>
+        <w:tc>
+          <w:tcPr>
+            <w:tcW w:type="dxa" w:w="2494"/>
+            <w:tcBorders>
+              <w:top w:val="nil" w:color="auto" w:sz="0"/>
+              <w:left w:val="nil" w:color="auto" w:sz="0"/>
+              <w:bottom w:val="single" w:color="E2DBCD" w:sz="4"/>
+              <w:right w:val="nil" w:color="auto" w:sz="0"/>
+            </w:tcBorders>
+            <w:tcMar>
+              <w:top w:type="dxa" w:w="85"/>
+              <w:left w:type="dxa" w:w="0"/>
+              <w:bottom w:type="dxa" w:w="85"/>
+              <w:right w:type="dxa" w:w="113"/>
+            </w:tcMar>
+            <w:vAlign w:val="center"/>
+          </w:tcPr>
+          <w:p>
+            <w:pPr>
+              <w:keepLines/>
+              <w:spacing w:after="0" w:before="0" w:line="280" w:lineRule="atLeast"/>
+            </w:pPr>
+            <w:r>
+              <w:rPr>
+                <w:rFonts w:ascii="Inter Medium" w:cs="Inter Medium" w:eastAsia="Inter Medium" w:hAnsi="Inter Medium"/>
+                <w:color w:val="1C1A16"/>
+                <w:kern w:val="2"/>
+                <w:sz w:val="19"/>
+                <w:szCs w:val="19"/>
+              </w:rPr>
+              <w:t xml:space="preserve">Salón, baño, cocina y habitaciones</w:t>
+            </w:r>
+          </w:p>
+        </w:tc>
+        <w:tc>
+          <w:tcPr>
+            <w:tcW w:type="dxa" w:w="454"/>
+            <w:tcBorders>
+              <w:top w:val="nil" w:color="auto" w:sz="0"/>
+              <w:left w:val="nil" w:color="auto" w:sz="0"/>
+              <w:bottom w:val="nil" w:color="auto" w:sz="0"/>
+              <w:right w:val="nil" w:color="auto" w:sz="0"/>
+            </w:tcBorders>
+            <w:tcMar>
+              <w:top w:type="dxa" w:w="0"/>
+              <w:left w:type="dxa" w:w="0"/>
+              <w:bottom w:type="dxa" w:w="0"/>
+              <w:right w:type="dxa" w:w="0"/>
+            </w:tcMar>
+            <w:vAlign w:val="top"/>
+          </w:tcPr>
+          <w:p>
+            <w:pPr>
+              <w:keepLines/>
+              <w:spacing w:after="0" w:before="0" w:line="20" w:lineRule="exact"/>
+            </w:pPr>
+            <w:r>
+              <w:rPr>
+                <w:rFonts w:ascii="Inter" w:cs="Inter" w:eastAsia="Inter" w:hAnsi="Inter"/>
+                <w:color w:val="1C1A16"/>
+                <w:kern w:val="2"/>
+                <w:sz w:val="4"/>
+                <w:szCs w:val="4"/>
+              </w:rPr>
+              <w:t xml:space="preserve"/>
+            </w:r>
+          </w:p>
+        </w:tc>
+        <w:tc>
+          <w:tcPr>
+            <w:tcW w:type="dxa" w:w="1644"/>
+            <w:tcBorders>
+              <w:top w:val="nil" w:color="auto" w:sz="0"/>
+              <w:left w:val="nil" w:color="auto" w:sz="0"/>
+              <w:bottom w:val="single" w:color="E2DBCD" w:sz="4"/>
+              <w:right w:val="nil" w:color="auto" w:sz="0"/>
+            </w:tcBorders>
+            <w:tcMar>
+              <w:top w:type="dxa" w:w="85"/>
+              <w:left w:type="dxa" w:w="0"/>
+              <w:bottom w:type="dxa" w:w="85"/>
+              <w:right w:type="dxa" w:w="113"/>
+            </w:tcMar>
+            <w:vAlign w:val="center"/>
+          </w:tcPr>
+          <w:p>
+            <w:pPr>
+              <w:keepLines/>
+              <w:spacing w:after="0" w:before="0" w:line="280" w:lineRule="atLeast"/>
+            </w:pPr>
+            <w:r>
+              <w:rPr>
+                <w:rFonts w:ascii="Inter" w:cs="Inter" w:eastAsia="Inter" w:hAnsi="Inter"/>
+                <w:color w:val="625B50"/>
+                <w:kern w:val="2"/>
+                <w:sz w:val="19"/>
+                <w:szCs w:val="19"/>
+              </w:rPr>
+              <w:t xml:space="preserve">Duración base</w:t>
+            </w:r>
+          </w:p>
+        </w:tc>
+        <w:tc>
+          <w:tcPr>
+            <w:tcW w:type="dxa" w:w="2948"/>
+            <w:tcBorders>
+              <w:top w:val="nil" w:color="auto" w:sz="0"/>
+              <w:left w:val="nil" w:color="auto" w:sz="0"/>
+              <w:bottom w:val="single" w:color="E2DBCD" w:sz="4"/>
+              <w:right w:val="nil" w:color="auto" w:sz="0"/>
+            </w:tcBorders>
+            <w:tcMar>
+              <w:top w:type="dxa" w:w="85"/>
+              <w:left w:type="dxa" w:w="0"/>
+              <w:bottom w:type="dxa" w:w="85"/>
+              <w:right w:type="dxa" w:w="113"/>
+            </w:tcMar>
+            <w:vAlign w:val="center"/>
+          </w:tcPr>
+          <w:p>
+            <w:pPr>
+              <w:keepLines/>
+              <w:spacing w:after="0" w:before="0" w:line="280" w:lineRule="atLeast"/>
+            </w:pPr>
+            <w:r>
+              <w:rPr>
+                <w:rFonts w:ascii="Inter Medium" w:cs="Inter Medium" w:eastAsia="Inter Medium" w:hAnsi="Inter Medium"/>
+                <w:color w:val="1C1A16"/>
+                <w:kern w:val="2"/>
+                <w:sz w:val="19"/>
+                <w:szCs w:val="19"/>
+              </w:rPr>
+              <w:t xml:space="preserve">10⁠–⁠12 semanas</w:t>
+            </w:r>
+          </w:p>
+        </w:tc>
+      </w:tr>
+      <w:tr>
+        <w:trPr>
+          <w:cantSplit/>
+        </w:trPr>
+        <w:tc>
+          <w:tcPr>
+            <w:tcW w:type="dxa" w:w="2098"/>
+            <w:tcBorders>
+              <w:top w:val="nil" w:color="auto" w:sz="0"/>
+              <w:left w:val="nil" w:color="auto" w:sz="0"/>
+              <w:bottom w:val="single" w:color="E2DBCD" w:sz="4"/>
+              <w:right w:val="nil" w:color="auto" w:sz="0"/>
+            </w:tcBorders>
+            <w:tcMar>
+              <w:top w:type="dxa" w:w="85"/>
+              <w:left w:type="dxa" w:w="0"/>
+              <w:bottom w:type="dxa" w:w="85"/>
+              <w:right w:type="dxa" w:w="113"/>
+            </w:tcMar>
+            <w:vAlign w:val="center"/>
+          </w:tcPr>
+          <w:p>
+            <w:pPr>
+              <w:keepLines/>
+              <w:spacing w:after="0" w:before="0" w:line="280" w:lineRule="atLeast"/>
+            </w:pPr>
+            <w:r>
+              <w:rPr>
+                <w:rFonts w:ascii="Inter" w:cs="Inter" w:eastAsia="Inter" w:hAnsi="Inter"/>
+                <w:color w:val="625B50"/>
+                <w:kern w:val="2"/>
+                <w:sz w:val="19"/>
+                <w:szCs w:val="19"/>
+              </w:rPr>
+              <w:t xml:space="preserve">Superficie intervenida</w:t>
+            </w:r>
+          </w:p>
+        </w:tc>
+        <w:tc>
+          <w:tcPr>
+            <w:tcW w:type="dxa" w:w="2494"/>
+            <w:tcBorders>
+              <w:top w:val="nil" w:color="auto" w:sz="0"/>
+              <w:left w:val="nil" w:color="auto" w:sz="0"/>
+              <w:bottom w:val="single" w:color="E2DBCD" w:sz="4"/>
+              <w:right w:val="nil" w:color="auto" w:sz="0"/>
+            </w:tcBorders>
+            <w:tcMar>
+              <w:top w:type="dxa" w:w="85"/>
+              <w:left w:type="dxa" w:w="0"/>
+              <w:bottom w:type="dxa" w:w="85"/>
+              <w:right w:type="dxa" w:w="113"/>
+            </w:tcMar>
+            <w:vAlign w:val="center"/>
+          </w:tcPr>
+          <w:p>
+            <w:pPr>
+              <w:keepLines/>
+              <w:spacing w:after="0" w:before="0" w:line="280" w:lineRule="atLeast"/>
+            </w:pPr>
+            <w:r>
+              <w:rPr>
+                <w:rFonts w:ascii="Inter Medium" w:cs="Inter Medium" w:eastAsia="Inter Medium" w:hAnsi="Inter Medium"/>
+                <w:color w:val="1C1A16"/>
+                <w:kern w:val="2"/>
+                <w:sz w:val="19"/>
+                <w:szCs w:val="19"/>
+              </w:rPr>
+              <w:t xml:space="preserve">75 m²</w:t>
+            </w:r>
+          </w:p>
+        </w:tc>
+        <w:tc>
+          <w:tcPr>
+            <w:tcW w:type="dxa" w:w="454"/>
+            <w:tcBorders>
+              <w:top w:val="nil" w:color="auto" w:sz="0"/>
+              <w:left w:val="nil" w:color="auto" w:sz="0"/>
+              <w:bottom w:val="nil" w:color="auto" w:sz="0"/>
+              <w:right w:val="nil" w:color="auto" w:sz="0"/>
+            </w:tcBorders>
+            <w:tcMar>
+              <w:top w:type="dxa" w:w="0"/>
+              <w:left w:type="dxa" w:w="0"/>
+              <w:bottom w:type="dxa" w:w="0"/>
+              <w:right w:type="dxa" w:w="0"/>
+            </w:tcMar>
+            <w:vAlign w:val="top"/>
+          </w:tcPr>
+          <w:p>
+            <w:pPr>
+              <w:keepLines/>
+              <w:spacing w:after="0" w:before="0" w:line="20" w:lineRule="exact"/>
+            </w:pPr>
+            <w:r>
+              <w:rPr>
+                <w:rFonts w:ascii="Inter" w:cs="Inter" w:eastAsia="Inter" w:hAnsi="Inter"/>
+                <w:color w:val="1C1A16"/>
+                <w:kern w:val="2"/>
+                <w:sz w:val="4"/>
+                <w:szCs w:val="4"/>
+              </w:rPr>
+              <w:t xml:space="preserve"/>
+            </w:r>
+          </w:p>
+        </w:tc>
+        <w:tc>
+          <w:tcPr>
+            <w:tcW w:type="dxa" w:w="1644"/>
+            <w:tcBorders>
+              <w:top w:val="nil" w:color="auto" w:sz="0"/>
+              <w:left w:val="nil" w:color="auto" w:sz="0"/>
+              <w:bottom w:val="single" w:color="E2DBCD" w:sz="4"/>
+              <w:right w:val="nil" w:color="auto" w:sz="0"/>
+            </w:tcBorders>
+            <w:tcMar>
+              <w:top w:type="dxa" w:w="85"/>
+              <w:left w:type="dxa" w:w="0"/>
+              <w:bottom w:type="dxa" w:w="85"/>
+              <w:right w:type="dxa" w:w="113"/>
+            </w:tcMar>
+            <w:vAlign w:val="center"/>
+          </w:tcPr>
+          <w:p>
+            <w:pPr>
+              <w:keepLines/>
+              <w:spacing w:after="0" w:before="0" w:line="280" w:lineRule="atLeast"/>
+            </w:pPr>
+            <w:r>
+              <w:rPr>
+                <w:rFonts w:ascii="Inter" w:cs="Inter" w:eastAsia="Inter" w:hAnsi="Inter"/>
+                <w:color w:val="625B50"/>
+                <w:kern w:val="2"/>
+                <w:sz w:val="19"/>
+                <w:szCs w:val="19"/>
+              </w:rPr>
+              <w:t xml:space="preserve">Inicio previsto</w:t>
+            </w:r>
+          </w:p>
+        </w:tc>
+        <w:tc>
+          <w:tcPr>
+            <w:tcW w:type="dxa" w:w="2948"/>
+            <w:tcBorders>
+              <w:top w:val="nil" w:color="auto" w:sz="0"/>
+              <w:left w:val="nil" w:color="auto" w:sz="0"/>
+              <w:bottom w:val="single" w:color="E2DBCD" w:sz="4"/>
+              <w:right w:val="nil" w:color="auto" w:sz="0"/>
+            </w:tcBorders>
+            <w:tcMar>
+              <w:top w:type="dxa" w:w="85"/>
+              <w:left w:type="dxa" w:w="0"/>
+              <w:bottom w:type="dxa" w:w="85"/>
+              <w:right w:type="dxa" w:w="113"/>
+            </w:tcMar>
+            <w:vAlign w:val="center"/>
+          </w:tcPr>
+          <w:p>
+            <w:pPr>
+              <w:keepLines/>
+              <w:spacing w:after="0" w:before="0" w:line="280" w:lineRule="atLeast"/>
+            </w:pPr>
+            <w:r>
+              <w:rPr>
+                <w:rFonts w:ascii="Inter Medium" w:cs="Inter Medium" w:eastAsia="Inter Medium" w:hAnsi="Inter Medium"/>
+                <w:color w:val="1C1A16"/>
+                <w:kern w:val="2"/>
+                <w:sz w:val="19"/>
+                <w:szCs w:val="19"/>
+              </w:rPr>
+              <w:t xml:space="preserve">2 de noviembre de 2026</w:t>
+            </w:r>
+          </w:p>
+        </w:tc>
+      </w:tr>
+      <w:tr>
+        <w:trPr>
+          <w:cantSplit/>
+        </w:trPr>
+        <w:tc>
+          <w:tcPr>
+            <w:tcW w:type="dxa" w:w="2098"/>
+            <w:tcBorders>
+              <w:top w:val="nil" w:color="auto" w:sz="0"/>
+              <w:left w:val="nil" w:color="auto" w:sz="0"/>
+              <w:bottom w:val="single" w:color="E2DBCD" w:sz="4"/>
+              <w:right w:val="nil" w:color="auto" w:sz="0"/>
+            </w:tcBorders>
+            <w:tcMar>
+              <w:top w:type="dxa" w:w="85"/>
+              <w:left w:type="dxa" w:w="0"/>
+              <w:bottom w:type="dxa" w:w="85"/>
+              <w:right w:type="dxa" w:w="113"/>
+            </w:tcMar>
+            <w:vAlign w:val="center"/>
+          </w:tcPr>
+          <w:p>
+            <w:pPr>
+              <w:keepLines/>
+              <w:spacing w:after="0" w:before="0" w:line="280" w:lineRule="atLeast"/>
+            </w:pPr>
+            <w:r>
+              <w:rPr>
+                <w:rFonts w:ascii="Inter" w:cs="Inter" w:eastAsia="Inter" w:hAnsi="Inter"/>
+                <w:color w:val="625B50"/>
+                <w:kern w:val="2"/>
+                <w:sz w:val="19"/>
+                <w:szCs w:val="19"/>
+              </w:rPr>
+              <w:t xml:space="preserve">Tipo de inmueble</w:t>
+            </w:r>
+          </w:p>
+        </w:tc>
+        <w:tc>
+          <w:tcPr>
+            <w:tcW w:type="dxa" w:w="2494"/>
+            <w:tcBorders>
+              <w:top w:val="nil" w:color="auto" w:sz="0"/>
+              <w:left w:val="nil" w:color="auto" w:sz="0"/>
+              <w:bottom w:val="single" w:color="E2DBCD" w:sz="4"/>
+              <w:right w:val="nil" w:color="auto" w:sz="0"/>
+            </w:tcBorders>
+            <w:tcMar>
+              <w:top w:type="dxa" w:w="85"/>
+              <w:left w:type="dxa" w:w="0"/>
+              <w:bottom w:type="dxa" w:w="85"/>
+              <w:right w:type="dxa" w:w="113"/>
+            </w:tcMar>
+            <w:vAlign w:val="center"/>
+          </w:tcPr>
+          <w:p>
+            <w:pPr>
+              <w:keepLines/>
+              <w:spacing w:after="0" w:before="0" w:line="280" w:lineRule="atLeast"/>
+            </w:pPr>
+            <w:r>
+              <w:rPr>
+                <w:rFonts w:ascii="Inter Medium" w:cs="Inter Medium" w:eastAsia="Inter Medium" w:hAnsi="Inter Medium"/>
+                <w:color w:val="1C1A16"/>
+                <w:kern w:val="2"/>
+                <w:sz w:val="19"/>
+                <w:szCs w:val="19"/>
+              </w:rPr>
+              <w:t xml:space="preserve">Apartamento</w:t>
+            </w:r>
+          </w:p>
+        </w:tc>
+        <w:tc>
+          <w:tcPr>
+            <w:tcW w:type="dxa" w:w="454"/>
+            <w:tcBorders>
+              <w:top w:val="nil" w:color="auto" w:sz="0"/>
+              <w:left w:val="nil" w:color="auto" w:sz="0"/>
+              <w:bottom w:val="nil" w:color="auto" w:sz="0"/>
+              <w:right w:val="nil" w:color="auto" w:sz="0"/>
+            </w:tcBorders>
+            <w:tcMar>
+              <w:top w:type="dxa" w:w="0"/>
+              <w:left w:type="dxa" w:w="0"/>
+              <w:bottom w:type="dxa" w:w="0"/>
+              <w:right w:type="dxa" w:w="0"/>
+            </w:tcMar>
+            <w:vAlign w:val="top"/>
+          </w:tcPr>
+          <w:p>
+            <w:pPr>
+              <w:keepLines/>
+              <w:spacing w:after="0" w:before="0" w:line="20" w:lineRule="exact"/>
+            </w:pPr>
+            <w:r>
+              <w:rPr>
+                <w:rFonts w:ascii="Inter" w:cs="Inter" w:eastAsia="Inter" w:hAnsi="Inter"/>
+                <w:color w:val="1C1A16"/>
+                <w:kern w:val="2"/>
+                <w:sz w:val="4"/>
+                <w:szCs w:val="4"/>
+              </w:rPr>
+              <w:t xml:space="preserve"/>
+            </w:r>
+          </w:p>
+        </w:tc>
+        <w:tc>
+          <w:tcPr>
+            <w:tcW w:type="dxa" w:w="1644"/>
+            <w:tcBorders>
+              <w:top w:val="nil" w:color="auto" w:sz="0"/>
+              <w:left w:val="nil" w:color="auto" w:sz="0"/>
+              <w:bottom w:val="single" w:color="E2DBCD" w:sz="4"/>
+              <w:right w:val="nil" w:color="auto" w:sz="0"/>
+            </w:tcBorders>
+            <w:tcMar>
+              <w:top w:type="dxa" w:w="85"/>
+              <w:left w:type="dxa" w:w="0"/>
+              <w:bottom w:type="dxa" w:w="85"/>
+              <w:right w:type="dxa" w:w="113"/>
+            </w:tcMar>
+            <w:vAlign w:val="center"/>
+          </w:tcPr>
+          <w:p>
+            <w:pPr>
+              <w:keepLines/>
+              <w:spacing w:after="0" w:before="0" w:line="280" w:lineRule="atLeast"/>
+            </w:pPr>
+            <w:r>
+              <w:rPr>
+                <w:rFonts w:ascii="Inter" w:cs="Inter" w:eastAsia="Inter" w:hAnsi="Inter"/>
+                <w:color w:val="625B50"/>
+                <w:kern w:val="2"/>
+                <w:sz w:val="19"/>
+                <w:szCs w:val="19"/>
+              </w:rPr>
+              <w:t xml:space="preserve">Responsable</w:t>
+            </w:r>
+          </w:p>
+        </w:tc>
+        <w:tc>
+          <w:tcPr>
+            <w:tcW w:type="dxa" w:w="2948"/>
+            <w:tcBorders>
+              <w:top w:val="nil" w:color="auto" w:sz="0"/>
+              <w:left w:val="nil" w:color="auto" w:sz="0"/>
+              <w:bottom w:val="single" w:color="E2DBCD" w:sz="4"/>
+              <w:right w:val="nil" w:color="auto" w:sz="0"/>
+            </w:tcBorders>
+            <w:tcMar>
+              <w:top w:type="dxa" w:w="85"/>
+              <w:left w:type="dxa" w:w="0"/>
+              <w:bottom w:type="dxa" w:w="85"/>
+              <w:right w:type="dxa" w:w="113"/>
+            </w:tcMar>
+            <w:vAlign w:val="center"/>
+          </w:tcPr>
+          <w:p>
+            <w:pPr>
+              <w:keepLines/>
+              <w:spacing w:after="0" w:before="0" w:line="280" w:lineRule="atLeast"/>
+            </w:pPr>
+            <w:r>
+              <w:rPr>
+                <w:rFonts w:ascii="Inter Medium" w:cs="Inter Medium" w:eastAsia="Inter Medium" w:hAnsi="Inter Medium"/>
+                <w:color w:val="1C1A16"/>
+                <w:kern w:val="2"/>
+                <w:sz w:val="19"/>
+                <w:szCs w:val="19"/>
+              </w:rPr>
+              <w:t xml:space="preserve">Sebastián Vanegas · Jefe de obra</w:t>
+            </w:r>
+          </w:p>
+        </w:tc>
+      </w:tr>
+      <w:tr>
+        <w:trPr>
+          <w:cantSplit/>
+        </w:trPr>
+        <w:tc>
+          <w:tcPr>
+            <w:tcW w:type="dxa" w:w="2098"/>
+            <w:tcBorders>
+              <w:top w:val="nil" w:color="auto" w:sz="0"/>
+              <w:left w:val="nil" w:color="auto" w:sz="0"/>
+              <w:bottom w:val="nil" w:color="auto" w:sz="0"/>
+              <w:right w:val="nil" w:color="auto" w:sz="0"/>
+            </w:tcBorders>
+            <w:tcMar>
+              <w:top w:type="dxa" w:w="85"/>
+              <w:left w:type="dxa" w:w="0"/>
+              <w:bottom w:type="dxa" w:w="85"/>
+              <w:right w:type="dxa" w:w="113"/>
+            </w:tcMar>
+            <w:vAlign w:val="center"/>
+          </w:tcPr>
+          <w:p>
+            <w:pPr>
+              <w:keepLines/>
+              <w:spacing w:after="0" w:before="0" w:line="280" w:lineRule="atLeast"/>
+            </w:pPr>
+            <w:r>
+              <w:rPr>
+                <w:rFonts w:ascii="Inter" w:cs="Inter" w:eastAsia="Inter" w:hAnsi="Inter"/>
+                <w:color w:val="625B50"/>
+                <w:kern w:val="2"/>
+                <w:sz w:val="19"/>
+                <w:szCs w:val="19"/>
+              </w:rPr>
+              <w:t xml:space="preserve"/>
+            </w:r>
+          </w:p>
+        </w:tc>
+        <w:tc>
+          <w:tcPr>
+            <w:tcW w:type="dxa" w:w="2494"/>
+            <w:tcBorders>
+              <w:top w:val="nil" w:color="auto" w:sz="0"/>
+              <w:left w:val="nil" w:color="auto" w:sz="0"/>
+              <w:bottom w:val="nil" w:color="auto" w:sz="0"/>
+              <w:right w:val="nil" w:color="auto" w:sz="0"/>
+            </w:tcBorders>
+            <w:tcMar>
+              <w:top w:type="dxa" w:w="85"/>
+              <w:left w:type="dxa" w:w="0"/>
+              <w:bottom w:type="dxa" w:w="85"/>
+              <w:right w:type="dxa" w:w="113"/>
+            </w:tcMar>
+            <w:vAlign w:val="center"/>
+          </w:tcPr>
+          <w:p>
+            <w:pPr>
+              <w:keepLines/>
+              <w:spacing w:after="0" w:before="0" w:line="280" w:lineRule="atLeast"/>
+            </w:pPr>
+            <w:r>
+              <w:rPr>
+                <w:rFonts w:ascii="Inter Medium" w:cs="Inter Medium" w:eastAsia="Inter Medium" w:hAnsi="Inter Medium"/>
+                <w:color w:val="1C1A16"/>
+                <w:kern w:val="2"/>
+                <w:sz w:val="19"/>
+                <w:szCs w:val="19"/>
+              </w:rPr>
+              <w:t xml:space="preserve"/>
+            </w:r>
+          </w:p>
+        </w:tc>
+        <w:tc>
+          <w:tcPr>
+            <w:tcW w:type="dxa" w:w="454"/>
+            <w:tcBorders>
+              <w:top w:val="nil" w:color="auto" w:sz="0"/>
+              <w:left w:val="nil" w:color="auto" w:sz="0"/>
+              <w:bottom w:val="nil" w:color="auto" w:sz="0"/>
+              <w:right w:val="nil" w:color="auto" w:sz="0"/>
+            </w:tcBorders>
+            <w:tcMar>
+              <w:top w:type="dxa" w:w="0"/>
+              <w:left w:type="dxa" w:w="0"/>
+              <w:bottom w:type="dxa" w:w="0"/>
+              <w:right w:type="dxa" w:w="0"/>
+            </w:tcMar>
+            <w:vAlign w:val="top"/>
+          </w:tcPr>
+          <w:p>
+            <w:pPr>
+              <w:keepLines/>
+              <w:spacing w:after="0" w:before="0" w:line="20" w:lineRule="exact"/>
+            </w:pPr>
+            <w:r>
+              <w:rPr>
+                <w:rFonts w:ascii="Inter" w:cs="Inter" w:eastAsia="Inter" w:hAnsi="Inter"/>
+                <w:color w:val="1C1A16"/>
+                <w:kern w:val="2"/>
+                <w:sz w:val="4"/>
+                <w:szCs w:val="4"/>
+              </w:rPr>
+              <w:t xml:space="preserve"/>
+            </w:r>
+          </w:p>
+        </w:tc>
+        <w:tc>
+          <w:tcPr>
+            <w:tcW w:type="dxa" w:w="1644"/>
+            <w:tcBorders>
+              <w:top w:val="nil" w:color="auto" w:sz="0"/>
+              <w:left w:val="nil" w:color="auto" w:sz="0"/>
+              <w:bottom w:val="single" w:color="E2DBCD" w:sz="4"/>
+              <w:right w:val="nil" w:color="auto" w:sz="0"/>
+            </w:tcBorders>
+            <w:tcMar>
+              <w:top w:type="dxa" w:w="85"/>
+              <w:left w:type="dxa" w:w="0"/>
+              <w:bottom w:type="dxa" w:w="85"/>
+              <w:right w:type="dxa" w:w="113"/>
+            </w:tcMar>
+            <w:vAlign w:val="center"/>
+          </w:tcPr>
+          <w:p>
+            <w:pPr>
+              <w:keepLines/>
+              <w:spacing w:after="0" w:before="0" w:line="280" w:lineRule="atLeast"/>
+            </w:pPr>
+            <w:r>
+              <w:rPr>
+                <w:rFonts w:ascii="Inter" w:cs="Inter" w:eastAsia="Inter" w:hAnsi="Inter"/>
+                <w:color w:val="625B50"/>
+                <w:kern w:val="2"/>
+                <w:sz w:val="19"/>
+                <w:szCs w:val="19"/>
+              </w:rPr>
+              <w:t xml:space="preserve">Contacto</w:t>
+            </w:r>
+          </w:p>
+        </w:tc>
+        <w:tc>
+          <w:tcPr>
+            <w:tcW w:type="dxa" w:w="2948"/>
+            <w:tcBorders>
+              <w:top w:val="nil" w:color="auto" w:sz="0"/>
+              <w:left w:val="nil" w:color="auto" w:sz="0"/>
+              <w:bottom w:val="single" w:color="E2DBCD" w:sz="4"/>
+              <w:right w:val="nil" w:color="auto" w:sz="0"/>
+            </w:tcBorders>
+            <w:tcMar>
+              <w:top w:type="dxa" w:w="85"/>
+              <w:left w:type="dxa" w:w="0"/>
+              <w:bottom w:type="dxa" w:w="85"/>
+              <w:right w:type="dxa" w:w="113"/>
+            </w:tcMar>
+            <w:vAlign w:val="center"/>
+          </w:tcPr>
+          <w:p>
+            <w:pPr>
+              <w:keepLines/>
+              <w:spacing w:after="0" w:before="0" w:line="280" w:lineRule="atLeast"/>
+            </w:pPr>
+            <w:r>
+              <w:rPr>
+                <w:rFonts w:ascii="Inter Medium" w:cs="Inter Medium" w:eastAsia="Inter Medium" w:hAnsi="Inter Medium"/>
+                <w:color w:val="1C1A16"/>
+                <w:kern w:val="2"/>
+                <w:sz w:val="19"/>
+                <w:szCs w:val="19"/>
+              </w:rPr>
+              <w:t xml:space="preserve">624 892 643</w:t>
+            </w:r>
+          </w:p>
         </w:tc>
       </w:tr>
     </w:tbl>
@@ -1760,7 +1917,7 @@
                 <w:sz w:val="19"/>
                 <w:szCs w:val="19"/>
               </w:rPr>
-              <w:t xml:space="preserve">Para avanzar, revisamos juntos el alcance, resolvemos las dudas y confirmamos las opciones elegidas antes de formalizar la aceptación. Sebastián Vanegas le llamará para acordar esa revisión; también puede contactarle directamente en el 624 892 643 o en renovaredyb@gmail.com. Oferta válida hasta el 07/11/2026.</w:t>
+              <w:t xml:space="preserve">Para avanzar, revisamos juntos el alcance, resolvemos las dudas y confirmamos las opciones elegidas antes de formalizar la aceptación. Sebastián Vanegas le llamará para acordar esa revisión; también puede contactarle directamente en el 624 892 643 o en renovaredyb@gmail.com. Oferta válida hasta el 07/11/2026.</w:t>
             </w:r>
           </w:p>
         </w:tc>
@@ -1805,7 +1962,7 @@
       <w:pPr>
         <w:keepNext/>
         <w:keepLines/>
-        <w:spacing w:after="198" w:before="0" w:line="506" w:lineRule="atLeast"/>
+        <w:spacing w:after="255" w:before="57" w:line="506" w:lineRule="atLeast"/>
       </w:pPr>
       <w:r>
         <w:rPr>
@@ -1822,7 +1979,7 @@
       <w:pPr>
         <w:keepNext/>
         <w:keepLines/>
-        <w:spacing w:after="91" w:before="0" w:line="280" w:lineRule="atLeast"/>
+        <w:spacing w:after="125" w:before="0" w:line="280" w:lineRule="atLeast"/>
       </w:pPr>
       <w:r>
         <w:rPr>
@@ -1848,7 +2005,7 @@
     <w:p>
       <w:pPr>
         <w:keepLines/>
-        <w:spacing w:after="113" w:before="0" w:line="288" w:lineRule="atLeast"/>
+        <w:spacing w:after="136" w:before="0" w:line="288" w:lineRule="atLeast"/>
       </w:pPr>
       <w:r>
         <w:rPr>
@@ -1864,7 +2021,7 @@
     <w:p>
       <w:pPr>
         <w:keepLines/>
-        <w:spacing w:after="0" w:before="57" w:line="20" w:lineRule="exact"/>
+        <w:spacing w:after="0" w:before="28" w:line="20" w:lineRule="exact"/>
       </w:pPr>
       <w:r>
         <w:rPr>
@@ -1928,7 +2085,7 @@
             <w:pPr>
               <w:keepNext/>
               <w:keepLines/>
-              <w:spacing w:after="91" w:before="0" w:line="280" w:lineRule="atLeast"/>
+              <w:spacing w:after="125" w:before="0" w:line="280" w:lineRule="atLeast"/>
             </w:pPr>
             <w:r>
               <w:rPr>
@@ -2044,7 +2201,7 @@
             <w:pPr>
               <w:keepNext/>
               <w:keepLines/>
-              <w:spacing w:after="91" w:before="0" w:line="280" w:lineRule="atLeast"/>
+              <w:spacing w:after="125" w:before="0" w:line="280" w:lineRule="atLeast"/>
             </w:pPr>
             <w:r>
               <w:rPr>
@@ -2090,7 +2247,7 @@
       <w:pPr>
         <w:keepNext/>
         <w:keepLines/>
-        <w:spacing w:after="91" w:before="227" w:line="280" w:lineRule="atLeast"/>
+        <w:spacing w:after="125" w:before="283" w:line="280" w:lineRule="atLeast"/>
       </w:pPr>
       <w:r>
         <w:rPr>
@@ -2116,7 +2273,7 @@
     <w:p>
       <w:pPr>
         <w:keepLines/>
-        <w:spacing w:after="113" w:before="0" w:line="288" w:lineRule="atLeast"/>
+        <w:spacing w:after="136" w:before="0" w:line="288" w:lineRule="atLeast"/>
       </w:pPr>
       <w:r>
         <w:rPr>
@@ -2133,7 +2290,7 @@
       <w:pPr>
         <w:keepNext/>
         <w:keepLines/>
-        <w:spacing w:after="91" w:before="227" w:line="280" w:lineRule="atLeast"/>
+        <w:spacing w:after="125" w:before="283" w:line="280" w:lineRule="atLeast"/>
       </w:pPr>
       <w:r>
         <w:rPr>
@@ -2159,7 +2316,7 @@
     <w:p>
       <w:pPr>
         <w:keepLines/>
-        <w:spacing w:after="113" w:before="0" w:line="288" w:lineRule="atLeast"/>
+        <w:spacing w:after="136" w:before="0" w:line="288" w:lineRule="atLeast"/>
       </w:pPr>
       <w:r>
         <w:rPr>
@@ -2175,7 +2332,7 @@
     <w:p>
       <w:pPr>
         <w:keepLines/>
-        <w:spacing w:after="113" w:before="0" w:line="288" w:lineRule="atLeast"/>
+        <w:spacing w:after="136" w:before="0" w:line="288" w:lineRule="atLeast"/>
       </w:pPr>
       <w:r>
         <w:rPr>
@@ -2191,7 +2348,7 @@
     <w:p>
       <w:pPr>
         <w:keepLines/>
-        <w:spacing w:after="0" w:before="57" w:line="20" w:lineRule="exact"/>
+        <w:spacing w:after="0" w:before="170" w:line="20" w:lineRule="exact"/>
       </w:pPr>
       <w:r>
         <w:rPr>
@@ -2716,7 +2873,7 @@
       <w:pPr>
         <w:keepNext/>
         <w:keepLines/>
-        <w:spacing w:after="91" w:before="227" w:line="280" w:lineRule="atLeast"/>
+        <w:spacing w:after="125" w:before="283" w:line="280" w:lineRule="atLeast"/>
       </w:pPr>
       <w:r>
         <w:rPr>
@@ -2760,8 +2917,9 @@
         </w:tblCellMar>
       </w:tblPr>
       <w:tblGrid>
-        <w:gridCol w:w="4819"/>
-        <w:gridCol w:w="4819"/>
+        <w:gridCol w:w="3742"/>
+        <w:gridCol w:w="2268"/>
+        <w:gridCol w:w="3628"/>
       </w:tblGrid>
       <w:tr>
         <w:trPr>
@@ -2769,24 +2927,24 @@
         </w:trPr>
         <w:tc>
           <w:tcPr>
-            <w:tcW w:type="dxa" w:w="4819"/>
-            <w:tcBorders>
-              <w:top w:val="nil" w:color="auto" w:sz="0"/>
-              <w:left w:val="nil" w:color="auto" w:sz="0"/>
-              <w:bottom w:val="single" w:color="E2DBCD" w:sz="4"/>
-              <w:right w:val="nil" w:color="auto" w:sz="0"/>
-            </w:tcBorders>
-            <w:tcMar>
-              <w:top w:type="dxa" w:w="91"/>
+            <w:tcW w:type="dxa" w:w="3742"/>
+            <w:tcBorders>
+              <w:top w:val="nil" w:color="auto" w:sz="0"/>
+              <w:left w:val="nil" w:color="auto" w:sz="0"/>
+              <w:bottom w:val="single" w:color="E2DBCD" w:sz="4"/>
+              <w:right w:val="nil" w:color="auto" w:sz="0"/>
+            </w:tcBorders>
+            <w:tcMar>
+              <w:top w:type="dxa" w:w="68"/>
               <w:left w:type="dxa" w:w="0"/>
-              <w:bottom w:type="dxa" w:w="91"/>
+              <w:bottom w:type="dxa" w:w="68"/>
               <w:right w:type="dxa" w:w="113"/>
             </w:tcMar>
             <w:vAlign w:val="top"/>
           </w:tcPr>
           <w:p>
             <w:pPr>
-              <w:keepNext/>
+              <w:keepNext w:val="false"/>
               <w:keepLines/>
               <w:spacing w:after="0" w:before="0" w:line="193" w:lineRule="atLeast"/>
             </w:pPr>
@@ -2816,30 +2974,31 @@
                 <w:sz w:val="19"/>
                 <w:szCs w:val="19"/>
               </w:rPr>
-              <w:t xml:space="preserve">Cristian Nohalez García · 607 23 86 30</w:t>
-            </w:r>
-          </w:p>
-        </w:tc>
-        <w:tc>
-          <w:tcPr>
-            <w:tcW w:type="dxa" w:w="4819"/>
-            <w:tcBorders>
-              <w:top w:val="nil" w:color="auto" w:sz="0"/>
-              <w:left w:val="nil" w:color="auto" w:sz="0"/>
-              <w:bottom w:val="single" w:color="E2DBCD" w:sz="4"/>
-              <w:right w:val="nil" w:color="auto" w:sz="0"/>
-            </w:tcBorders>
-            <w:tcMar>
-              <w:top w:type="dxa" w:w="91"/>
+              <w:t xml:space="preserve">Cristian Nohalez García · 607 23 86 30</w:t>
+            </w:r>
+          </w:p>
+        </w:tc>
+        <w:tc>
+          <w:tcPr>
+            <w:tcW w:type="dxa" w:w="5896"/>
+            <w:gridSpan w:val="2"/>
+            <w:tcBorders>
+              <w:top w:val="nil" w:color="auto" w:sz="0"/>
+              <w:left w:val="nil" w:color="auto" w:sz="0"/>
+              <w:bottom w:val="single" w:color="E2DBCD" w:sz="4"/>
+              <w:right w:val="nil" w:color="auto" w:sz="0"/>
+            </w:tcBorders>
+            <w:tcMar>
+              <w:top w:type="dxa" w:w="68"/>
               <w:left w:type="dxa" w:w="0"/>
-              <w:bottom w:type="dxa" w:w="91"/>
+              <w:bottom w:type="dxa" w:w="68"/>
               <w:right w:type="dxa" w:w="113"/>
             </w:tcMar>
             <w:vAlign w:val="top"/>
           </w:tcPr>
           <w:p>
             <w:pPr>
-              <w:keepNext/>
+              <w:keepNext w:val="false"/>
               <w:keepLines/>
               <w:spacing w:after="0" w:before="0" w:line="193" w:lineRule="atLeast"/>
             </w:pPr>
@@ -2880,24 +3039,24 @@
         </w:trPr>
         <w:tc>
           <w:tcPr>
-            <w:tcW w:type="dxa" w:w="4819"/>
-            <w:tcBorders>
-              <w:top w:val="nil" w:color="auto" w:sz="0"/>
-              <w:left w:val="nil" w:color="auto" w:sz="0"/>
-              <w:bottom w:val="single" w:color="E2DBCD" w:sz="4"/>
-              <w:right w:val="nil" w:color="auto" w:sz="0"/>
-            </w:tcBorders>
-            <w:tcMar>
-              <w:top w:type="dxa" w:w="91"/>
+            <w:tcW w:type="dxa" w:w="3742"/>
+            <w:tcBorders>
+              <w:top w:val="nil" w:color="auto" w:sz="0"/>
+              <w:left w:val="nil" w:color="auto" w:sz="0"/>
+              <w:bottom w:val="single" w:color="E2DBCD" w:sz="4"/>
+              <w:right w:val="nil" w:color="auto" w:sz="0"/>
+            </w:tcBorders>
+            <w:tcMar>
+              <w:top w:type="dxa" w:w="68"/>
               <w:left w:type="dxa" w:w="0"/>
-              <w:bottom w:type="dxa" w:w="91"/>
+              <w:bottom w:type="dxa" w:w="68"/>
               <w:right w:type="dxa" w:w="113"/>
             </w:tcMar>
             <w:vAlign w:val="top"/>
           </w:tcPr>
           <w:p>
             <w:pPr>
-              <w:keepNext/>
+              <w:keepNext w:val="false"/>
               <w:keepLines/>
               <w:spacing w:after="0" w:before="0" w:line="193" w:lineRule="atLeast"/>
             </w:pPr>
@@ -2933,24 +3092,24 @@
         </w:tc>
         <w:tc>
           <w:tcPr>
-            <w:tcW w:type="dxa" w:w="4819"/>
-            <w:tcBorders>
-              <w:top w:val="nil" w:color="auto" w:sz="0"/>
-              <w:left w:val="nil" w:color="auto" w:sz="0"/>
-              <w:bottom w:val="single" w:color="E2DBCD" w:sz="4"/>
-              <w:right w:val="nil" w:color="auto" w:sz="0"/>
-            </w:tcBorders>
-            <w:tcMar>
-              <w:top w:type="dxa" w:w="91"/>
+            <w:tcW w:type="dxa" w:w="2268"/>
+            <w:tcBorders>
+              <w:top w:val="nil" w:color="auto" w:sz="0"/>
+              <w:left w:val="nil" w:color="auto" w:sz="0"/>
+              <w:bottom w:val="single" w:color="E2DBCD" w:sz="4"/>
+              <w:right w:val="nil" w:color="auto" w:sz="0"/>
+            </w:tcBorders>
+            <w:tcMar>
+              <w:top w:type="dxa" w:w="68"/>
               <w:left w:type="dxa" w:w="0"/>
-              <w:bottom w:type="dxa" w:w="91"/>
+              <w:bottom w:type="dxa" w:w="68"/>
               <w:right w:type="dxa" w:w="113"/>
             </w:tcMar>
             <w:vAlign w:val="top"/>
           </w:tcPr>
           <w:p>
             <w:pPr>
-              <w:keepNext/>
+              <w:keepNext w:val="false"/>
               <w:keepLines/>
               <w:spacing w:after="0" w:before="0" w:line="193" w:lineRule="atLeast"/>
             </w:pPr>
@@ -2984,32 +3143,26 @@
             </w:r>
           </w:p>
         </w:tc>
-      </w:tr>
-      <w:tr>
-        <w:trPr>
-          <w:cantSplit/>
-        </w:trPr>
-        <w:tc>
-          <w:tcPr>
-            <w:tcW w:type="dxa" w:w="9638"/>
-            <w:gridSpan w:val="2"/>
-            <w:tcBorders>
-              <w:top w:val="nil" w:color="auto" w:sz="0"/>
-              <w:left w:val="nil" w:color="auto" w:sz="0"/>
-              <w:bottom w:val="single" w:color="E2DBCD" w:sz="4"/>
-              <w:right w:val="nil" w:color="auto" w:sz="0"/>
-            </w:tcBorders>
-            <w:tcMar>
-              <w:top w:type="dxa" w:w="91"/>
+        <w:tc>
+          <w:tcPr>
+            <w:tcW w:type="dxa" w:w="3628"/>
+            <w:tcBorders>
+              <w:top w:val="nil" w:color="auto" w:sz="0"/>
+              <w:left w:val="nil" w:color="auto" w:sz="0"/>
+              <w:bottom w:val="single" w:color="E2DBCD" w:sz="4"/>
+              <w:right w:val="nil" w:color="auto" w:sz="0"/>
+            </w:tcBorders>
+            <w:tcMar>
+              <w:top w:type="dxa" w:w="68"/>
               <w:left w:type="dxa" w:w="0"/>
-              <w:bottom w:type="dxa" w:w="91"/>
+              <w:bottom w:type="dxa" w:w="68"/>
               <w:right w:type="dxa" w:w="113"/>
             </w:tcMar>
             <w:vAlign w:val="top"/>
           </w:tcPr>
           <w:p>
             <w:pPr>
-              <w:keepNext/>
+              <w:keepNext w:val="false"/>
               <w:keepLines/>
               <w:spacing w:after="0" w:before="0" w:line="193" w:lineRule="atLeast"/>
             </w:pPr>
@@ -3072,7 +3225,7 @@
       <w:pPr>
         <w:keepNext/>
         <w:keepLines/>
-        <w:spacing w:after="283" w:before="0" w:line="506" w:lineRule="atLeast"/>
+        <w:spacing w:after="340" w:before="57" w:line="506" w:lineRule="atLeast"/>
       </w:pPr>
       <w:r>
         <w:rPr>
@@ -3088,7 +3241,7 @@
     <w:p>
       <w:pPr>
         <w:keepLines/>
-        <w:spacing w:after="147" w:before="0" w:line="288" w:lineRule="atLeast"/>
+        <w:spacing w:after="181" w:before="0" w:line="288" w:lineRule="atLeast"/>
       </w:pPr>
       <w:r>
         <w:rPr>
@@ -3122,11 +3275,10 @@
         </w:tblCellMar>
       </w:tblPr>
       <w:tblGrid>
-        <w:gridCol w:w="3686"/>
-        <w:gridCol w:w="1247"/>
-        <w:gridCol w:w="2041"/>
-        <w:gridCol w:w="1020"/>
-        <w:gridCol w:w="1644"/>
+        <w:gridCol w:w="4763"/>
+        <w:gridCol w:w="1587"/>
+        <w:gridCol w:w="1587"/>
+        <w:gridCol w:w="1701"/>
       </w:tblGrid>
       <w:tr>
         <w:trPr>
@@ -3135,7 +3287,7 @@
         </w:trPr>
         <w:tc>
           <w:tcPr>
-            <w:tcW w:type="dxa" w:w="3686"/>
+            <w:tcW w:type="dxa" w:w="4763"/>
             <w:tcBorders>
               <w:top w:val="nil" w:color="auto" w:sz="0"/>
               <w:left w:val="nil" w:color="auto" w:sz="0"/>
@@ -3172,7 +3324,7 @@
         </w:tc>
         <w:tc>
           <w:tcPr>
-            <w:tcW w:type="dxa" w:w="1247"/>
+            <w:tcW w:type="dxa" w:w="1587"/>
             <w:tcBorders>
               <w:top w:val="nil" w:color="auto" w:sz="0"/>
               <w:left w:val="nil" w:color="auto" w:sz="0"/>
@@ -3209,8 +3361,7 @@
         </w:tc>
         <w:tc>
           <w:tcPr>
-            <w:tcW w:type="dxa" w:w="3061"/>
-            <w:gridSpan w:val="2"/>
+            <w:tcW w:type="dxa" w:w="1587"/>
             <w:tcBorders>
               <w:top w:val="nil" w:color="auto" w:sz="0"/>
               <w:left w:val="nil" w:color="auto" w:sz="0"/>
@@ -3230,6 +3381,7 @@
             <w:pPr>
               <w:keepLines/>
               <w:spacing w:after="0" w:before="0" w:line="200" w:lineRule="atLeast"/>
+              <w:jc w:val="right"/>
             </w:pPr>
             <w:r>
               <w:rPr>
@@ -3241,13 +3393,13 @@
                 <w:sz w:val="14"/>
                 <w:szCs w:val="14"/>
               </w:rPr>
-              <w:t xml:space="preserve">Peso sobre el total</w:t>
-            </w:r>
-          </w:p>
-        </w:tc>
-        <w:tc>
-          <w:tcPr>
-            <w:tcW w:type="dxa" w:w="1644"/>
+              <w:t xml:space="preserve">% del total</w:t>
+            </w:r>
+          </w:p>
+        </w:tc>
+        <w:tc>
+          <w:tcPr>
+            <w:tcW w:type="dxa" w:w="1701"/>
             <w:tcBorders>
               <w:top w:val="nil" w:color="auto" w:sz="0"/>
               <w:left w:val="nil" w:color="auto" w:sz="0"/>
@@ -3290,7 +3442,7 @@
         </w:trPr>
         <w:tc>
           <w:tcPr>
-            <w:tcW w:type="dxa" w:w="3686"/>
+            <w:tcW w:type="dxa" w:w="4763"/>
             <w:tcBorders>
               <w:top w:val="nil" w:color="auto" w:sz="0"/>
               <w:left w:val="nil" w:color="auto" w:sz="0"/>
@@ -3324,7 +3476,7 @@
         </w:tc>
         <w:tc>
           <w:tcPr>
-            <w:tcW w:type="dxa" w:w="1247"/>
+            <w:tcW w:type="dxa" w:w="1587"/>
             <w:tcBorders>
               <w:top w:val="nil" w:color="auto" w:sz="0"/>
               <w:left w:val="nil" w:color="auto" w:sz="0"/>
@@ -3349,8 +3501,8 @@
                 <w:rFonts w:ascii="Inter" w:cs="Inter" w:eastAsia="Inter" w:hAnsi="Inter"/>
                 <w:color w:val="625B50"/>
                 <w:kern w:val="2"/>
-                <w:sz w:val="16"/>
-                <w:szCs w:val="16"/>
+                <w:sz w:val="17"/>
+                <w:szCs w:val="17"/>
               </w:rPr>
               <w:t xml:space="preserve">2⁠–⁠3</w:t>
             </w:r>
@@ -3358,7 +3510,7 @@
         </w:tc>
         <w:tc>
           <w:tcPr>
-            <w:tcW w:type="dxa" w:w="2041"/>
+            <w:tcW w:type="dxa" w:w="1587"/>
             <w:tcBorders>
               <w:top w:val="nil" w:color="auto" w:sz="0"/>
               <w:left w:val="nil" w:color="auto" w:sz="0"/>
@@ -3368,97 +3520,6 @@
             <w:tcMar>
               <w:top w:type="dxa" w:w="99"/>
               <w:left w:type="dxa" w:w="136"/>
-              <w:bottom w:type="dxa" w:w="99"/>
-              <w:right w:type="dxa" w:w="57"/>
-            </w:tcMar>
-            <w:vAlign w:val="center"/>
-          </w:tcPr>
-          <w:tbl>
-            <w:tblPr>
-              <w:tblW w:type="dxa" w:w="1848"/>
-              <w:tblBorders>
-                <w:top w:val="nil" w:color="auto" w:sz="0"/>
-                <w:left w:val="nil" w:color="auto" w:sz="0"/>
-                <w:bottom w:val="nil" w:color="auto" w:sz="0"/>
-                <w:right w:val="nil" w:color="auto" w:sz="0"/>
-                <w:insideH w:val="nil" w:color="auto" w:sz="0"/>
-                <w:insideV w:val="nil" w:color="auto" w:sz="0"/>
-              </w:tblBorders>
-              <w:tblLayout w:type="fixed"/>
-            </w:tblPr>
-            <w:tblGrid>
-              <w:gridCol w:w="1848"/>
-            </w:tblGrid>
-            <w:tr>
-              <w:trPr>
-                <w:trHeight w:val="147" w:hRule="exact"/>
-              </w:trPr>
-              <w:tc>
-                <w:tcPr>
-                  <w:tcW w:type="dxa" w:w="1848"/>
-                  <w:tcBorders>
-                    <w:top w:val="nil" w:color="auto" w:sz="0"/>
-                    <w:left w:val="nil" w:color="auto" w:sz="0"/>
-                    <w:bottom w:val="nil" w:color="auto" w:sz="0"/>
-                    <w:right w:val="nil" w:color="auto" w:sz="0"/>
-                  </w:tcBorders>
-                  <w:shd w:fill="A3843F" w:color="auto" w:val="clear"/>
-                  <w:tcMar>
-                    <w:top w:type="dxa" w:w="0"/>
-                    <w:left w:type="dxa" w:w="0"/>
-                    <w:bottom w:type="dxa" w:w="0"/>
-                    <w:right w:type="dxa" w:w="0"/>
-                  </w:tcMar>
-                  <w:vAlign w:val="top"/>
-                </w:tcPr>
-                <w:p>
-                  <w:pPr>
-                    <w:keepLines/>
-                    <w:spacing w:after="0" w:before="0" w:line="20" w:lineRule="exact"/>
-                  </w:pPr>
-                  <w:r>
-                    <w:rPr>
-                      <w:rFonts w:ascii="Inter" w:cs="Inter" w:eastAsia="Inter" w:hAnsi="Inter"/>
-                      <w:color w:val="1C1A16"/>
-                      <w:kern w:val="2"/>
-                      <w:sz w:val="4"/>
-                      <w:szCs w:val="4"/>
-                    </w:rPr>
-                    <w:t xml:space="preserve"/>
-                  </w:r>
-                </w:p>
-              </w:tc>
-            </w:tr>
-          </w:tbl>
-          <w:p>
-            <w:pPr>
-              <w:keepLines/>
-              <w:spacing w:after="0" w:before="0" w:line="20" w:lineRule="exact"/>
-            </w:pPr>
-            <w:r>
-              <w:rPr>
-                <w:rFonts w:ascii="Inter" w:cs="Inter" w:eastAsia="Inter" w:hAnsi="Inter"/>
-                <w:color w:val="1C1A16"/>
-                <w:kern w:val="2"/>
-                <w:sz w:val="4"/>
-                <w:szCs w:val="4"/>
-              </w:rPr>
-              <w:t xml:space="preserve"/>
-            </w:r>
-          </w:p>
-        </w:tc>
-        <w:tc>
-          <w:tcPr>
-            <w:tcW w:type="dxa" w:w="1020"/>
-            <w:tcBorders>
-              <w:top w:val="nil" w:color="auto" w:sz="0"/>
-              <w:left w:val="nil" w:color="auto" w:sz="0"/>
-              <w:bottom w:val="single" w:color="E2DBCD" w:sz="4"/>
-              <w:right w:val="nil" w:color="auto" w:sz="0"/>
-            </w:tcBorders>
-            <w:tcMar>
-              <w:top w:type="dxa" w:w="99"/>
-              <w:left w:type="dxa" w:w="57"/>
               <w:bottom w:type="dxa" w:w="99"/>
               <w:right w:type="dxa" w:w="136"/>
             </w:tcMar>
@@ -3484,7 +3545,7 @@
         </w:tc>
         <w:tc>
           <w:tcPr>
-            <w:tcW w:type="dxa" w:w="1644"/>
+            <w:tcW w:type="dxa" w:w="1701"/>
             <w:tcBorders>
               <w:top w:val="nil" w:color="auto" w:sz="0"/>
               <w:left w:val="nil" w:color="auto" w:sz="0"/>
@@ -3524,7 +3585,7 @@
         </w:trPr>
         <w:tc>
           <w:tcPr>
-            <w:tcW w:type="dxa" w:w="3686"/>
+            <w:tcW w:type="dxa" w:w="4763"/>
             <w:tcBorders>
               <w:top w:val="nil" w:color="auto" w:sz="0"/>
               <w:left w:val="nil" w:color="auto" w:sz="0"/>
@@ -3558,7 +3619,7 @@
         </w:tc>
         <w:tc>
           <w:tcPr>
-            <w:tcW w:type="dxa" w:w="1247"/>
+            <w:tcW w:type="dxa" w:w="1587"/>
             <w:tcBorders>
               <w:top w:val="nil" w:color="auto" w:sz="0"/>
               <w:left w:val="nil" w:color="auto" w:sz="0"/>
@@ -3583,8 +3644,8 @@
                 <w:rFonts w:ascii="Inter" w:cs="Inter" w:eastAsia="Inter" w:hAnsi="Inter"/>
                 <w:color w:val="625B50"/>
                 <w:kern w:val="2"/>
-                <w:sz w:val="16"/>
-                <w:szCs w:val="16"/>
+                <w:sz w:val="17"/>
+                <w:szCs w:val="17"/>
               </w:rPr>
               <w:t xml:space="preserve">4⁠–⁠6</w:t>
             </w:r>
@@ -3592,7 +3653,7 @@
         </w:tc>
         <w:tc>
           <w:tcPr>
-            <w:tcW w:type="dxa" w:w="2041"/>
+            <w:tcW w:type="dxa" w:w="1587"/>
             <w:tcBorders>
               <w:top w:val="nil" w:color="auto" w:sz="0"/>
               <w:left w:val="nil" w:color="auto" w:sz="0"/>
@@ -3602,132 +3663,6 @@
             <w:tcMar>
               <w:top w:type="dxa" w:w="99"/>
               <w:left w:type="dxa" w:w="136"/>
-              <w:bottom w:type="dxa" w:w="99"/>
-              <w:right w:type="dxa" w:w="57"/>
-            </w:tcMar>
-            <w:vAlign w:val="center"/>
-          </w:tcPr>
-          <w:tbl>
-            <w:tblPr>
-              <w:tblW w:type="dxa" w:w="1848"/>
-              <w:tblBorders>
-                <w:top w:val="nil" w:color="auto" w:sz="0"/>
-                <w:left w:val="nil" w:color="auto" w:sz="0"/>
-                <w:bottom w:val="nil" w:color="auto" w:sz="0"/>
-                <w:right w:val="nil" w:color="auto" w:sz="0"/>
-                <w:insideH w:val="nil" w:color="auto" w:sz="0"/>
-                <w:insideV w:val="nil" w:color="auto" w:sz="0"/>
-              </w:tblBorders>
-              <w:tblLayout w:type="fixed"/>
-            </w:tblPr>
-            <w:tblGrid>
-              <w:gridCol w:w="1619"/>
-              <w:gridCol w:w="229"/>
-            </w:tblGrid>
-            <w:tr>
-              <w:trPr>
-                <w:trHeight w:val="147" w:hRule="exact"/>
-              </w:trPr>
-              <w:tc>
-                <w:tcPr>
-                  <w:tcW w:type="dxa" w:w="1619"/>
-                  <w:tcBorders>
-                    <w:top w:val="nil" w:color="auto" w:sz="0"/>
-                    <w:left w:val="nil" w:color="auto" w:sz="0"/>
-                    <w:bottom w:val="nil" w:color="auto" w:sz="0"/>
-                    <w:right w:val="nil" w:color="auto" w:sz="0"/>
-                  </w:tcBorders>
-                  <w:shd w:fill="A3843F" w:color="auto" w:val="clear"/>
-                  <w:tcMar>
-                    <w:top w:type="dxa" w:w="0"/>
-                    <w:left w:type="dxa" w:w="0"/>
-                    <w:bottom w:type="dxa" w:w="0"/>
-                    <w:right w:type="dxa" w:w="0"/>
-                  </w:tcMar>
-                  <w:vAlign w:val="top"/>
-                </w:tcPr>
-                <w:p>
-                  <w:pPr>
-                    <w:keepLines/>
-                    <w:spacing w:after="0" w:before="0" w:line="20" w:lineRule="exact"/>
-                  </w:pPr>
-                  <w:r>
-                    <w:rPr>
-                      <w:rFonts w:ascii="Inter" w:cs="Inter" w:eastAsia="Inter" w:hAnsi="Inter"/>
-                      <w:color w:val="1C1A16"/>
-                      <w:kern w:val="2"/>
-                      <w:sz w:val="4"/>
-                      <w:szCs w:val="4"/>
-                    </w:rPr>
-                    <w:t xml:space="preserve"/>
-                  </w:r>
-                </w:p>
-              </w:tc>
-              <w:tc>
-                <w:tcPr>
-                  <w:tcW w:type="dxa" w:w="229"/>
-                  <w:tcBorders>
-                    <w:top w:val="nil" w:color="auto" w:sz="0"/>
-                    <w:left w:val="nil" w:color="auto" w:sz="0"/>
-                    <w:bottom w:val="nil" w:color="auto" w:sz="0"/>
-                    <w:right w:val="nil" w:color="auto" w:sz="0"/>
-                  </w:tcBorders>
-                  <w:tcMar>
-                    <w:top w:type="dxa" w:w="0"/>
-                    <w:left w:type="dxa" w:w="0"/>
-                    <w:bottom w:type="dxa" w:w="0"/>
-                    <w:right w:type="dxa" w:w="0"/>
-                  </w:tcMar>
-                  <w:vAlign w:val="top"/>
-                </w:tcPr>
-                <w:p>
-                  <w:pPr>
-                    <w:keepLines/>
-                    <w:spacing w:after="0" w:before="0" w:line="20" w:lineRule="exact"/>
-                  </w:pPr>
-                  <w:r>
-                    <w:rPr>
-                      <w:rFonts w:ascii="Inter" w:cs="Inter" w:eastAsia="Inter" w:hAnsi="Inter"/>
-                      <w:color w:val="1C1A16"/>
-                      <w:kern w:val="2"/>
-                      <w:sz w:val="4"/>
-                      <w:szCs w:val="4"/>
-                    </w:rPr>
-                    <w:t xml:space="preserve"/>
-                  </w:r>
-                </w:p>
-              </w:tc>
-            </w:tr>
-          </w:tbl>
-          <w:p>
-            <w:pPr>
-              <w:keepLines/>
-              <w:spacing w:after="0" w:before="0" w:line="20" w:lineRule="exact"/>
-            </w:pPr>
-            <w:r>
-              <w:rPr>
-                <w:rFonts w:ascii="Inter" w:cs="Inter" w:eastAsia="Inter" w:hAnsi="Inter"/>
-                <w:color w:val="1C1A16"/>
-                <w:kern w:val="2"/>
-                <w:sz w:val="4"/>
-                <w:szCs w:val="4"/>
-              </w:rPr>
-              <w:t xml:space="preserve"/>
-            </w:r>
-          </w:p>
-        </w:tc>
-        <w:tc>
-          <w:tcPr>
-            <w:tcW w:type="dxa" w:w="1020"/>
-            <w:tcBorders>
-              <w:top w:val="nil" w:color="auto" w:sz="0"/>
-              <w:left w:val="nil" w:color="auto" w:sz="0"/>
-              <w:bottom w:val="single" w:color="E2DBCD" w:sz="4"/>
-              <w:right w:val="nil" w:color="auto" w:sz="0"/>
-            </w:tcBorders>
-            <w:tcMar>
-              <w:top w:type="dxa" w:w="99"/>
-              <w:left w:type="dxa" w:w="57"/>
               <w:bottom w:type="dxa" w:w="99"/>
               <w:right w:type="dxa" w:w="136"/>
             </w:tcMar>
@@ -3753,7 +3688,7 @@
         </w:tc>
         <w:tc>
           <w:tcPr>
-            <w:tcW w:type="dxa" w:w="1644"/>
+            <w:tcW w:type="dxa" w:w="1701"/>
             <w:tcBorders>
               <w:top w:val="nil" w:color="auto" w:sz="0"/>
               <w:left w:val="nil" w:color="auto" w:sz="0"/>
@@ -3793,7 +3728,7 @@
         </w:trPr>
         <w:tc>
           <w:tcPr>
-            <w:tcW w:type="dxa" w:w="3686"/>
+            <w:tcW w:type="dxa" w:w="4763"/>
             <w:tcBorders>
               <w:top w:val="nil" w:color="auto" w:sz="0"/>
               <w:left w:val="nil" w:color="auto" w:sz="0"/>
@@ -3827,7 +3762,7 @@
         </w:tc>
         <w:tc>
           <w:tcPr>
-            <w:tcW w:type="dxa" w:w="1247"/>
+            <w:tcW w:type="dxa" w:w="1587"/>
             <w:tcBorders>
               <w:top w:val="nil" w:color="auto" w:sz="0"/>
               <w:left w:val="nil" w:color="auto" w:sz="0"/>
@@ -3852,8 +3787,8 @@
                 <w:rFonts w:ascii="Inter" w:cs="Inter" w:eastAsia="Inter" w:hAnsi="Inter"/>
                 <w:color w:val="625B50"/>
                 <w:kern w:val="2"/>
-                <w:sz w:val="16"/>
-                <w:szCs w:val="16"/>
+                <w:sz w:val="17"/>
+                <w:szCs w:val="17"/>
               </w:rPr>
               <w:t xml:space="preserve">10⁠–⁠13</w:t>
             </w:r>
@@ -3861,7 +3796,7 @@
         </w:tc>
         <w:tc>
           <w:tcPr>
-            <w:tcW w:type="dxa" w:w="2041"/>
+            <w:tcW w:type="dxa" w:w="1587"/>
             <w:tcBorders>
               <w:top w:val="nil" w:color="auto" w:sz="0"/>
               <w:left w:val="nil" w:color="auto" w:sz="0"/>
@@ -3871,132 +3806,6 @@
             <w:tcMar>
               <w:top w:type="dxa" w:w="99"/>
               <w:left w:type="dxa" w:w="136"/>
-              <w:bottom w:type="dxa" w:w="99"/>
-              <w:right w:type="dxa" w:w="57"/>
-            </w:tcMar>
-            <w:vAlign w:val="center"/>
-          </w:tcPr>
-          <w:tbl>
-            <w:tblPr>
-              <w:tblW w:type="dxa" w:w="1848"/>
-              <w:tblBorders>
-                <w:top w:val="nil" w:color="auto" w:sz="0"/>
-                <w:left w:val="nil" w:color="auto" w:sz="0"/>
-                <w:bottom w:val="nil" w:color="auto" w:sz="0"/>
-                <w:right w:val="nil" w:color="auto" w:sz="0"/>
-                <w:insideH w:val="nil" w:color="auto" w:sz="0"/>
-                <w:insideV w:val="nil" w:color="auto" w:sz="0"/>
-              </w:tblBorders>
-              <w:tblLayout w:type="fixed"/>
-            </w:tblPr>
-            <w:tblGrid>
-              <w:gridCol w:w="1291"/>
-              <w:gridCol w:w="557"/>
-            </w:tblGrid>
-            <w:tr>
-              <w:trPr>
-                <w:trHeight w:val="147" w:hRule="exact"/>
-              </w:trPr>
-              <w:tc>
-                <w:tcPr>
-                  <w:tcW w:type="dxa" w:w="1291"/>
-                  <w:tcBorders>
-                    <w:top w:val="nil" w:color="auto" w:sz="0"/>
-                    <w:left w:val="nil" w:color="auto" w:sz="0"/>
-                    <w:bottom w:val="nil" w:color="auto" w:sz="0"/>
-                    <w:right w:val="nil" w:color="auto" w:sz="0"/>
-                  </w:tcBorders>
-                  <w:shd w:fill="A3843F" w:color="auto" w:val="clear"/>
-                  <w:tcMar>
-                    <w:top w:type="dxa" w:w="0"/>
-                    <w:left w:type="dxa" w:w="0"/>
-                    <w:bottom w:type="dxa" w:w="0"/>
-                    <w:right w:type="dxa" w:w="0"/>
-                  </w:tcMar>
-                  <w:vAlign w:val="top"/>
-                </w:tcPr>
-                <w:p>
-                  <w:pPr>
-                    <w:keepLines/>
-                    <w:spacing w:after="0" w:before="0" w:line="20" w:lineRule="exact"/>
-                  </w:pPr>
-                  <w:r>
-                    <w:rPr>
-                      <w:rFonts w:ascii="Inter" w:cs="Inter" w:eastAsia="Inter" w:hAnsi="Inter"/>
-                      <w:color w:val="1C1A16"/>
-                      <w:kern w:val="2"/>
-                      <w:sz w:val="4"/>
-                      <w:szCs w:val="4"/>
-                    </w:rPr>
-                    <w:t xml:space="preserve"/>
-                  </w:r>
-                </w:p>
-              </w:tc>
-              <w:tc>
-                <w:tcPr>
-                  <w:tcW w:type="dxa" w:w="557"/>
-                  <w:tcBorders>
-                    <w:top w:val="nil" w:color="auto" w:sz="0"/>
-                    <w:left w:val="nil" w:color="auto" w:sz="0"/>
-                    <w:bottom w:val="nil" w:color="auto" w:sz="0"/>
-                    <w:right w:val="nil" w:color="auto" w:sz="0"/>
-                  </w:tcBorders>
-                  <w:tcMar>
-                    <w:top w:type="dxa" w:w="0"/>
-                    <w:left w:type="dxa" w:w="0"/>
-                    <w:bottom w:type="dxa" w:w="0"/>
-                    <w:right w:type="dxa" w:w="0"/>
-                  </w:tcMar>
-                  <w:vAlign w:val="top"/>
-                </w:tcPr>
-                <w:p>
-                  <w:pPr>
-                    <w:keepLines/>
-                    <w:spacing w:after="0" w:before="0" w:line="20" w:lineRule="exact"/>
-                  </w:pPr>
-                  <w:r>
-                    <w:rPr>
-                      <w:rFonts w:ascii="Inter" w:cs="Inter" w:eastAsia="Inter" w:hAnsi="Inter"/>
-                      <w:color w:val="1C1A16"/>
-                      <w:kern w:val="2"/>
-                      <w:sz w:val="4"/>
-                      <w:szCs w:val="4"/>
-                    </w:rPr>
-                    <w:t xml:space="preserve"/>
-                  </w:r>
-                </w:p>
-              </w:tc>
-            </w:tr>
-          </w:tbl>
-          <w:p>
-            <w:pPr>
-              <w:keepLines/>
-              <w:spacing w:after="0" w:before="0" w:line="20" w:lineRule="exact"/>
-            </w:pPr>
-            <w:r>
-              <w:rPr>
-                <w:rFonts w:ascii="Inter" w:cs="Inter" w:eastAsia="Inter" w:hAnsi="Inter"/>
-                <w:color w:val="1C1A16"/>
-                <w:kern w:val="2"/>
-                <w:sz w:val="4"/>
-                <w:szCs w:val="4"/>
-              </w:rPr>
-              <w:t xml:space="preserve"/>
-            </w:r>
-          </w:p>
-        </w:tc>
-        <w:tc>
-          <w:tcPr>
-            <w:tcW w:type="dxa" w:w="1020"/>
-            <w:tcBorders>
-              <w:top w:val="nil" w:color="auto" w:sz="0"/>
-              <w:left w:val="nil" w:color="auto" w:sz="0"/>
-              <w:bottom w:val="single" w:color="E2DBCD" w:sz="4"/>
-              <w:right w:val="nil" w:color="auto" w:sz="0"/>
-            </w:tcBorders>
-            <w:tcMar>
-              <w:top w:type="dxa" w:w="99"/>
-              <w:left w:type="dxa" w:w="57"/>
               <w:bottom w:type="dxa" w:w="99"/>
               <w:right w:type="dxa" w:w="136"/>
             </w:tcMar>
@@ -4022,7 +3831,7 @@
         </w:tc>
         <w:tc>
           <w:tcPr>
-            <w:tcW w:type="dxa" w:w="1644"/>
+            <w:tcW w:type="dxa" w:w="1701"/>
             <w:tcBorders>
               <w:top w:val="nil" w:color="auto" w:sz="0"/>
               <w:left w:val="nil" w:color="auto" w:sz="0"/>
@@ -4062,7 +3871,7 @@
         </w:trPr>
         <w:tc>
           <w:tcPr>
-            <w:tcW w:type="dxa" w:w="3686"/>
+            <w:tcW w:type="dxa" w:w="4763"/>
             <w:tcBorders>
               <w:top w:val="nil" w:color="auto" w:sz="0"/>
               <w:left w:val="nil" w:color="auto" w:sz="0"/>
@@ -4096,7 +3905,7 @@
         </w:tc>
         <w:tc>
           <w:tcPr>
-            <w:tcW w:type="dxa" w:w="1247"/>
+            <w:tcW w:type="dxa" w:w="1587"/>
             <w:tcBorders>
               <w:top w:val="nil" w:color="auto" w:sz="0"/>
               <w:left w:val="nil" w:color="auto" w:sz="0"/>
@@ -4121,8 +3930,8 @@
                 <w:rFonts w:ascii="Inter" w:cs="Inter" w:eastAsia="Inter" w:hAnsi="Inter"/>
                 <w:color w:val="625B50"/>
                 <w:kern w:val="2"/>
-                <w:sz w:val="16"/>
-                <w:szCs w:val="16"/>
+                <w:sz w:val="17"/>
+                <w:szCs w:val="17"/>
               </w:rPr>
               <w:t xml:space="preserve">7⁠–⁠8, 18⁠–⁠24</w:t>
             </w:r>
@@ -4130,7 +3939,7 @@
         </w:tc>
         <w:tc>
           <w:tcPr>
-            <w:tcW w:type="dxa" w:w="2041"/>
+            <w:tcW w:type="dxa" w:w="1587"/>
             <w:tcBorders>
               <w:top w:val="nil" w:color="auto" w:sz="0"/>
               <w:left w:val="nil" w:color="auto" w:sz="0"/>
@@ -4140,132 +3949,6 @@
             <w:tcMar>
               <w:top w:type="dxa" w:w="99"/>
               <w:left w:type="dxa" w:w="136"/>
-              <w:bottom w:type="dxa" w:w="99"/>
-              <w:right w:type="dxa" w:w="57"/>
-            </w:tcMar>
-            <w:vAlign w:val="center"/>
-          </w:tcPr>
-          <w:tbl>
-            <w:tblPr>
-              <w:tblW w:type="dxa" w:w="1848"/>
-              <w:tblBorders>
-                <w:top w:val="nil" w:color="auto" w:sz="0"/>
-                <w:left w:val="nil" w:color="auto" w:sz="0"/>
-                <w:bottom w:val="nil" w:color="auto" w:sz="0"/>
-                <w:right w:val="nil" w:color="auto" w:sz="0"/>
-                <w:insideH w:val="nil" w:color="auto" w:sz="0"/>
-                <w:insideV w:val="nil" w:color="auto" w:sz="0"/>
-              </w:tblBorders>
-              <w:tblLayout w:type="fixed"/>
-            </w:tblPr>
-            <w:tblGrid>
-              <w:gridCol w:w="970"/>
-              <w:gridCol w:w="878"/>
-            </w:tblGrid>
-            <w:tr>
-              <w:trPr>
-                <w:trHeight w:val="147" w:hRule="exact"/>
-              </w:trPr>
-              <w:tc>
-                <w:tcPr>
-                  <w:tcW w:type="dxa" w:w="970"/>
-                  <w:tcBorders>
-                    <w:top w:val="nil" w:color="auto" w:sz="0"/>
-                    <w:left w:val="nil" w:color="auto" w:sz="0"/>
-                    <w:bottom w:val="nil" w:color="auto" w:sz="0"/>
-                    <w:right w:val="nil" w:color="auto" w:sz="0"/>
-                  </w:tcBorders>
-                  <w:shd w:fill="A3843F" w:color="auto" w:val="clear"/>
-                  <w:tcMar>
-                    <w:top w:type="dxa" w:w="0"/>
-                    <w:left w:type="dxa" w:w="0"/>
-                    <w:bottom w:type="dxa" w:w="0"/>
-                    <w:right w:type="dxa" w:w="0"/>
-                  </w:tcMar>
-                  <w:vAlign w:val="top"/>
-                </w:tcPr>
-                <w:p>
-                  <w:pPr>
-                    <w:keepLines/>
-                    <w:spacing w:after="0" w:before="0" w:line="20" w:lineRule="exact"/>
-                  </w:pPr>
-                  <w:r>
-                    <w:rPr>
-                      <w:rFonts w:ascii="Inter" w:cs="Inter" w:eastAsia="Inter" w:hAnsi="Inter"/>
-                      <w:color w:val="1C1A16"/>
-                      <w:kern w:val="2"/>
-                      <w:sz w:val="4"/>
-                      <w:szCs w:val="4"/>
-                    </w:rPr>
-                    <w:t xml:space="preserve"/>
-                  </w:r>
-                </w:p>
-              </w:tc>
-              <w:tc>
-                <w:tcPr>
-                  <w:tcW w:type="dxa" w:w="878"/>
-                  <w:tcBorders>
-                    <w:top w:val="nil" w:color="auto" w:sz="0"/>
-                    <w:left w:val="nil" w:color="auto" w:sz="0"/>
-                    <w:bottom w:val="nil" w:color="auto" w:sz="0"/>
-                    <w:right w:val="nil" w:color="auto" w:sz="0"/>
-                  </w:tcBorders>
-                  <w:tcMar>
-                    <w:top w:type="dxa" w:w="0"/>
-                    <w:left w:type="dxa" w:w="0"/>
-                    <w:bottom w:type="dxa" w:w="0"/>
-                    <w:right w:type="dxa" w:w="0"/>
-                  </w:tcMar>
-                  <w:vAlign w:val="top"/>
-                </w:tcPr>
-                <w:p>
-                  <w:pPr>
-                    <w:keepLines/>
-                    <w:spacing w:after="0" w:before="0" w:line="20" w:lineRule="exact"/>
-                  </w:pPr>
-                  <w:r>
-                    <w:rPr>
-                      <w:rFonts w:ascii="Inter" w:cs="Inter" w:eastAsia="Inter" w:hAnsi="Inter"/>
-                      <w:color w:val="1C1A16"/>
-                      <w:kern w:val="2"/>
-                      <w:sz w:val="4"/>
-                      <w:szCs w:val="4"/>
-                    </w:rPr>
-                    <w:t xml:space="preserve"/>
-                  </w:r>
-                </w:p>
-              </w:tc>
-            </w:tr>
-          </w:tbl>
-          <w:p>
-            <w:pPr>
-              <w:keepLines/>
-              <w:spacing w:after="0" w:before="0" w:line="20" w:lineRule="exact"/>
-            </w:pPr>
-            <w:r>
-              <w:rPr>
-                <w:rFonts w:ascii="Inter" w:cs="Inter" w:eastAsia="Inter" w:hAnsi="Inter"/>
-                <w:color w:val="1C1A16"/>
-                <w:kern w:val="2"/>
-                <w:sz w:val="4"/>
-                <w:szCs w:val="4"/>
-              </w:rPr>
-              <w:t xml:space="preserve"/>
-            </w:r>
-          </w:p>
-        </w:tc>
-        <w:tc>
-          <w:tcPr>
-            <w:tcW w:type="dxa" w:w="1020"/>
-            <w:tcBorders>
-              <w:top w:val="nil" w:color="auto" w:sz="0"/>
-              <w:left w:val="nil" w:color="auto" w:sz="0"/>
-              <w:bottom w:val="single" w:color="E2DBCD" w:sz="4"/>
-              <w:right w:val="nil" w:color="auto" w:sz="0"/>
-            </w:tcBorders>
-            <w:tcMar>
-              <w:top w:type="dxa" w:w="99"/>
-              <w:left w:type="dxa" w:w="57"/>
               <w:bottom w:type="dxa" w:w="99"/>
               <w:right w:type="dxa" w:w="136"/>
             </w:tcMar>
@@ -4291,7 +3974,7 @@
         </w:tc>
         <w:tc>
           <w:tcPr>
-            <w:tcW w:type="dxa" w:w="1644"/>
+            <w:tcW w:type="dxa" w:w="1701"/>
             <w:tcBorders>
               <w:top w:val="nil" w:color="auto" w:sz="0"/>
               <w:left w:val="nil" w:color="auto" w:sz="0"/>
@@ -4331,7 +4014,7 @@
         </w:trPr>
         <w:tc>
           <w:tcPr>
-            <w:tcW w:type="dxa" w:w="3686"/>
+            <w:tcW w:type="dxa" w:w="4763"/>
             <w:tcBorders>
               <w:top w:val="nil" w:color="auto" w:sz="0"/>
               <w:left w:val="nil" w:color="auto" w:sz="0"/>
@@ -4365,7 +4048,7 @@
         </w:tc>
         <w:tc>
           <w:tcPr>
-            <w:tcW w:type="dxa" w:w="1247"/>
+            <w:tcW w:type="dxa" w:w="1587"/>
             <w:tcBorders>
               <w:top w:val="nil" w:color="auto" w:sz="0"/>
               <w:left w:val="nil" w:color="auto" w:sz="0"/>
@@ -4390,8 +4073,8 @@
                 <w:rFonts w:ascii="Inter" w:cs="Inter" w:eastAsia="Inter" w:hAnsi="Inter"/>
                 <w:color w:val="625B50"/>
                 <w:kern w:val="2"/>
-                <w:sz w:val="16"/>
-                <w:szCs w:val="16"/>
+                <w:sz w:val="17"/>
+                <w:szCs w:val="17"/>
               </w:rPr>
               <w:t xml:space="preserve">16⁠–⁠17</w:t>
             </w:r>
@@ -4399,7 +4082,7 @@
         </w:tc>
         <w:tc>
           <w:tcPr>
-            <w:tcW w:type="dxa" w:w="2041"/>
+            <w:tcW w:type="dxa" w:w="1587"/>
             <w:tcBorders>
               <w:top w:val="nil" w:color="auto" w:sz="0"/>
               <w:left w:val="nil" w:color="auto" w:sz="0"/>
@@ -4409,132 +4092,6 @@
             <w:tcMar>
               <w:top w:type="dxa" w:w="99"/>
               <w:left w:type="dxa" w:w="136"/>
-              <w:bottom w:type="dxa" w:w="99"/>
-              <w:right w:type="dxa" w:w="57"/>
-            </w:tcMar>
-            <w:vAlign w:val="center"/>
-          </w:tcPr>
-          <w:tbl>
-            <w:tblPr>
-              <w:tblW w:type="dxa" w:w="1848"/>
-              <w:tblBorders>
-                <w:top w:val="nil" w:color="auto" w:sz="0"/>
-                <w:left w:val="nil" w:color="auto" w:sz="0"/>
-                <w:bottom w:val="nil" w:color="auto" w:sz="0"/>
-                <w:right w:val="nil" w:color="auto" w:sz="0"/>
-                <w:insideH w:val="nil" w:color="auto" w:sz="0"/>
-                <w:insideV w:val="nil" w:color="auto" w:sz="0"/>
-              </w:tblBorders>
-              <w:tblLayout w:type="fixed"/>
-            </w:tblPr>
-            <w:tblGrid>
-              <w:gridCol w:w="840"/>
-              <w:gridCol w:w="1008"/>
-            </w:tblGrid>
-            <w:tr>
-              <w:trPr>
-                <w:trHeight w:val="147" w:hRule="exact"/>
-              </w:trPr>
-              <w:tc>
-                <w:tcPr>
-                  <w:tcW w:type="dxa" w:w="840"/>
-                  <w:tcBorders>
-                    <w:top w:val="nil" w:color="auto" w:sz="0"/>
-                    <w:left w:val="nil" w:color="auto" w:sz="0"/>
-                    <w:bottom w:val="nil" w:color="auto" w:sz="0"/>
-                    <w:right w:val="nil" w:color="auto" w:sz="0"/>
-                  </w:tcBorders>
-                  <w:shd w:fill="A3843F" w:color="auto" w:val="clear"/>
-                  <w:tcMar>
-                    <w:top w:type="dxa" w:w="0"/>
-                    <w:left w:type="dxa" w:w="0"/>
-                    <w:bottom w:type="dxa" w:w="0"/>
-                    <w:right w:type="dxa" w:w="0"/>
-                  </w:tcMar>
-                  <w:vAlign w:val="top"/>
-                </w:tcPr>
-                <w:p>
-                  <w:pPr>
-                    <w:keepLines/>
-                    <w:spacing w:after="0" w:before="0" w:line="20" w:lineRule="exact"/>
-                  </w:pPr>
-                  <w:r>
-                    <w:rPr>
-                      <w:rFonts w:ascii="Inter" w:cs="Inter" w:eastAsia="Inter" w:hAnsi="Inter"/>
-                      <w:color w:val="1C1A16"/>
-                      <w:kern w:val="2"/>
-                      <w:sz w:val="4"/>
-                      <w:szCs w:val="4"/>
-                    </w:rPr>
-                    <w:t xml:space="preserve"/>
-                  </w:r>
-                </w:p>
-              </w:tc>
-              <w:tc>
-                <w:tcPr>
-                  <w:tcW w:type="dxa" w:w="1008"/>
-                  <w:tcBorders>
-                    <w:top w:val="nil" w:color="auto" w:sz="0"/>
-                    <w:left w:val="nil" w:color="auto" w:sz="0"/>
-                    <w:bottom w:val="nil" w:color="auto" w:sz="0"/>
-                    <w:right w:val="nil" w:color="auto" w:sz="0"/>
-                  </w:tcBorders>
-                  <w:tcMar>
-                    <w:top w:type="dxa" w:w="0"/>
-                    <w:left w:type="dxa" w:w="0"/>
-                    <w:bottom w:type="dxa" w:w="0"/>
-                    <w:right w:type="dxa" w:w="0"/>
-                  </w:tcMar>
-                  <w:vAlign w:val="top"/>
-                </w:tcPr>
-                <w:p>
-                  <w:pPr>
-                    <w:keepLines/>
-                    <w:spacing w:after="0" w:before="0" w:line="20" w:lineRule="exact"/>
-                  </w:pPr>
-                  <w:r>
-                    <w:rPr>
-                      <w:rFonts w:ascii="Inter" w:cs="Inter" w:eastAsia="Inter" w:hAnsi="Inter"/>
-                      <w:color w:val="1C1A16"/>
-                      <w:kern w:val="2"/>
-                      <w:sz w:val="4"/>
-                      <w:szCs w:val="4"/>
-                    </w:rPr>
-                    <w:t xml:space="preserve"/>
-                  </w:r>
-                </w:p>
-              </w:tc>
-            </w:tr>
-          </w:tbl>
-          <w:p>
-            <w:pPr>
-              <w:keepLines/>
-              <w:spacing w:after="0" w:before="0" w:line="20" w:lineRule="exact"/>
-            </w:pPr>
-            <w:r>
-              <w:rPr>
-                <w:rFonts w:ascii="Inter" w:cs="Inter" w:eastAsia="Inter" w:hAnsi="Inter"/>
-                <w:color w:val="1C1A16"/>
-                <w:kern w:val="2"/>
-                <w:sz w:val="4"/>
-                <w:szCs w:val="4"/>
-              </w:rPr>
-              <w:t xml:space="preserve"/>
-            </w:r>
-          </w:p>
-        </w:tc>
-        <w:tc>
-          <w:tcPr>
-            <w:tcW w:type="dxa" w:w="1020"/>
-            <w:tcBorders>
-              <w:top w:val="nil" w:color="auto" w:sz="0"/>
-              <w:left w:val="nil" w:color="auto" w:sz="0"/>
-              <w:bottom w:val="single" w:color="E2DBCD" w:sz="4"/>
-              <w:right w:val="nil" w:color="auto" w:sz="0"/>
-            </w:tcBorders>
-            <w:tcMar>
-              <w:top w:type="dxa" w:w="99"/>
-              <w:left w:type="dxa" w:w="57"/>
               <w:bottom w:type="dxa" w:w="99"/>
               <w:right w:type="dxa" w:w="136"/>
             </w:tcMar>
@@ -4560,7 +4117,7 @@
         </w:tc>
         <w:tc>
           <w:tcPr>
-            <w:tcW w:type="dxa" w:w="1644"/>
+            <w:tcW w:type="dxa" w:w="1701"/>
             <w:tcBorders>
               <w:top w:val="nil" w:color="auto" w:sz="0"/>
               <w:left w:val="nil" w:color="auto" w:sz="0"/>
@@ -4600,7 +4157,7 @@
         </w:trPr>
         <w:tc>
           <w:tcPr>
-            <w:tcW w:type="dxa" w:w="3686"/>
+            <w:tcW w:type="dxa" w:w="4763"/>
             <w:tcBorders>
               <w:top w:val="nil" w:color="auto" w:sz="0"/>
               <w:left w:val="nil" w:color="auto" w:sz="0"/>
@@ -4634,7 +4191,7 @@
         </w:tc>
         <w:tc>
           <w:tcPr>
-            <w:tcW w:type="dxa" w:w="1247"/>
+            <w:tcW w:type="dxa" w:w="1587"/>
             <w:tcBorders>
               <w:top w:val="nil" w:color="auto" w:sz="0"/>
               <w:left w:val="nil" w:color="auto" w:sz="0"/>
@@ -4659,8 +4216,8 @@
                 <w:rFonts w:ascii="Inter" w:cs="Inter" w:eastAsia="Inter" w:hAnsi="Inter"/>
                 <w:color w:val="625B50"/>
                 <w:kern w:val="2"/>
-                <w:sz w:val="16"/>
-                <w:szCs w:val="16"/>
+                <w:sz w:val="17"/>
+                <w:szCs w:val="17"/>
               </w:rPr>
               <w:t xml:space="preserve">9, 14⁠–⁠15</w:t>
             </w:r>
@@ -4668,7 +4225,7 @@
         </w:tc>
         <w:tc>
           <w:tcPr>
-            <w:tcW w:type="dxa" w:w="2041"/>
+            <w:tcW w:type="dxa" w:w="1587"/>
             <w:tcBorders>
               <w:top w:val="nil" w:color="auto" w:sz="0"/>
               <w:left w:val="nil" w:color="auto" w:sz="0"/>
@@ -4678,132 +4235,6 @@
             <w:tcMar>
               <w:top w:type="dxa" w:w="99"/>
               <w:left w:type="dxa" w:w="136"/>
-              <w:bottom w:type="dxa" w:w="99"/>
-              <w:right w:type="dxa" w:w="57"/>
-            </w:tcMar>
-            <w:vAlign w:val="center"/>
-          </w:tcPr>
-          <w:tbl>
-            <w:tblPr>
-              <w:tblW w:type="dxa" w:w="1848"/>
-              <w:tblBorders>
-                <w:top w:val="nil" w:color="auto" w:sz="0"/>
-                <w:left w:val="nil" w:color="auto" w:sz="0"/>
-                <w:bottom w:val="nil" w:color="auto" w:sz="0"/>
-                <w:right w:val="nil" w:color="auto" w:sz="0"/>
-                <w:insideH w:val="nil" w:color="auto" w:sz="0"/>
-                <w:insideV w:val="nil" w:color="auto" w:sz="0"/>
-              </w:tblBorders>
-              <w:tblLayout w:type="fixed"/>
-            </w:tblPr>
-            <w:tblGrid>
-              <w:gridCol w:w="481"/>
-              <w:gridCol w:w="1367"/>
-            </w:tblGrid>
-            <w:tr>
-              <w:trPr>
-                <w:trHeight w:val="147" w:hRule="exact"/>
-              </w:trPr>
-              <w:tc>
-                <w:tcPr>
-                  <w:tcW w:type="dxa" w:w="481"/>
-                  <w:tcBorders>
-                    <w:top w:val="nil" w:color="auto" w:sz="0"/>
-                    <w:left w:val="nil" w:color="auto" w:sz="0"/>
-                    <w:bottom w:val="nil" w:color="auto" w:sz="0"/>
-                    <w:right w:val="nil" w:color="auto" w:sz="0"/>
-                  </w:tcBorders>
-                  <w:shd w:fill="A3843F" w:color="auto" w:val="clear"/>
-                  <w:tcMar>
-                    <w:top w:type="dxa" w:w="0"/>
-                    <w:left w:type="dxa" w:w="0"/>
-                    <w:bottom w:type="dxa" w:w="0"/>
-                    <w:right w:type="dxa" w:w="0"/>
-                  </w:tcMar>
-                  <w:vAlign w:val="top"/>
-                </w:tcPr>
-                <w:p>
-                  <w:pPr>
-                    <w:keepLines/>
-                    <w:spacing w:after="0" w:before="0" w:line="20" w:lineRule="exact"/>
-                  </w:pPr>
-                  <w:r>
-                    <w:rPr>
-                      <w:rFonts w:ascii="Inter" w:cs="Inter" w:eastAsia="Inter" w:hAnsi="Inter"/>
-                      <w:color w:val="1C1A16"/>
-                      <w:kern w:val="2"/>
-                      <w:sz w:val="4"/>
-                      <w:szCs w:val="4"/>
-                    </w:rPr>
-                    <w:t xml:space="preserve"/>
-                  </w:r>
-                </w:p>
-              </w:tc>
-              <w:tc>
-                <w:tcPr>
-                  <w:tcW w:type="dxa" w:w="1367"/>
-                  <w:tcBorders>
-                    <w:top w:val="nil" w:color="auto" w:sz="0"/>
-                    <w:left w:val="nil" w:color="auto" w:sz="0"/>
-                    <w:bottom w:val="nil" w:color="auto" w:sz="0"/>
-                    <w:right w:val="nil" w:color="auto" w:sz="0"/>
-                  </w:tcBorders>
-                  <w:tcMar>
-                    <w:top w:type="dxa" w:w="0"/>
-                    <w:left w:type="dxa" w:w="0"/>
-                    <w:bottom w:type="dxa" w:w="0"/>
-                    <w:right w:type="dxa" w:w="0"/>
-                  </w:tcMar>
-                  <w:vAlign w:val="top"/>
-                </w:tcPr>
-                <w:p>
-                  <w:pPr>
-                    <w:keepLines/>
-                    <w:spacing w:after="0" w:before="0" w:line="20" w:lineRule="exact"/>
-                  </w:pPr>
-                  <w:r>
-                    <w:rPr>
-                      <w:rFonts w:ascii="Inter" w:cs="Inter" w:eastAsia="Inter" w:hAnsi="Inter"/>
-                      <w:color w:val="1C1A16"/>
-                      <w:kern w:val="2"/>
-                      <w:sz w:val="4"/>
-                      <w:szCs w:val="4"/>
-                    </w:rPr>
-                    <w:t xml:space="preserve"/>
-                  </w:r>
-                </w:p>
-              </w:tc>
-            </w:tr>
-          </w:tbl>
-          <w:p>
-            <w:pPr>
-              <w:keepLines/>
-              <w:spacing w:after="0" w:before="0" w:line="20" w:lineRule="exact"/>
-            </w:pPr>
-            <w:r>
-              <w:rPr>
-                <w:rFonts w:ascii="Inter" w:cs="Inter" w:eastAsia="Inter" w:hAnsi="Inter"/>
-                <w:color w:val="1C1A16"/>
-                <w:kern w:val="2"/>
-                <w:sz w:val="4"/>
-                <w:szCs w:val="4"/>
-              </w:rPr>
-              <w:t xml:space="preserve"/>
-            </w:r>
-          </w:p>
-        </w:tc>
-        <w:tc>
-          <w:tcPr>
-            <w:tcW w:type="dxa" w:w="1020"/>
-            <w:tcBorders>
-              <w:top w:val="nil" w:color="auto" w:sz="0"/>
-              <w:left w:val="nil" w:color="auto" w:sz="0"/>
-              <w:bottom w:val="single" w:color="E2DBCD" w:sz="4"/>
-              <w:right w:val="nil" w:color="auto" w:sz="0"/>
-            </w:tcBorders>
-            <w:tcMar>
-              <w:top w:type="dxa" w:w="99"/>
-              <w:left w:type="dxa" w:w="57"/>
               <w:bottom w:type="dxa" w:w="99"/>
               <w:right w:type="dxa" w:w="136"/>
             </w:tcMar>
@@ -4829,7 +4260,7 @@
         </w:tc>
         <w:tc>
           <w:tcPr>
-            <w:tcW w:type="dxa" w:w="1644"/>
+            <w:tcW w:type="dxa" w:w="1701"/>
             <w:tcBorders>
               <w:top w:val="nil" w:color="auto" w:sz="0"/>
               <w:left w:val="nil" w:color="auto" w:sz="0"/>
@@ -4869,7 +4300,7 @@
         </w:trPr>
         <w:tc>
           <w:tcPr>
-            <w:tcW w:type="dxa" w:w="3686"/>
+            <w:tcW w:type="dxa" w:w="4763"/>
             <w:tcBorders>
               <w:top w:val="nil" w:color="auto" w:sz="0"/>
               <w:left w:val="nil" w:color="auto" w:sz="0"/>
@@ -4903,7 +4334,7 @@
         </w:tc>
         <w:tc>
           <w:tcPr>
-            <w:tcW w:type="dxa" w:w="1247"/>
+            <w:tcW w:type="dxa" w:w="1587"/>
             <w:tcBorders>
               <w:top w:val="nil" w:color="auto" w:sz="0"/>
               <w:left w:val="nil" w:color="auto" w:sz="0"/>
@@ -4928,8 +4359,8 @@
                 <w:rFonts w:ascii="Inter" w:cs="Inter" w:eastAsia="Inter" w:hAnsi="Inter"/>
                 <w:color w:val="625B50"/>
                 <w:kern w:val="2"/>
-                <w:sz w:val="16"/>
-                <w:szCs w:val="16"/>
+                <w:sz w:val="17"/>
+                <w:szCs w:val="17"/>
               </w:rPr>
               <w:t xml:space="preserve">25</w:t>
             </w:r>
@@ -4937,7 +4368,7 @@
         </w:tc>
         <w:tc>
           <w:tcPr>
-            <w:tcW w:type="dxa" w:w="2041"/>
+            <w:tcW w:type="dxa" w:w="1587"/>
             <w:tcBorders>
               <w:top w:val="nil" w:color="auto" w:sz="0"/>
               <w:left w:val="nil" w:color="auto" w:sz="0"/>
@@ -4947,132 +4378,6 @@
             <w:tcMar>
               <w:top w:type="dxa" w:w="99"/>
               <w:left w:type="dxa" w:w="136"/>
-              <w:bottom w:type="dxa" w:w="99"/>
-              <w:right w:type="dxa" w:w="57"/>
-            </w:tcMar>
-            <w:vAlign w:val="center"/>
-          </w:tcPr>
-          <w:tbl>
-            <w:tblPr>
-              <w:tblW w:type="dxa" w:w="1848"/>
-              <w:tblBorders>
-                <w:top w:val="nil" w:color="auto" w:sz="0"/>
-                <w:left w:val="nil" w:color="auto" w:sz="0"/>
-                <w:bottom w:val="nil" w:color="auto" w:sz="0"/>
-                <w:right w:val="nil" w:color="auto" w:sz="0"/>
-                <w:insideH w:val="nil" w:color="auto" w:sz="0"/>
-                <w:insideV w:val="nil" w:color="auto" w:sz="0"/>
-              </w:tblBorders>
-              <w:tblLayout w:type="fixed"/>
-            </w:tblPr>
-            <w:tblGrid>
-              <w:gridCol w:w="428"/>
-              <w:gridCol w:w="1420"/>
-            </w:tblGrid>
-            <w:tr>
-              <w:trPr>
-                <w:trHeight w:val="147" w:hRule="exact"/>
-              </w:trPr>
-              <w:tc>
-                <w:tcPr>
-                  <w:tcW w:type="dxa" w:w="428"/>
-                  <w:tcBorders>
-                    <w:top w:val="nil" w:color="auto" w:sz="0"/>
-                    <w:left w:val="nil" w:color="auto" w:sz="0"/>
-                    <w:bottom w:val="nil" w:color="auto" w:sz="0"/>
-                    <w:right w:val="nil" w:color="auto" w:sz="0"/>
-                  </w:tcBorders>
-                  <w:shd w:fill="A3843F" w:color="auto" w:val="clear"/>
-                  <w:tcMar>
-                    <w:top w:type="dxa" w:w="0"/>
-                    <w:left w:type="dxa" w:w="0"/>
-                    <w:bottom w:type="dxa" w:w="0"/>
-                    <w:right w:type="dxa" w:w="0"/>
-                  </w:tcMar>
-                  <w:vAlign w:val="top"/>
-                </w:tcPr>
-                <w:p>
-                  <w:pPr>
-                    <w:keepLines/>
-                    <w:spacing w:after="0" w:before="0" w:line="20" w:lineRule="exact"/>
-                  </w:pPr>
-                  <w:r>
-                    <w:rPr>
-                      <w:rFonts w:ascii="Inter" w:cs="Inter" w:eastAsia="Inter" w:hAnsi="Inter"/>
-                      <w:color w:val="1C1A16"/>
-                      <w:kern w:val="2"/>
-                      <w:sz w:val="4"/>
-                      <w:szCs w:val="4"/>
-                    </w:rPr>
-                    <w:t xml:space="preserve"/>
-                  </w:r>
-                </w:p>
-              </w:tc>
-              <w:tc>
-                <w:tcPr>
-                  <w:tcW w:type="dxa" w:w="1420"/>
-                  <w:tcBorders>
-                    <w:top w:val="nil" w:color="auto" w:sz="0"/>
-                    <w:left w:val="nil" w:color="auto" w:sz="0"/>
-                    <w:bottom w:val="nil" w:color="auto" w:sz="0"/>
-                    <w:right w:val="nil" w:color="auto" w:sz="0"/>
-                  </w:tcBorders>
-                  <w:tcMar>
-                    <w:top w:type="dxa" w:w="0"/>
-                    <w:left w:type="dxa" w:w="0"/>
-                    <w:bottom w:type="dxa" w:w="0"/>
-                    <w:right w:type="dxa" w:w="0"/>
-                  </w:tcMar>
-                  <w:vAlign w:val="top"/>
-                </w:tcPr>
-                <w:p>
-                  <w:pPr>
-                    <w:keepLines/>
-                    <w:spacing w:after="0" w:before="0" w:line="20" w:lineRule="exact"/>
-                  </w:pPr>
-                  <w:r>
-                    <w:rPr>
-                      <w:rFonts w:ascii="Inter" w:cs="Inter" w:eastAsia="Inter" w:hAnsi="Inter"/>
-                      <w:color w:val="1C1A16"/>
-                      <w:kern w:val="2"/>
-                      <w:sz w:val="4"/>
-                      <w:szCs w:val="4"/>
-                    </w:rPr>
-                    <w:t xml:space="preserve"/>
-                  </w:r>
-                </w:p>
-              </w:tc>
-            </w:tr>
-          </w:tbl>
-          <w:p>
-            <w:pPr>
-              <w:keepLines/>
-              <w:spacing w:after="0" w:before="0" w:line="20" w:lineRule="exact"/>
-            </w:pPr>
-            <w:r>
-              <w:rPr>
-                <w:rFonts w:ascii="Inter" w:cs="Inter" w:eastAsia="Inter" w:hAnsi="Inter"/>
-                <w:color w:val="1C1A16"/>
-                <w:kern w:val="2"/>
-                <w:sz w:val="4"/>
-                <w:szCs w:val="4"/>
-              </w:rPr>
-              <w:t xml:space="preserve"/>
-            </w:r>
-          </w:p>
-        </w:tc>
-        <w:tc>
-          <w:tcPr>
-            <w:tcW w:type="dxa" w:w="1020"/>
-            <w:tcBorders>
-              <w:top w:val="nil" w:color="auto" w:sz="0"/>
-              <w:left w:val="nil" w:color="auto" w:sz="0"/>
-              <w:bottom w:val="single" w:color="E2DBCD" w:sz="4"/>
-              <w:right w:val="nil" w:color="auto" w:sz="0"/>
-            </w:tcBorders>
-            <w:tcMar>
-              <w:top w:type="dxa" w:w="99"/>
-              <w:left w:type="dxa" w:w="57"/>
               <w:bottom w:type="dxa" w:w="99"/>
               <w:right w:type="dxa" w:w="136"/>
             </w:tcMar>
@@ -5098,7 +4403,7 @@
         </w:tc>
         <w:tc>
           <w:tcPr>
-            <w:tcW w:type="dxa" w:w="1644"/>
+            <w:tcW w:type="dxa" w:w="1701"/>
             <w:tcBorders>
               <w:top w:val="nil" w:color="auto" w:sz="0"/>
               <w:left w:val="nil" w:color="auto" w:sz="0"/>
@@ -5138,7 +4443,7 @@
         </w:trPr>
         <w:tc>
           <w:tcPr>
-            <w:tcW w:type="dxa" w:w="3686"/>
+            <w:tcW w:type="dxa" w:w="4763"/>
             <w:tcBorders>
               <w:top w:val="nil" w:color="auto" w:sz="0"/>
               <w:left w:val="nil" w:color="auto" w:sz="0"/>
@@ -5172,7 +4477,7 @@
         </w:tc>
         <w:tc>
           <w:tcPr>
-            <w:tcW w:type="dxa" w:w="1247"/>
+            <w:tcW w:type="dxa" w:w="1587"/>
             <w:tcBorders>
               <w:top w:val="nil" w:color="auto" w:sz="0"/>
               <w:left w:val="nil" w:color="auto" w:sz="0"/>
@@ -5197,8 +4502,8 @@
                 <w:rFonts w:ascii="Inter" w:cs="Inter" w:eastAsia="Inter" w:hAnsi="Inter"/>
                 <w:color w:val="625B50"/>
                 <w:kern w:val="2"/>
-                <w:sz w:val="16"/>
-                <w:szCs w:val="16"/>
+                <w:sz w:val="17"/>
+                <w:szCs w:val="17"/>
               </w:rPr>
               <w:t xml:space="preserve">1, 26</w:t>
             </w:r>
@@ -5206,7 +4511,7 @@
         </w:tc>
         <w:tc>
           <w:tcPr>
-            <w:tcW w:type="dxa" w:w="2041"/>
+            <w:tcW w:type="dxa" w:w="1587"/>
             <w:tcBorders>
               <w:top w:val="nil" w:color="auto" w:sz="0"/>
               <w:left w:val="nil" w:color="auto" w:sz="0"/>
@@ -5216,132 +4521,6 @@
             <w:tcMar>
               <w:top w:type="dxa" w:w="99"/>
               <w:left w:type="dxa" w:w="136"/>
-              <w:bottom w:type="dxa" w:w="99"/>
-              <w:right w:type="dxa" w:w="57"/>
-            </w:tcMar>
-            <w:vAlign w:val="center"/>
-          </w:tcPr>
-          <w:tbl>
-            <w:tblPr>
-              <w:tblW w:type="dxa" w:w="1848"/>
-              <w:tblBorders>
-                <w:top w:val="nil" w:color="auto" w:sz="0"/>
-                <w:left w:val="nil" w:color="auto" w:sz="0"/>
-                <w:bottom w:val="nil" w:color="auto" w:sz="0"/>
-                <w:right w:val="nil" w:color="auto" w:sz="0"/>
-                <w:insideH w:val="nil" w:color="auto" w:sz="0"/>
-                <w:insideV w:val="nil" w:color="auto" w:sz="0"/>
-              </w:tblBorders>
-              <w:tblLayout w:type="fixed"/>
-            </w:tblPr>
-            <w:tblGrid>
-              <w:gridCol w:w="160"/>
-              <w:gridCol w:w="1688"/>
-            </w:tblGrid>
-            <w:tr>
-              <w:trPr>
-                <w:trHeight w:val="147" w:hRule="exact"/>
-              </w:trPr>
-              <w:tc>
-                <w:tcPr>
-                  <w:tcW w:type="dxa" w:w="160"/>
-                  <w:tcBorders>
-                    <w:top w:val="nil" w:color="auto" w:sz="0"/>
-                    <w:left w:val="nil" w:color="auto" w:sz="0"/>
-                    <w:bottom w:val="nil" w:color="auto" w:sz="0"/>
-                    <w:right w:val="nil" w:color="auto" w:sz="0"/>
-                  </w:tcBorders>
-                  <w:shd w:fill="A3843F" w:color="auto" w:val="clear"/>
-                  <w:tcMar>
-                    <w:top w:type="dxa" w:w="0"/>
-                    <w:left w:type="dxa" w:w="0"/>
-                    <w:bottom w:type="dxa" w:w="0"/>
-                    <w:right w:type="dxa" w:w="0"/>
-                  </w:tcMar>
-                  <w:vAlign w:val="top"/>
-                </w:tcPr>
-                <w:p>
-                  <w:pPr>
-                    <w:keepLines/>
-                    <w:spacing w:after="0" w:before="0" w:line="20" w:lineRule="exact"/>
-                  </w:pPr>
-                  <w:r>
-                    <w:rPr>
-                      <w:rFonts w:ascii="Inter" w:cs="Inter" w:eastAsia="Inter" w:hAnsi="Inter"/>
-                      <w:color w:val="1C1A16"/>
-                      <w:kern w:val="2"/>
-                      <w:sz w:val="4"/>
-                      <w:szCs w:val="4"/>
-                    </w:rPr>
-                    <w:t xml:space="preserve"/>
-                  </w:r>
-                </w:p>
-              </w:tc>
-              <w:tc>
-                <w:tcPr>
-                  <w:tcW w:type="dxa" w:w="1688"/>
-                  <w:tcBorders>
-                    <w:top w:val="nil" w:color="auto" w:sz="0"/>
-                    <w:left w:val="nil" w:color="auto" w:sz="0"/>
-                    <w:bottom w:val="nil" w:color="auto" w:sz="0"/>
-                    <w:right w:val="nil" w:color="auto" w:sz="0"/>
-                  </w:tcBorders>
-                  <w:tcMar>
-                    <w:top w:type="dxa" w:w="0"/>
-                    <w:left w:type="dxa" w:w="0"/>
-                    <w:bottom w:type="dxa" w:w="0"/>
-                    <w:right w:type="dxa" w:w="0"/>
-                  </w:tcMar>
-                  <w:vAlign w:val="top"/>
-                </w:tcPr>
-                <w:p>
-                  <w:pPr>
-                    <w:keepLines/>
-                    <w:spacing w:after="0" w:before="0" w:line="20" w:lineRule="exact"/>
-                  </w:pPr>
-                  <w:r>
-                    <w:rPr>
-                      <w:rFonts w:ascii="Inter" w:cs="Inter" w:eastAsia="Inter" w:hAnsi="Inter"/>
-                      <w:color w:val="1C1A16"/>
-                      <w:kern w:val="2"/>
-                      <w:sz w:val="4"/>
-                      <w:szCs w:val="4"/>
-                    </w:rPr>
-                    <w:t xml:space="preserve"/>
-                  </w:r>
-                </w:p>
-              </w:tc>
-            </w:tr>
-          </w:tbl>
-          <w:p>
-            <w:pPr>
-              <w:keepLines/>
-              <w:spacing w:after="0" w:before="0" w:line="20" w:lineRule="exact"/>
-            </w:pPr>
-            <w:r>
-              <w:rPr>
-                <w:rFonts w:ascii="Inter" w:cs="Inter" w:eastAsia="Inter" w:hAnsi="Inter"/>
-                <w:color w:val="1C1A16"/>
-                <w:kern w:val="2"/>
-                <w:sz w:val="4"/>
-                <w:szCs w:val="4"/>
-              </w:rPr>
-              <w:t xml:space="preserve"/>
-            </w:r>
-          </w:p>
-        </w:tc>
-        <w:tc>
-          <w:tcPr>
-            <w:tcW w:type="dxa" w:w="1020"/>
-            <w:tcBorders>
-              <w:top w:val="nil" w:color="auto" w:sz="0"/>
-              <w:left w:val="nil" w:color="auto" w:sz="0"/>
-              <w:bottom w:val="single" w:color="E2DBCD" w:sz="4"/>
-              <w:right w:val="nil" w:color="auto" w:sz="0"/>
-            </w:tcBorders>
-            <w:tcMar>
-              <w:top w:type="dxa" w:w="99"/>
-              <w:left w:type="dxa" w:w="57"/>
               <w:bottom w:type="dxa" w:w="99"/>
               <w:right w:type="dxa" w:w="136"/>
             </w:tcMar>
@@ -5367,7 +4546,7 @@
         </w:tc>
         <w:tc>
           <w:tcPr>
-            <w:tcW w:type="dxa" w:w="1644"/>
+            <w:tcW w:type="dxa" w:w="1701"/>
             <w:tcBorders>
               <w:top w:val="nil" w:color="auto" w:sz="0"/>
               <w:left w:val="nil" w:color="auto" w:sz="0"/>
@@ -5407,7 +4586,7 @@
         </w:trPr>
         <w:tc>
           <w:tcPr>
-            <w:tcW w:type="dxa" w:w="3686"/>
+            <w:tcW w:type="dxa" w:w="4763"/>
             <w:tcBorders>
               <w:top w:val="single" w:color="BA9A58" w:sz="10"/>
               <w:left w:val="nil" w:color="auto" w:sz="0"/>
@@ -5443,7 +4622,7 @@
         </w:tc>
         <w:tc>
           <w:tcPr>
-            <w:tcW w:type="dxa" w:w="1247"/>
+            <w:tcW w:type="dxa" w:w="1587"/>
             <w:tcBorders>
               <w:top w:val="single" w:color="BA9A58" w:sz="10"/>
               <w:left w:val="nil" w:color="auto" w:sz="0"/>
@@ -5477,7 +4656,7 @@
         </w:tc>
         <w:tc>
           <w:tcPr>
-            <w:tcW w:type="dxa" w:w="2041"/>
+            <w:tcW w:type="dxa" w:w="1587"/>
             <w:tcBorders>
               <w:top w:val="single" w:color="BA9A58" w:sz="10"/>
               <w:left w:val="nil" w:color="auto" w:sz="0"/>
@@ -5496,59 +4675,25 @@
             <w:pPr>
               <w:keepLines/>
               <w:spacing w:after="0" w:before="0" w:line="252" w:lineRule="atLeast"/>
-            </w:pPr>
-            <w:r>
-              <w:rPr>
-                <w:rFonts w:ascii="Inter" w:cs="Inter" w:eastAsia="Inter" w:hAnsi="Inter"/>
+              <w:jc w:val="right"/>
+            </w:pPr>
+            <w:r>
+              <w:rPr>
+                <w:rFonts w:ascii="Inter" w:cs="Inter" w:eastAsia="Inter" w:hAnsi="Inter"/>
+                <w:b/>
+                <w:bCs/>
                 <w:color w:val="1C1A16"/>
                 <w:kern w:val="2"/>
                 <w:sz w:val="18"/>
                 <w:szCs w:val="18"/>
               </w:rPr>
-              <w:t xml:space="preserve"/>
-            </w:r>
-          </w:p>
-        </w:tc>
-        <w:tc>
-          <w:tcPr>
-            <w:tcW w:type="dxa" w:w="1020"/>
-            <w:tcBorders>
-              <w:top w:val="single" w:color="BA9A58" w:sz="10"/>
-              <w:left w:val="nil" w:color="auto" w:sz="0"/>
-              <w:bottom w:val="nil" w:color="auto" w:sz="0"/>
-              <w:right w:val="nil" w:color="auto" w:sz="0"/>
-            </w:tcBorders>
-            <w:tcMar>
-              <w:top w:type="dxa" w:w="147"/>
-              <w:left w:type="dxa" w:w="136"/>
-              <w:bottom w:type="dxa" w:w="99"/>
-              <w:right w:type="dxa" w:w="136"/>
-            </w:tcMar>
-            <w:vAlign w:val="top"/>
-          </w:tcPr>
-          <w:p>
-            <w:pPr>
-              <w:keepLines/>
-              <w:spacing w:after="0" w:before="0" w:line="252" w:lineRule="atLeast"/>
-              <w:jc w:val="right"/>
-            </w:pPr>
-            <w:r>
-              <w:rPr>
-                <w:rFonts w:ascii="Inter" w:cs="Inter" w:eastAsia="Inter" w:hAnsi="Inter"/>
-                <w:b/>
-                <w:bCs/>
-                <w:color w:val="1C1A16"/>
-                <w:kern w:val="2"/>
-                <w:sz w:val="18"/>
-                <w:szCs w:val="18"/>
-              </w:rPr>
               <w:t xml:space="preserve">100 %</w:t>
             </w:r>
           </w:p>
         </w:tc>
         <w:tc>
           <w:tcPr>
-            <w:tcW w:type="dxa" w:w="1644"/>
+            <w:tcW w:type="dxa" w:w="1701"/>
             <w:tcBorders>
               <w:top w:val="single" w:color="BA9A58" w:sz="10"/>
               <w:left w:val="nil" w:color="auto" w:sz="0"/>
@@ -5587,8 +4732,48 @@
     </w:tbl>
     <w:p>
       <w:pPr>
+        <w:keepNext/>
         <w:keepLines/>
-        <w:spacing w:after="0" w:before="340" w:line="20" w:lineRule="exact"/>
+        <w:spacing w:after="85" w:before="397" w:line="207" w:lineRule="atLeast"/>
+      </w:pPr>
+      <w:r>
+        <w:rPr>
+          <w:rFonts w:ascii="Inter SemiBold" w:cs="Inter SemiBold" w:eastAsia="Inter SemiBold" w:hAnsi="Inter SemiBold"/>
+          <w:caps/>
+          <w:color w:val="85692F"/>
+          <w:spacing w:val="18"/>
+          <w:kern w:val="2"/>
+          <w:sz w:val="15"/>
+          <w:szCs w:val="15"/>
+        </w:rPr>
+        <w:t xml:space="preserve">Peso de cada capítulo sobre el total</w:t>
+      </w:r>
+    </w:p>
+    <w:p>
+      <w:pPr>
+        <w:keepLines/>
+        <w:spacing w:after="0" w:before="0" w:line="240" w:lineRule="atLeast"/>
+      </w:pPr>
+      <w:r>
+        <w:drawing>
+          <wp:inline distT="0" distB="0" distL="0" distR="0">
+            <wp:extent cx="6120000" cy="2304000"/>
+            <wp:effectExtent l="0" t="0" r="0" b="0"/>
+            <wp:docPr id="9001" name="Gráfico de capítulos" descr="Peso de cada capítulo sobre el total del proyecto base"/>
+            <wp:cNvGraphicFramePr/>
+            <a:graphic xmlns:a="http://schemas.openxmlformats.org/drawingml/2006/main">
+              <a:graphicData uri="http://schemas.openxmlformats.org/drawingml/2006/chart">
+                <c:chart xmlns:c="http://schemas.openxmlformats.org/drawingml/2006/chart" xmlns:r="http://schemas.openxmlformats.org/officeDocument/2006/relationships" r:id="rIdGrafico1"/>
+              </a:graphicData>
+            </a:graphic>
+          </wp:inline>
+        </w:drawing>
+      </w:r>
+    </w:p>
+    <w:p>
+      <w:pPr>
+        <w:keepLines/>
+        <w:spacing w:after="0" w:before="397" w:line="20" w:lineRule="exact"/>
       </w:pPr>
       <w:r>
         <w:rPr>
@@ -6074,7 +5259,7 @@
         <w:keepNext/>
         <w:keepLines/>
         <w:pageBreakBefore/>
-        <w:spacing w:after="91" w:before="0" w:line="280" w:lineRule="atLeast"/>
+        <w:spacing w:after="125" w:before="0" w:line="280" w:lineRule="atLeast"/>
       </w:pPr>
       <w:r>
         <w:rPr>
@@ -6100,7 +5285,7 @@
     <w:p>
       <w:pPr>
         <w:keepLines/>
-        <w:spacing w:after="147" w:before="0" w:line="288" w:lineRule="atLeast"/>
+        <w:spacing w:after="181" w:before="0" w:line="288" w:lineRule="atLeast"/>
       </w:pPr>
       <w:r>
         <w:rPr>
@@ -11479,7 +10664,7 @@
       <w:pPr>
         <w:keepNext/>
         <w:keepLines/>
-        <w:spacing w:after="283" w:before="0" w:line="506" w:lineRule="atLeast"/>
+        <w:spacing w:after="340" w:before="57" w:line="506" w:lineRule="atLeast"/>
       </w:pPr>
       <w:r>
         <w:rPr>
@@ -11495,7 +10680,7 @@
     <w:p>
       <w:pPr>
         <w:keepLines/>
-        <w:spacing w:after="147" w:before="0" w:line="288" w:lineRule="atLeast"/>
+        <w:spacing w:after="181" w:before="0" w:line="288" w:lineRule="atLeast"/>
       </w:pPr>
       <w:r>
         <w:rPr>
@@ -17577,7 +16762,7 @@
       <w:pPr>
         <w:keepNext/>
         <w:keepLines/>
-        <w:spacing w:after="91" w:before="454" w:line="280" w:lineRule="atLeast"/>
+        <w:spacing w:after="125" w:before="454" w:line="280" w:lineRule="atLeast"/>
       </w:pPr>
       <w:r>
         <w:rPr>
@@ -17603,7 +16788,7 @@
     <w:p>
       <w:pPr>
         <w:keepLines/>
-        <w:spacing w:after="147" w:before="0" w:line="288" w:lineRule="atLeast"/>
+        <w:spacing w:after="181" w:before="0" w:line="288" w:lineRule="atLeast"/>
       </w:pPr>
       <w:r>
         <w:rPr>
@@ -19210,7 +18395,7 @@
     <w:p>
       <w:pPr>
         <w:keepLines/>
-        <w:spacing w:after="147" w:before="227" w:line="288" w:lineRule="atLeast"/>
+        <w:spacing w:after="181" w:before="340" w:line="288" w:lineRule="atLeast"/>
       </w:pPr>
       <w:r>
         <w:rPr>
@@ -19266,7 +18451,7 @@
       <w:pPr>
         <w:keepNext/>
         <w:keepLines/>
-        <w:spacing w:after="283" w:before="0" w:line="506" w:lineRule="atLeast"/>
+        <w:spacing w:after="340" w:before="57" w:line="506" w:lineRule="atLeast"/>
       </w:pPr>
       <w:r>
         <w:rPr>
@@ -19283,7 +18468,7 @@
       <w:pPr>
         <w:keepNext/>
         <w:keepLines/>
-        <w:spacing w:after="91" w:before="0" w:line="280" w:lineRule="atLeast"/>
+        <w:spacing w:after="125" w:before="0" w:line="280" w:lineRule="atLeast"/>
       </w:pPr>
       <w:r>
         <w:rPr>
@@ -19326,7 +18511,7 @@
       <w:pPr>
         <w:keepNext/>
         <w:keepLines/>
-        <w:spacing w:after="91" w:before="238" w:line="280" w:lineRule="atLeast"/>
+        <w:spacing w:after="125" w:before="238" w:line="280" w:lineRule="atLeast"/>
       </w:pPr>
       <w:r>
         <w:rPr>
@@ -19369,7 +18554,7 @@
       <w:pPr>
         <w:keepNext/>
         <w:keepLines/>
-        <w:spacing w:after="91" w:before="238" w:line="280" w:lineRule="atLeast"/>
+        <w:spacing w:after="125" w:before="238" w:line="280" w:lineRule="atLeast"/>
       </w:pPr>
       <w:r>
         <w:rPr>
@@ -19412,7 +18597,7 @@
       <w:pPr>
         <w:keepNext/>
         <w:keepLines/>
-        <w:spacing w:after="91" w:before="238" w:line="280" w:lineRule="atLeast"/>
+        <w:spacing w:after="125" w:before="238" w:line="280" w:lineRule="atLeast"/>
       </w:pPr>
       <w:r>
         <w:rPr>
@@ -19471,7 +18656,7 @@
       <w:pPr>
         <w:keepNext/>
         <w:keepLines/>
-        <w:spacing w:after="91" w:before="238" w:line="280" w:lineRule="atLeast"/>
+        <w:spacing w:after="125" w:before="238" w:line="280" w:lineRule="atLeast"/>
       </w:pPr>
       <w:r>
         <w:rPr>
@@ -19514,7 +18699,7 @@
       <w:pPr>
         <w:keepNext/>
         <w:keepLines/>
-        <w:spacing w:after="91" w:before="238" w:line="280" w:lineRule="atLeast"/>
+        <w:spacing w:after="125" w:before="238" w:line="280" w:lineRule="atLeast"/>
       </w:pPr>
       <w:r>
         <w:rPr>
@@ -19576,7 +18761,7 @@
           <w:sz w:val="18"/>
           <w:szCs w:val="18"/>
         </w:rPr>
-        <w:t xml:space="preserve">624 892 643</w:t>
+        <w:t xml:space="preserve">624 892 643</w:t>
       </w:r>
       <w:r>
         <w:rPr>
@@ -19593,7 +18778,7 @@
       <w:pPr>
         <w:keepNext/>
         <w:keepLines/>
-        <w:spacing w:after="91" w:before="238" w:line="280" w:lineRule="atLeast"/>
+        <w:spacing w:after="125" w:before="238" w:line="280" w:lineRule="atLeast"/>
       </w:pPr>
       <w:r>
         <w:rPr>
@@ -19659,7 +18844,7 @@
       <w:pPr>
         <w:keepNext/>
         <w:keepLines/>
-        <w:spacing w:after="283" w:before="0" w:line="506" w:lineRule="atLeast"/>
+        <w:spacing w:after="340" w:before="57" w:line="506" w:lineRule="atLeast"/>
       </w:pPr>
       <w:r>
         <w:rPr>
@@ -19710,9 +18895,9 @@
               <w:right w:val="nil" w:color="auto" w:sz="0"/>
             </w:tcBorders>
             <w:tcMar>
-              <w:top w:type="dxa" w:w="96"/>
+              <w:top w:type="dxa" w:w="79"/>
               <w:left w:type="dxa" w:w="0"/>
-              <w:bottom w:type="dxa" w:w="96"/>
+              <w:bottom w:type="dxa" w:w="79"/>
               <w:right w:type="dxa" w:w="136"/>
             </w:tcMar>
             <w:vAlign w:val="top"/>
@@ -19744,9 +18929,9 @@
               <w:right w:val="nil" w:color="auto" w:sz="0"/>
             </w:tcBorders>
             <w:tcMar>
-              <w:top w:type="dxa" w:w="96"/>
+              <w:top w:type="dxa" w:w="79"/>
               <w:left w:type="dxa" w:w="0"/>
-              <w:bottom w:type="dxa" w:w="96"/>
+              <w:bottom w:type="dxa" w:w="79"/>
               <w:right w:type="dxa" w:w="136"/>
             </w:tcMar>
             <w:vAlign w:val="top"/>
@@ -19783,9 +18968,9 @@
               <w:right w:val="nil" w:color="auto" w:sz="0"/>
             </w:tcBorders>
             <w:tcMar>
-              <w:top w:type="dxa" w:w="96"/>
+              <w:top w:type="dxa" w:w="79"/>
               <w:left w:type="dxa" w:w="0"/>
-              <w:bottom w:type="dxa" w:w="96"/>
+              <w:bottom w:type="dxa" w:w="79"/>
               <w:right w:type="dxa" w:w="136"/>
             </w:tcMar>
             <w:vAlign w:val="top"/>
@@ -19817,9 +19002,9 @@
               <w:right w:val="nil" w:color="auto" w:sz="0"/>
             </w:tcBorders>
             <w:tcMar>
-              <w:top w:type="dxa" w:w="96"/>
+              <w:top w:type="dxa" w:w="79"/>
               <w:left w:type="dxa" w:w="0"/>
-              <w:bottom w:type="dxa" w:w="96"/>
+              <w:bottom w:type="dxa" w:w="79"/>
               <w:right w:type="dxa" w:w="136"/>
             </w:tcMar>
             <w:vAlign w:val="top"/>
@@ -19856,9 +19041,9 @@
               <w:right w:val="nil" w:color="auto" w:sz="0"/>
             </w:tcBorders>
             <w:tcMar>
-              <w:top w:type="dxa" w:w="96"/>
+              <w:top w:type="dxa" w:w="79"/>
               <w:left w:type="dxa" w:w="0"/>
-              <w:bottom w:type="dxa" w:w="96"/>
+              <w:bottom w:type="dxa" w:w="79"/>
               <w:right w:type="dxa" w:w="136"/>
             </w:tcMar>
             <w:vAlign w:val="top"/>
@@ -19890,9 +19075,9 @@
               <w:right w:val="nil" w:color="auto" w:sz="0"/>
             </w:tcBorders>
             <w:tcMar>
-              <w:top w:type="dxa" w:w="96"/>
+              <w:top w:type="dxa" w:w="79"/>
               <w:left w:type="dxa" w:w="0"/>
-              <w:bottom w:type="dxa" w:w="96"/>
+              <w:bottom w:type="dxa" w:w="79"/>
               <w:right w:type="dxa" w:w="136"/>
             </w:tcMar>
             <w:vAlign w:val="top"/>
@@ -20325,7 +19510,7 @@
     <w:p>
       <w:pPr>
         <w:keepLines/>
-        <w:spacing w:after="0" w:before="170" w:line="20" w:lineRule="exact"/>
+        <w:spacing w:after="0" w:before="283" w:line="20" w:lineRule="exact"/>
       </w:pPr>
       <w:r>
         <w:rPr>
@@ -20931,7 +20116,7 @@
     <w:p>
       <w:pPr>
         <w:keepLines/>
-        <w:spacing w:after="0" w:before="227" w:line="20" w:lineRule="exact"/>
+        <w:spacing w:after="0" w:before="283" w:line="20" w:lineRule="exact"/>
       </w:pPr>
       <w:r>
         <w:rPr>
@@ -20991,7 +20176,7 @@
           </w:tcPr>
           <w:p>
             <w:pPr>
-              <w:keepNext/>
+              <w:keepNext w:val="false"/>
               <w:keepLines/>
               <w:spacing w:after="0" w:before="0" w:line="193" w:lineRule="atLeast"/>
             </w:pPr>
@@ -21047,7 +20232,7 @@
           </w:tcPr>
           <w:p>
             <w:pPr>
-              <w:keepNext/>
+              <w:keepNext w:val="false"/>
               <w:keepLines/>
               <w:spacing w:after="0" w:before="0" w:line="193" w:lineRule="atLeast"/>
             </w:pPr>
@@ -21086,7 +20271,7 @@
     <w:p>
       <w:pPr>
         <w:keepLines/>
-        <w:spacing w:after="147" w:before="283" w:line="288" w:lineRule="atLeast"/>
+        <w:spacing w:after="181" w:before="283" w:line="288" w:lineRule="atLeast"/>
       </w:pPr>
       <w:r>
         <w:rPr>
@@ -21102,7 +20287,7 @@
     <w:p>
       <w:pPr>
         <w:keepLines/>
-        <w:spacing w:after="0" w:before="283" w:line="20" w:lineRule="exact"/>
+        <w:spacing w:after="0" w:before="340" w:line="20" w:lineRule="exact"/>
       </w:pPr>
       <w:r>
         <w:rPr>
@@ -21163,7 +20348,7 @@
           </w:tcPr>
           <w:p>
             <w:pPr>
-              <w:keepNext/>
+              <w:keepNext w:val="false"/>
               <w:keepLines/>
               <w:spacing w:after="0" w:before="0" w:line="213" w:lineRule="atLeast"/>
             </w:pPr>
@@ -21186,7 +20371,7 @@
               <w:pBdr>
                 <w:bottom w:val="single" w:color="1C1A16" w:sz="6"/>
               </w:pBdr>
-              <w:spacing w:after="0" w:before="850" w:line="280" w:lineRule="atLeast"/>
+              <w:spacing w:after="0" w:before="624" w:line="280" w:lineRule="atLeast"/>
             </w:pPr>
             <w:r>
               <w:rPr>
@@ -21285,7 +20470,7 @@
           </w:tcPr>
           <w:p>
             <w:pPr>
-              <w:keepNext/>
+              <w:keepNext w:val="false"/>
               <w:keepLines/>
               <w:spacing w:after="0" w:before="0" w:line="213" w:lineRule="atLeast"/>
             </w:pPr>
@@ -21308,7 +20493,7 @@
               <w:pBdr>
                 <w:bottom w:val="single" w:color="1C1A16" w:sz="6"/>
               </w:pBdr>
-              <w:spacing w:after="0" w:before="850" w:line="280" w:lineRule="atLeast"/>
+              <w:spacing w:after="0" w:before="624" w:line="280" w:lineRule="atLeast"/>
             </w:pPr>
             <w:r>
               <w:rPr>
@@ -21359,7 +20544,7 @@
     <w:p>
       <w:pPr>
         <w:keepLines/>
-        <w:spacing w:after="0" w:before="340" w:line="20" w:lineRule="exact"/>
+        <w:spacing w:after="0" w:before="283" w:line="20" w:lineRule="exact"/>
       </w:pPr>
       <w:r>
         <w:rPr>
@@ -22084,4 +21269,237 @@
     </w:rPr>
   </w:style>
 </w:styles>
+</file>
+
+<file path=word/charts/chart1.xml><?xml version="1.0" encoding="utf-8"?>
+<c:chartSpace xmlns:c="http://schemas.openxmlformats.org/drawingml/2006/chart" xmlns:a="http://schemas.openxmlformats.org/drawingml/2006/main" xmlns:r="http://schemas.openxmlformats.org/officeDocument/2006/relationships">
+  <c:date1904 val="0"/>
+  <c:lang val="es-ES"/>
+  <c:roundedCorners val="0"/>
+  <c:chart>
+    <c:autoTitleDeleted val="1"/>
+    <c:plotArea>
+      <c:layout/>
+      <c:barChart>
+        <c:barDir val="bar"/>
+        <c:grouping val="clustered"/>
+        <c:varyColors val="0"/>
+        <c:ser>
+          <c:idx val="0"/>
+          <c:order val="0"/>
+          <c:tx>
+            <c:strRef>
+              <c:f>Datos!$C$1</c:f>
+              <c:strCache>
+                <c:ptCount val="1"/>
+                <c:pt idx="0">
+                  <c:v>% del total</c:v>
+                </c:pt>
+              </c:strCache>
+            </c:strRef>
+          </c:tx>
+          <c:spPr>
+            <a:solidFill>
+              <a:srgbClr val="A3843F"/>
+            </a:solidFill>
+            <a:ln>
+              <a:noFill/>
+            </a:ln>
+          </c:spPr>
+          <c:invertIfNegative val="0"/>
+          <c:dLbls>
+            <c:numFmt formatCode="0.0%" sourceLinked="0"/>
+            <c:spPr>
+              <a:noFill/>
+              <a:ln>
+                <a:noFill/>
+              </a:ln>
+            </c:spPr>
+            <c:txPr>
+              <a:bodyPr/>
+              <a:lstStyle/>
+              <a:p>
+                <a:pPr>
+                  <a:defRPr sz="800" b="1">
+                    <a:solidFill>
+                      <a:srgbClr val="1C1A16"/>
+                    </a:solidFill>
+                    <a:latin typeface="Inter"/>
+                    <a:cs typeface="Inter"/>
+                  </a:defRPr>
+                </a:pPr>
+                <a:endParaRPr lang="es-ES"/>
+              </a:p>
+            </c:txPr>
+            <c:dLblPos val="outEnd"/>
+            <c:showLegendKey val="0"/>
+            <c:showVal val="1"/>
+            <c:showCatName val="0"/>
+            <c:showSerName val="0"/>
+            <c:showPercent val="0"/>
+            <c:showBubbleSize val="0"/>
+          </c:dLbls>
+          <c:cat>
+            <c:strRef>
+              <c:f>Datos!$A$2:$A$9</c:f>
+              <c:strCache>
+                <c:ptCount val="8"/>
+                <c:pt idx="0">
+                  <c:v>Suelos: nivelación y microcemento</c:v>
+                </c:pt>
+                <c:pt idx="1">
+                  <c:v>Electricidad, fontanería y ayudas</c:v>
+                </c:pt>
+                <c:pt idx="2">
+                  <c:v>Paredes y techos</c:v>
+                </c:pt>
+                <c:pt idx="3">
+                  <c:v>Baño completo</c:v>
+                </c:pt>
+                <c:pt idx="4">
+                  <c:v>Cocina: mobiliario y encimera</c:v>
+                </c:pt>
+                <c:pt idx="5">
+                  <c:v>Puertas y ventanas</c:v>
+                </c:pt>
+                <c:pt idx="6">
+                  <c:v>Climatización</c:v>
+                </c:pt>
+                <c:pt idx="7">
+                  <c:v>Protección, limpieza y residuos</c:v>
+                </c:pt>
+              </c:strCache>
+            </c:strRef>
+          </c:cat>
+          <c:val>
+            <c:numRef>
+              <c:f>Datos!$C$2:$C$9</c:f>
+              <c:numCache>
+                <c:formatCode>0.0%</c:formatCode>
+                <c:ptCount val="8"/>
+                <c:pt idx="0">
+                  <c:v>0.241830</c:v>
+                </c:pt>
+                <c:pt idx="1">
+                  <c:v>0.212364</c:v>
+                </c:pt>
+                <c:pt idx="2">
+                  <c:v>0.169417</c:v>
+                </c:pt>
+                <c:pt idx="3">
+                  <c:v>0.127203</c:v>
+                </c:pt>
+                <c:pt idx="4">
+                  <c:v>0.110313</c:v>
+                </c:pt>
+                <c:pt idx="5">
+                  <c:v>0.062598</c:v>
+                </c:pt>
+                <c:pt idx="6">
+                  <c:v>0.055588</c:v>
+                </c:pt>
+                <c:pt idx="7">
+                  <c:v>0.020686</c:v>
+                </c:pt>
+              </c:numCache>
+            </c:numRef>
+          </c:val>
+        </c:ser>
+        <c:gapWidth val="80"/>
+        <c:axId val="501"/>
+        <c:axId val="502"/>
+      </c:barChart>
+      <c:catAx>
+        <c:axId val="501"/>
+        <c:scaling>
+          <c:orientation val="maxMin"/>
+        </c:scaling>
+        <c:delete val="0"/>
+        <c:axPos val="l"/>
+        <c:numFmt formatCode="General" sourceLinked="1"/>
+        <c:majorTickMark val="none"/>
+        <c:minorTickMark val="none"/>
+        <c:tickLblPos val="nextTo"/>
+        <c:spPr>
+          <a:ln w="6350">
+            <a:solidFill>
+              <a:srgbClr val="E2DBCD"/>
+            </a:solidFill>
+          </a:ln>
+        </c:spPr>
+        <c:txPr>
+          <a:bodyPr/>
+          <a:lstStyle/>
+          <a:p>
+            <a:pPr>
+              <a:defRPr sz="800">
+                <a:solidFill>
+                  <a:srgbClr val="625B50"/>
+                </a:solidFill>
+                <a:latin typeface="Inter"/>
+                <a:cs typeface="Inter"/>
+              </a:defRPr>
+            </a:pPr>
+            <a:endParaRPr lang="es-ES"/>
+          </a:p>
+        </c:txPr>
+        <c:crossAx val="502"/>
+        <c:crosses val="autoZero"/>
+        <c:auto val="1"/>
+        <c:lblAlgn val="ctr"/>
+        <c:lblOffset val="100"/>
+        <c:noMultiLvlLbl val="0"/>
+      </c:catAx>
+      <c:valAx>
+        <c:axId val="502"/>
+        <c:scaling>
+          <c:orientation val="minMax"/>
+          <c:min val="0"/>
+        </c:scaling>
+        <c:delete val="1"/>
+        <c:axPos val="t"/>
+        <c:numFmt formatCode="0%" sourceLinked="0"/>
+        <c:majorTickMark val="none"/>
+        <c:minorTickMark val="none"/>
+        <c:tickLblPos val="nextTo"/>
+        <c:crossAx val="501"/>
+        <c:crosses val="autoZero"/>
+        <c:crossBetween val="between"/>
+      </c:valAx>
+      <c:spPr>
+        <a:noFill/>
+        <a:ln>
+          <a:noFill/>
+        </a:ln>
+      </c:spPr>
+    </c:plotArea>
+    <c:plotVisOnly val="1"/>
+    <c:dispBlanksAs val="gap"/>
+  </c:chart>
+  <c:spPr>
+    <a:noFill/>
+    <a:ln>
+      <a:noFill/>
+    </a:ln>
+  </c:spPr>
+  <c:txPr>
+    <a:bodyPr/>
+    <a:lstStyle/>
+    <a:p>
+      <a:pPr>
+        <a:defRPr sz="800">
+          <a:solidFill>
+            <a:srgbClr val="625B50"/>
+          </a:solidFill>
+          <a:latin typeface="Inter"/>
+          <a:cs typeface="Inter"/>
+        </a:defRPr>
+      </a:pPr>
+      <a:endParaRPr lang="es-ES"/>
+    </a:p>
+  </c:txPr>
+  <c:externalData r:id="rId1">
+    <c:autoUpdate val="0"/>
+  </c:externalData>
+</c:chartSpace>
 </file>
</xml_diff>

<commit_message>
Presupuesto Nohalez: más aire entre páginas, saltos controlados y redacción más profesional
Co-Authored-By: Claude Opus 5.5 <noreply@anthropic.com>
Claude-Session: https://claude.ai/code/session_01FcFWpQUzG6fc2uAuLecbPp
</commit_message>
<xml_diff>
--- a/entregas/renovare/presupuesto-nohalez/PRESUPUESTO NOHALEZ - SV-0045-03.docx
+++ b/entregas/renovare/presupuesto-nohalez/PRESUPUESTO NOHALEZ - SV-0045-03.docx
@@ -203,7 +203,7 @@
       <w:pPr>
         <w:keepNext/>
         <w:keepLines/>
-        <w:spacing w:after="142" w:before="397" w:line="218" w:lineRule="atLeast"/>
+        <w:spacing w:after="142" w:before="312" w:line="218" w:lineRule="atLeast"/>
       </w:pPr>
       <w:r>
         <w:rPr>
@@ -237,7 +237,7 @@
     <w:p>
       <w:pPr>
         <w:keepLines/>
-        <w:spacing w:after="283" w:before="0" w:line="340" w:lineRule="atLeast"/>
+        <w:spacing w:after="255" w:before="0" w:line="340" w:lineRule="atLeast"/>
       </w:pPr>
       <w:r>
         <w:rPr>
@@ -559,7 +559,7 @@
       <w:pPr>
         <w:keepNext/>
         <w:keepLines/>
-        <w:spacing w:after="142" w:before="340" w:line="368" w:lineRule="atLeast"/>
+        <w:spacing w:after="142" w:before="283" w:line="368" w:lineRule="atLeast"/>
       </w:pPr>
       <w:r>
         <w:rPr>
@@ -569,13 +569,13 @@
           <w:sz w:val="32"/>
           <w:szCs w:val="32"/>
         </w:rPr>
-        <w:t xml:space="preserve">Su proyecto en una página</w:t>
+        <w:t xml:space="preserve">Resumen de la propuesta</w:t>
       </w:r>
     </w:p>
     <w:p>
       <w:pPr>
         <w:keepLines/>
-        <w:spacing w:after="283" w:before="0" w:line="282" w:lineRule="atLeast"/>
+        <w:spacing w:after="227" w:before="0" w:line="282" w:lineRule="atLeast"/>
       </w:pPr>
       <w:r>
         <w:rPr>
@@ -952,7 +952,7 @@
     <w:p>
       <w:pPr>
         <w:keepLines/>
-        <w:spacing w:after="0" w:before="340" w:line="20" w:lineRule="exact"/>
+        <w:spacing w:after="0" w:before="283" w:line="20" w:lineRule="exact"/>
       </w:pPr>
       <w:r>
         <w:rPr>
@@ -1901,7 +1901,7 @@
                 <w:sz w:val="15"/>
                 <w:szCs w:val="15"/>
               </w:rPr>
-              <w:t xml:space="preserve">Siguiente paso</w:t>
+              <w:t xml:space="preserve">Próximos pasos</w:t>
             </w:r>
           </w:p>
           <w:p>
@@ -1917,7 +1917,7 @@
                 <w:sz w:val="19"/>
                 <w:szCs w:val="19"/>
               </w:rPr>
-              <w:t xml:space="preserve">Para avanzar, revisamos juntos el alcance, resolvemos las dudas y confirmamos las opciones elegidas antes de formalizar la aceptación. Sebastián Vanegas le llamará para acordar esa revisión; también puede contactarle directamente en el 624 892 643 o en renovaredyb@gmail.com. Oferta válida hasta el 07/11/2026.</w:t>
+              <w:t xml:space="preserve">Revisaremos con usted el alcance, resolveremos las dudas y confirmaremos las opciones elegidas antes de formalizar la aceptación. Persona de contacto: Sebastián Vanegas · 624 892 643 · renovaredyb@gmail.com. Validez de la oferta: hasta el 07/11/2026.</w:t>
             </w:r>
           </w:p>
         </w:tc>
@@ -1943,7 +1943,7 @@
         <w:pBdr>
           <w:bottom w:val="single" w:color="BA9A58" w:sz="5" w:space="6"/>
         </w:pBdr>
-        <w:spacing w:after="227" w:before="0" w:line="220" w:lineRule="atLeast"/>
+        <w:spacing w:after="227" w:before="227" w:line="220" w:lineRule="atLeast"/>
       </w:pPr>
       <w:r>
         <w:rPr>
@@ -1962,7 +1962,7 @@
       <w:pPr>
         <w:keepNext/>
         <w:keepLines/>
-        <w:spacing w:after="255" w:before="57" w:line="506" w:lineRule="atLeast"/>
+        <w:spacing w:after="340" w:before="57" w:line="506" w:lineRule="atLeast"/>
       </w:pPr>
       <w:r>
         <w:rPr>
@@ -2005,7 +2005,7 @@
     <w:p>
       <w:pPr>
         <w:keepLines/>
-        <w:spacing w:after="136" w:before="0" w:line="288" w:lineRule="atLeast"/>
+        <w:spacing w:after="170" w:before="0" w:line="288" w:lineRule="atLeast"/>
       </w:pPr>
       <w:r>
         <w:rPr>
@@ -2021,7 +2021,7 @@
     <w:p>
       <w:pPr>
         <w:keepLines/>
-        <w:spacing w:after="0" w:before="28" w:line="20" w:lineRule="exact"/>
+        <w:spacing w:after="0" w:before="227" w:line="20" w:lineRule="exact"/>
       </w:pPr>
       <w:r>
         <w:rPr>
@@ -2247,7 +2247,7 @@
       <w:pPr>
         <w:keepNext/>
         <w:keepLines/>
-        <w:spacing w:after="125" w:before="283" w:line="280" w:lineRule="atLeast"/>
+        <w:spacing w:after="125" w:before="397" w:line="280" w:lineRule="atLeast"/>
       </w:pPr>
       <w:r>
         <w:rPr>
@@ -2273,7 +2273,7 @@
     <w:p>
       <w:pPr>
         <w:keepLines/>
-        <w:spacing w:after="136" w:before="0" w:line="288" w:lineRule="atLeast"/>
+        <w:spacing w:after="170" w:before="0" w:line="288" w:lineRule="atLeast"/>
       </w:pPr>
       <w:r>
         <w:rPr>
@@ -2290,7 +2290,8 @@
       <w:pPr>
         <w:keepNext/>
         <w:keepLines/>
-        <w:spacing w:after="125" w:before="283" w:line="280" w:lineRule="atLeast"/>
+        <w:pageBreakBefore/>
+        <w:spacing w:after="125" w:before="227" w:line="280" w:lineRule="atLeast"/>
       </w:pPr>
       <w:r>
         <w:rPr>
@@ -2316,7 +2317,7 @@
     <w:p>
       <w:pPr>
         <w:keepLines/>
-        <w:spacing w:after="136" w:before="0" w:line="288" w:lineRule="atLeast"/>
+        <w:spacing w:after="170" w:before="0" w:line="288" w:lineRule="atLeast"/>
       </w:pPr>
       <w:r>
         <w:rPr>
@@ -2332,7 +2333,7 @@
     <w:p>
       <w:pPr>
         <w:keepLines/>
-        <w:spacing w:after="136" w:before="0" w:line="288" w:lineRule="atLeast"/>
+        <w:spacing w:after="170" w:before="0" w:line="288" w:lineRule="atLeast"/>
       </w:pPr>
       <w:r>
         <w:rPr>
@@ -2348,7 +2349,7 @@
     <w:p>
       <w:pPr>
         <w:keepLines/>
-        <w:spacing w:after="0" w:before="170" w:line="20" w:lineRule="exact"/>
+        <w:spacing w:after="0" w:before="227" w:line="20" w:lineRule="exact"/>
       </w:pPr>
       <w:r>
         <w:rPr>
@@ -2873,7 +2874,7 @@
       <w:pPr>
         <w:keepNext/>
         <w:keepLines/>
-        <w:spacing w:after="125" w:before="283" w:line="280" w:lineRule="atLeast"/>
+        <w:spacing w:after="125" w:before="397" w:line="280" w:lineRule="atLeast"/>
       </w:pPr>
       <w:r>
         <w:rPr>
@@ -2935,9 +2936,9 @@
               <w:right w:val="nil" w:color="auto" w:sz="0"/>
             </w:tcBorders>
             <w:tcMar>
-              <w:top w:type="dxa" w:w="68"/>
+              <w:top w:type="dxa" w:w="102"/>
               <w:left w:type="dxa" w:w="0"/>
-              <w:bottom w:type="dxa" w:w="68"/>
+              <w:bottom w:type="dxa" w:w="102"/>
               <w:right w:type="dxa" w:w="113"/>
             </w:tcMar>
             <w:vAlign w:val="top"/>
@@ -2989,9 +2990,9 @@
               <w:right w:val="nil" w:color="auto" w:sz="0"/>
             </w:tcBorders>
             <w:tcMar>
-              <w:top w:type="dxa" w:w="68"/>
+              <w:top w:type="dxa" w:w="102"/>
               <w:left w:type="dxa" w:w="0"/>
-              <w:bottom w:type="dxa" w:w="68"/>
+              <w:bottom w:type="dxa" w:w="102"/>
               <w:right w:type="dxa" w:w="113"/>
             </w:tcMar>
             <w:vAlign w:val="top"/>
@@ -3047,9 +3048,9 @@
               <w:right w:val="nil" w:color="auto" w:sz="0"/>
             </w:tcBorders>
             <w:tcMar>
-              <w:top w:type="dxa" w:w="68"/>
+              <w:top w:type="dxa" w:w="102"/>
               <w:left w:type="dxa" w:w="0"/>
-              <w:bottom w:type="dxa" w:w="68"/>
+              <w:bottom w:type="dxa" w:w="102"/>
               <w:right w:type="dxa" w:w="113"/>
             </w:tcMar>
             <w:vAlign w:val="top"/>
@@ -3100,9 +3101,9 @@
               <w:right w:val="nil" w:color="auto" w:sz="0"/>
             </w:tcBorders>
             <w:tcMar>
-              <w:top w:type="dxa" w:w="68"/>
+              <w:top w:type="dxa" w:w="102"/>
               <w:left w:type="dxa" w:w="0"/>
-              <w:bottom w:type="dxa" w:w="68"/>
+              <w:bottom w:type="dxa" w:w="102"/>
               <w:right w:type="dxa" w:w="113"/>
             </w:tcMar>
             <w:vAlign w:val="top"/>
@@ -3153,9 +3154,9 @@
               <w:right w:val="nil" w:color="auto" w:sz="0"/>
             </w:tcBorders>
             <w:tcMar>
-              <w:top w:type="dxa" w:w="68"/>
+              <w:top w:type="dxa" w:w="102"/>
               <w:left w:type="dxa" w:w="0"/>
-              <w:bottom w:type="dxa" w:w="68"/>
+              <w:bottom w:type="dxa" w:w="102"/>
               <w:right w:type="dxa" w:w="113"/>
             </w:tcMar>
             <w:vAlign w:val="top"/>
@@ -3206,7 +3207,7 @@
         <w:pBdr>
           <w:bottom w:val="single" w:color="BA9A58" w:sz="5" w:space="6"/>
         </w:pBdr>
-        <w:spacing w:after="227" w:before="0" w:line="220" w:lineRule="atLeast"/>
+        <w:spacing w:after="227" w:before="227" w:line="220" w:lineRule="atLeast"/>
       </w:pPr>
       <w:r>
         <w:rPr>
@@ -3251,7 +3252,7 @@
           <w:sz w:val="19"/>
           <w:szCs w:val="19"/>
         </w:rPr>
-        <w:t xml:space="preserve">Dónde se invierte cada euro del proyecto base, agrupado por capítulos. El detalle de cada partida figura a continuación.</w:t>
+        <w:t xml:space="preserve">Distribución del importe del proyecto base por capítulos. El desglose por partidas figura a continuación.</w:t>
       </w:r>
     </w:p>
     <w:tbl>
@@ -4746,7 +4747,7 @@
           <w:sz w:val="15"/>
           <w:szCs w:val="15"/>
         </w:rPr>
-        <w:t xml:space="preserve">Peso de cada capítulo sobre el total</w:t>
+        <w:t xml:space="preserve">Distribución por capítulos · % sobre el proyecto base</w:t>
       </w:r>
     </w:p>
     <w:p>
@@ -4757,7 +4758,7 @@
       <w:r>
         <w:drawing>
           <wp:inline distT="0" distB="0" distL="0" distR="0">
-            <wp:extent cx="6120000" cy="2304000"/>
+            <wp:extent cx="6120000" cy="2016000"/>
             <wp:effectExtent l="0" t="0" r="0" b="0"/>
             <wp:docPr id="9001" name="Gráfico de capítulos" descr="Peso de cada capítulo sobre el total del proyecto base"/>
             <wp:cNvGraphicFramePr/>
@@ -5259,7 +5260,7 @@
         <w:keepNext/>
         <w:keepLines/>
         <w:pageBreakBefore/>
-        <w:spacing w:after="125" w:before="0" w:line="280" w:lineRule="atLeast"/>
+        <w:spacing w:after="125" w:before="227" w:line="280" w:lineRule="atLeast"/>
       </w:pPr>
       <w:r>
         <w:rPr>
@@ -8061,6 +8062,246 @@
           </w:p>
         </w:tc>
       </w:tr>
+    </w:tbl>
+    <w:p>
+      <w:pPr>
+        <w:keepLines/>
+        <w:pageBreakBefore/>
+        <w:spacing w:after="227" w:before="0" w:line="40" w:lineRule="exact"/>
+      </w:pPr>
+      <w:r>
+        <w:rPr>
+          <w:rFonts w:ascii="Inter" w:cs="Inter" w:eastAsia="Inter" w:hAnsi="Inter"/>
+          <w:color w:val="1C1A16"/>
+          <w:kern w:val="2"/>
+          <w:sz w:val="8"/>
+          <w:szCs w:val="8"/>
+        </w:rPr>
+        <w:t xml:space="preserve"/>
+      </w:r>
+    </w:p>
+    <w:tbl>
+      <w:tblPr>
+        <w:tblW w:type="dxa" w:w="9638"/>
+        <w:tblInd w:type="dxa" w:w="0"/>
+        <w:tblBorders>
+          <w:top w:val="nil" w:color="auto" w:sz="0"/>
+          <w:left w:val="nil" w:color="auto" w:sz="0"/>
+          <w:bottom w:val="nil" w:color="auto" w:sz="0"/>
+          <w:right w:val="nil" w:color="auto" w:sz="0"/>
+          <w:insideH w:val="nil" w:color="auto" w:sz="0"/>
+          <w:insideV w:val="nil" w:color="auto" w:sz="0"/>
+        </w:tblBorders>
+        <w:tblLayout w:type="fixed"/>
+        <w:tblCellMar>
+          <w:top w:type="dxa" w:w="0"/>
+          <w:left w:type="dxa" w:w="0"/>
+          <w:bottom w:type="dxa" w:w="0"/>
+          <w:right w:type="dxa" w:w="0"/>
+        </w:tblCellMar>
+      </w:tblPr>
+      <w:tblGrid>
+        <w:gridCol w:w="567"/>
+        <w:gridCol w:w="5045"/>
+        <w:gridCol w:w="964"/>
+        <w:gridCol w:w="1191"/>
+        <w:gridCol w:w="1871"/>
+      </w:tblGrid>
+      <w:tr>
+        <w:trPr>
+          <w:cantSplit/>
+          <w:tblHeader/>
+        </w:trPr>
+        <w:tc>
+          <w:tcPr>
+            <w:tcW w:type="dxa" w:w="567"/>
+            <w:tcBorders>
+              <w:top w:val="nil" w:color="auto" w:sz="0"/>
+              <w:left w:val="nil" w:color="auto" w:sz="0"/>
+              <w:bottom w:val="nil" w:color="auto" w:sz="0"/>
+              <w:right w:val="nil" w:color="auto" w:sz="0"/>
+            </w:tcBorders>
+            <w:shd w:fill="1C1A16" w:color="auto" w:val="clear"/>
+            <w:tcMar>
+              <w:top w:type="dxa" w:w="130"/>
+              <w:left w:type="dxa" w:w="136"/>
+              <w:bottom w:type="dxa" w:w="130"/>
+              <w:right w:type="dxa" w:w="136"/>
+            </w:tcMar>
+            <w:vAlign w:val="bottom"/>
+          </w:tcPr>
+          <w:p>
+            <w:pPr>
+              <w:keepLines/>
+              <w:spacing w:after="0" w:before="0" w:line="200" w:lineRule="atLeast"/>
+              <w:jc w:val="center"/>
+            </w:pPr>
+            <w:r>
+              <w:rPr>
+                <w:rFonts w:ascii="Inter SemiBold" w:cs="Inter SemiBold" w:eastAsia="Inter SemiBold" w:hAnsi="Inter SemiBold"/>
+                <w:caps/>
+                <w:color w:val="FFFFFF"/>
+                <w:spacing w:val="10"/>
+                <w:kern w:val="2"/>
+                <w:sz w:val="14"/>
+                <w:szCs w:val="14"/>
+              </w:rPr>
+              <w:t xml:space="preserve">Nº</w:t>
+            </w:r>
+          </w:p>
+        </w:tc>
+        <w:tc>
+          <w:tcPr>
+            <w:tcW w:type="dxa" w:w="5045"/>
+            <w:tcBorders>
+              <w:top w:val="nil" w:color="auto" w:sz="0"/>
+              <w:left w:val="nil" w:color="auto" w:sz="0"/>
+              <w:bottom w:val="nil" w:color="auto" w:sz="0"/>
+              <w:right w:val="nil" w:color="auto" w:sz="0"/>
+            </w:tcBorders>
+            <w:shd w:fill="1C1A16" w:color="auto" w:val="clear"/>
+            <w:tcMar>
+              <w:top w:type="dxa" w:w="130"/>
+              <w:left w:type="dxa" w:w="136"/>
+              <w:bottom w:type="dxa" w:w="130"/>
+              <w:right w:type="dxa" w:w="136"/>
+            </w:tcMar>
+            <w:vAlign w:val="bottom"/>
+          </w:tcPr>
+          <w:p>
+            <w:pPr>
+              <w:keepLines/>
+              <w:spacing w:after="0" w:before="0" w:line="200" w:lineRule="atLeast"/>
+            </w:pPr>
+            <w:r>
+              <w:rPr>
+                <w:rFonts w:ascii="Inter SemiBold" w:cs="Inter SemiBold" w:eastAsia="Inter SemiBold" w:hAnsi="Inter SemiBold"/>
+                <w:caps/>
+                <w:color w:val="FFFFFF"/>
+                <w:spacing w:val="10"/>
+                <w:kern w:val="2"/>
+                <w:sz w:val="14"/>
+                <w:szCs w:val="14"/>
+              </w:rPr>
+              <w:t xml:space="preserve">Descripción</w:t>
+            </w:r>
+          </w:p>
+        </w:tc>
+        <w:tc>
+          <w:tcPr>
+            <w:tcW w:type="dxa" w:w="964"/>
+            <w:tcBorders>
+              <w:top w:val="nil" w:color="auto" w:sz="0"/>
+              <w:left w:val="nil" w:color="auto" w:sz="0"/>
+              <w:bottom w:val="nil" w:color="auto" w:sz="0"/>
+              <w:right w:val="nil" w:color="auto" w:sz="0"/>
+            </w:tcBorders>
+            <w:shd w:fill="1C1A16" w:color="auto" w:val="clear"/>
+            <w:tcMar>
+              <w:top w:type="dxa" w:w="130"/>
+              <w:left w:type="dxa" w:w="136"/>
+              <w:bottom w:type="dxa" w:w="130"/>
+              <w:right w:type="dxa" w:w="136"/>
+            </w:tcMar>
+            <w:vAlign w:val="bottom"/>
+          </w:tcPr>
+          <w:p>
+            <w:pPr>
+              <w:keepLines/>
+              <w:spacing w:after="0" w:before="0" w:line="200" w:lineRule="atLeast"/>
+              <w:jc w:val="center"/>
+            </w:pPr>
+            <w:r>
+              <w:rPr>
+                <w:rFonts w:ascii="Inter SemiBold" w:cs="Inter SemiBold" w:eastAsia="Inter SemiBold" w:hAnsi="Inter SemiBold"/>
+                <w:caps/>
+                <w:color w:val="FFFFFF"/>
+                <w:spacing w:val="10"/>
+                <w:kern w:val="2"/>
+                <w:sz w:val="14"/>
+                <w:szCs w:val="14"/>
+              </w:rPr>
+              <w:t xml:space="preserve">Unidad</w:t>
+            </w:r>
+          </w:p>
+        </w:tc>
+        <w:tc>
+          <w:tcPr>
+            <w:tcW w:type="dxa" w:w="1191"/>
+            <w:tcBorders>
+              <w:top w:val="nil" w:color="auto" w:sz="0"/>
+              <w:left w:val="nil" w:color="auto" w:sz="0"/>
+              <w:bottom w:val="nil" w:color="auto" w:sz="0"/>
+              <w:right w:val="nil" w:color="auto" w:sz="0"/>
+            </w:tcBorders>
+            <w:shd w:fill="1C1A16" w:color="auto" w:val="clear"/>
+            <w:tcMar>
+              <w:top w:type="dxa" w:w="130"/>
+              <w:left w:type="dxa" w:w="136"/>
+              <w:bottom w:type="dxa" w:w="130"/>
+              <w:right w:type="dxa" w:w="136"/>
+            </w:tcMar>
+            <w:vAlign w:val="bottom"/>
+          </w:tcPr>
+          <w:p>
+            <w:pPr>
+              <w:keepLines/>
+              <w:spacing w:after="0" w:before="0" w:line="200" w:lineRule="atLeast"/>
+              <w:jc w:val="center"/>
+            </w:pPr>
+            <w:r>
+              <w:rPr>
+                <w:rFonts w:ascii="Inter SemiBold" w:cs="Inter SemiBold" w:eastAsia="Inter SemiBold" w:hAnsi="Inter SemiBold"/>
+                <w:caps/>
+                <w:color w:val="FFFFFF"/>
+                <w:spacing w:val="10"/>
+                <w:kern w:val="2"/>
+                <w:sz w:val="14"/>
+                <w:szCs w:val="14"/>
+              </w:rPr>
+              <w:t xml:space="preserve">Cantidad</w:t>
+            </w:r>
+          </w:p>
+        </w:tc>
+        <w:tc>
+          <w:tcPr>
+            <w:tcW w:type="dxa" w:w="1871"/>
+            <w:tcBorders>
+              <w:top w:val="nil" w:color="auto" w:sz="0"/>
+              <w:left w:val="nil" w:color="auto" w:sz="0"/>
+              <w:bottom w:val="nil" w:color="auto" w:sz="0"/>
+              <w:right w:val="nil" w:color="auto" w:sz="0"/>
+            </w:tcBorders>
+            <w:shd w:fill="1C1A16" w:color="auto" w:val="clear"/>
+            <w:tcMar>
+              <w:top w:type="dxa" w:w="130"/>
+              <w:left w:type="dxa" w:w="136"/>
+              <w:bottom w:type="dxa" w:w="130"/>
+              <w:right w:type="dxa" w:w="136"/>
+            </w:tcMar>
+            <w:vAlign w:val="bottom"/>
+          </w:tcPr>
+          <w:p>
+            <w:pPr>
+              <w:keepLines/>
+              <w:spacing w:after="0" w:before="0" w:line="200" w:lineRule="atLeast"/>
+              <w:jc w:val="right"/>
+            </w:pPr>
+            <w:r>
+              <w:rPr>
+                <w:rFonts w:ascii="Inter SemiBold" w:cs="Inter SemiBold" w:eastAsia="Inter SemiBold" w:hAnsi="Inter SemiBold"/>
+                <w:caps/>
+                <w:color w:val="FFFFFF"/>
+                <w:spacing w:val="10"/>
+                <w:kern w:val="2"/>
+                <w:sz w:val="14"/>
+                <w:szCs w:val="14"/>
+              </w:rPr>
+              <w:t xml:space="preserve">Importe sin IVA</w:t>
+            </w:r>
+          </w:p>
+        </w:tc>
+      </w:tr>
       <w:tr>
         <w:trPr>
           <w:cantSplit/>
@@ -10645,7 +10886,7 @@
         <w:pBdr>
           <w:bottom w:val="single" w:color="BA9A58" w:sz="5" w:space="6"/>
         </w:pBdr>
-        <w:spacing w:after="227" w:before="0" w:line="220" w:lineRule="atLeast"/>
+        <w:spacing w:after="227" w:before="227" w:line="220" w:lineRule="atLeast"/>
       </w:pPr>
       <w:r>
         <w:rPr>
@@ -11257,9 +11498,9 @@
               <w:right w:val="nil" w:color="auto" w:sz="0"/>
             </w:tcBorders>
             <w:tcMar>
-              <w:top w:type="dxa" w:w="113"/>
+              <w:top w:type="dxa" w:w="68"/>
               <w:left w:type="dxa" w:w="113"/>
-              <w:bottom w:type="dxa" w:w="113"/>
+              <w:bottom w:type="dxa" w:w="68"/>
               <w:right w:type="dxa" w:w="113"/>
             </w:tcMar>
             <w:vAlign w:val="center"/>
@@ -12635,9 +12876,9 @@
               <w:right w:val="nil" w:color="auto" w:sz="0"/>
             </w:tcBorders>
             <w:tcMar>
-              <w:top w:type="dxa" w:w="113"/>
+              <w:top w:type="dxa" w:w="68"/>
               <w:left w:type="dxa" w:w="113"/>
-              <w:bottom w:type="dxa" w:w="113"/>
+              <w:bottom w:type="dxa" w:w="68"/>
               <w:right w:type="dxa" w:w="113"/>
             </w:tcMar>
             <w:vAlign w:val="center"/>
@@ -14015,9 +14256,9 @@
               <w:right w:val="nil" w:color="auto" w:sz="0"/>
             </w:tcBorders>
             <w:tcMar>
-              <w:top w:type="dxa" w:w="113"/>
+              <w:top w:type="dxa" w:w="68"/>
               <w:left w:type="dxa" w:w="113"/>
-              <w:bottom w:type="dxa" w:w="113"/>
+              <w:bottom w:type="dxa" w:w="68"/>
               <w:right w:type="dxa" w:w="113"/>
             </w:tcMar>
             <w:vAlign w:val="center"/>
@@ -15394,9 +15635,9 @@
               <w:right w:val="nil" w:color="auto" w:sz="0"/>
             </w:tcBorders>
             <w:tcMar>
-              <w:top w:type="dxa" w:w="113"/>
+              <w:top w:type="dxa" w:w="68"/>
               <w:left w:type="dxa" w:w="113"/>
-              <w:bottom w:type="dxa" w:w="113"/>
+              <w:bottom w:type="dxa" w:w="68"/>
               <w:right w:type="dxa" w:w="113"/>
             </w:tcMar>
             <w:vAlign w:val="center"/>
@@ -16762,7 +17003,7 @@
       <w:pPr>
         <w:keepNext/>
         <w:keepLines/>
-        <w:spacing w:after="125" w:before="454" w:line="280" w:lineRule="atLeast"/>
+        <w:spacing w:after="125" w:before="340" w:line="280" w:lineRule="atLeast"/>
       </w:pPr>
       <w:r>
         <w:rPr>
@@ -16822,8 +17063,8 @@
         </w:tblCellMar>
       </w:tblPr>
       <w:tblGrid>
-        <w:gridCol w:w="1928"/>
-        <w:gridCol w:w="3288"/>
+        <w:gridCol w:w="1814"/>
+        <w:gridCol w:w="3402"/>
         <w:gridCol w:w="737"/>
         <w:gridCol w:w="1247"/>
         <w:gridCol w:w="1134"/>
@@ -16836,7 +17077,7 @@
         </w:trPr>
         <w:tc>
           <w:tcPr>
-            <w:tcW w:type="dxa" w:w="1928"/>
+            <w:tcW w:type="dxa" w:w="1814"/>
             <w:tcBorders>
               <w:top w:val="nil" w:color="auto" w:sz="0"/>
               <w:left w:val="nil" w:color="auto" w:sz="0"/>
@@ -16873,7 +17114,7 @@
         </w:tc>
         <w:tc>
           <w:tcPr>
-            <w:tcW w:type="dxa" w:w="3288"/>
+            <w:tcW w:type="dxa" w:w="3402"/>
             <w:tcBorders>
               <w:top w:val="nil" w:color="auto" w:sz="0"/>
               <w:left w:val="nil" w:color="auto" w:sz="0"/>
@@ -17067,18 +17308,18 @@
         </w:trPr>
         <w:tc>
           <w:tcPr>
-            <w:tcW w:type="dxa" w:w="1928"/>
-            <w:tcBorders>
-              <w:top w:val="nil" w:color="auto" w:sz="0"/>
-              <w:left w:val="nil" w:color="auto" w:sz="0"/>
-              <w:bottom w:val="single" w:color="E2DBCD" w:sz="4"/>
-              <w:right w:val="nil" w:color="auto" w:sz="0"/>
-            </w:tcBorders>
-            <w:tcMar>
-              <w:top w:type="dxa" w:w="99"/>
-              <w:left w:type="dxa" w:w="113"/>
-              <w:bottom w:type="dxa" w:w="99"/>
-              <w:right w:type="dxa" w:w="113"/>
+            <w:tcW w:type="dxa" w:w="1814"/>
+            <w:tcBorders>
+              <w:top w:val="nil" w:color="auto" w:sz="0"/>
+              <w:left w:val="nil" w:color="auto" w:sz="0"/>
+              <w:bottom w:val="single" w:color="E2DBCD" w:sz="4"/>
+              <w:right w:val="nil" w:color="auto" w:sz="0"/>
+            </w:tcBorders>
+            <w:tcMar>
+              <w:top w:type="dxa" w:w="79"/>
+              <w:left w:type="dxa" w:w="91"/>
+              <w:bottom w:type="dxa" w:w="79"/>
+              <w:right w:type="dxa" w:w="91"/>
             </w:tcMar>
             <w:vAlign w:val="top"/>
           </w:tcPr>
@@ -17111,18 +17352,18 @@
         </w:tc>
         <w:tc>
           <w:tcPr>
-            <w:tcW w:type="dxa" w:w="3288"/>
-            <w:tcBorders>
-              <w:top w:val="nil" w:color="auto" w:sz="0"/>
-              <w:left w:val="nil" w:color="auto" w:sz="0"/>
-              <w:bottom w:val="single" w:color="E2DBCD" w:sz="4"/>
-              <w:right w:val="nil" w:color="auto" w:sz="0"/>
-            </w:tcBorders>
-            <w:tcMar>
-              <w:top w:type="dxa" w:w="99"/>
-              <w:left w:type="dxa" w:w="113"/>
-              <w:bottom w:type="dxa" w:w="99"/>
-              <w:right w:type="dxa" w:w="113"/>
+            <w:tcW w:type="dxa" w:w="3402"/>
+            <w:tcBorders>
+              <w:top w:val="nil" w:color="auto" w:sz="0"/>
+              <w:left w:val="nil" w:color="auto" w:sz="0"/>
+              <w:bottom w:val="single" w:color="E2DBCD" w:sz="4"/>
+              <w:right w:val="nil" w:color="auto" w:sz="0"/>
+            </w:tcBorders>
+            <w:tcMar>
+              <w:top w:type="dxa" w:w="79"/>
+              <w:left w:type="dxa" w:w="91"/>
+              <w:bottom w:type="dxa" w:w="79"/>
+              <w:right w:type="dxa" w:w="91"/>
             </w:tcMar>
             <w:vAlign w:val="top"/>
           </w:tcPr>
@@ -17153,10 +17394,10 @@
               <w:right w:val="nil" w:color="auto" w:sz="0"/>
             </w:tcBorders>
             <w:tcMar>
-              <w:top w:type="dxa" w:w="99"/>
-              <w:left w:type="dxa" w:w="113"/>
-              <w:bottom w:type="dxa" w:w="99"/>
-              <w:right w:type="dxa" w:w="113"/>
+              <w:top w:type="dxa" w:w="79"/>
+              <w:left w:type="dxa" w:w="91"/>
+              <w:bottom w:type="dxa" w:w="79"/>
+              <w:right w:type="dxa" w:w="91"/>
             </w:tcMar>
             <w:vAlign w:val="top"/>
           </w:tcPr>
@@ -17188,10 +17429,10 @@
               <w:right w:val="nil" w:color="auto" w:sz="0"/>
             </w:tcBorders>
             <w:tcMar>
-              <w:top w:type="dxa" w:w="99"/>
-              <w:left w:type="dxa" w:w="113"/>
-              <w:bottom w:type="dxa" w:w="99"/>
-              <w:right w:type="dxa" w:w="113"/>
+              <w:top w:type="dxa" w:w="79"/>
+              <w:left w:type="dxa" w:w="91"/>
+              <w:bottom w:type="dxa" w:w="79"/>
+              <w:right w:type="dxa" w:w="91"/>
             </w:tcMar>
             <w:vAlign w:val="top"/>
           </w:tcPr>
@@ -17223,10 +17464,10 @@
               <w:right w:val="nil" w:color="auto" w:sz="0"/>
             </w:tcBorders>
             <w:tcMar>
-              <w:top w:type="dxa" w:w="99"/>
-              <w:left w:type="dxa" w:w="113"/>
-              <w:bottom w:type="dxa" w:w="99"/>
-              <w:right w:type="dxa" w:w="113"/>
+              <w:top w:type="dxa" w:w="79"/>
+              <w:left w:type="dxa" w:w="91"/>
+              <w:bottom w:type="dxa" w:w="79"/>
+              <w:right w:type="dxa" w:w="91"/>
             </w:tcMar>
             <w:vAlign w:val="top"/>
           </w:tcPr>
@@ -17258,10 +17499,10 @@
               <w:right w:val="nil" w:color="auto" w:sz="0"/>
             </w:tcBorders>
             <w:tcMar>
-              <w:top w:type="dxa" w:w="99"/>
-              <w:left w:type="dxa" w:w="113"/>
-              <w:bottom w:type="dxa" w:w="99"/>
-              <w:right w:type="dxa" w:w="113"/>
+              <w:top w:type="dxa" w:w="79"/>
+              <w:left w:type="dxa" w:w="91"/>
+              <w:bottom w:type="dxa" w:w="79"/>
+              <w:right w:type="dxa" w:w="91"/>
             </w:tcMar>
             <w:vAlign w:val="top"/>
           </w:tcPr>
@@ -17290,18 +17531,18 @@
         </w:trPr>
         <w:tc>
           <w:tcPr>
-            <w:tcW w:type="dxa" w:w="1928"/>
-            <w:tcBorders>
-              <w:top w:val="nil" w:color="auto" w:sz="0"/>
-              <w:left w:val="nil" w:color="auto" w:sz="0"/>
-              <w:bottom w:val="single" w:color="E2DBCD" w:sz="4"/>
-              <w:right w:val="nil" w:color="auto" w:sz="0"/>
-            </w:tcBorders>
-            <w:tcMar>
-              <w:top w:type="dxa" w:w="99"/>
-              <w:left w:type="dxa" w:w="113"/>
-              <w:bottom w:type="dxa" w:w="99"/>
-              <w:right w:type="dxa" w:w="113"/>
+            <w:tcW w:type="dxa" w:w="1814"/>
+            <w:tcBorders>
+              <w:top w:val="nil" w:color="auto" w:sz="0"/>
+              <w:left w:val="nil" w:color="auto" w:sz="0"/>
+              <w:bottom w:val="single" w:color="E2DBCD" w:sz="4"/>
+              <w:right w:val="nil" w:color="auto" w:sz="0"/>
+            </w:tcBorders>
+            <w:tcMar>
+              <w:top w:type="dxa" w:w="79"/>
+              <w:left w:type="dxa" w:w="91"/>
+              <w:bottom w:type="dxa" w:w="79"/>
+              <w:right w:type="dxa" w:w="91"/>
             </w:tcMar>
             <w:vAlign w:val="top"/>
           </w:tcPr>
@@ -17334,18 +17575,18 @@
         </w:tc>
         <w:tc>
           <w:tcPr>
-            <w:tcW w:type="dxa" w:w="3288"/>
-            <w:tcBorders>
-              <w:top w:val="nil" w:color="auto" w:sz="0"/>
-              <w:left w:val="nil" w:color="auto" w:sz="0"/>
-              <w:bottom w:val="single" w:color="E2DBCD" w:sz="4"/>
-              <w:right w:val="nil" w:color="auto" w:sz="0"/>
-            </w:tcBorders>
-            <w:tcMar>
-              <w:top w:type="dxa" w:w="99"/>
-              <w:left w:type="dxa" w:w="113"/>
-              <w:bottom w:type="dxa" w:w="99"/>
-              <w:right w:type="dxa" w:w="113"/>
+            <w:tcW w:type="dxa" w:w="3402"/>
+            <w:tcBorders>
+              <w:top w:val="nil" w:color="auto" w:sz="0"/>
+              <w:left w:val="nil" w:color="auto" w:sz="0"/>
+              <w:bottom w:val="single" w:color="E2DBCD" w:sz="4"/>
+              <w:right w:val="nil" w:color="auto" w:sz="0"/>
+            </w:tcBorders>
+            <w:tcMar>
+              <w:top w:type="dxa" w:w="79"/>
+              <w:left w:type="dxa" w:w="91"/>
+              <w:bottom w:type="dxa" w:w="79"/>
+              <w:right w:type="dxa" w:w="91"/>
             </w:tcMar>
             <w:vAlign w:val="top"/>
           </w:tcPr>
@@ -17376,10 +17617,10 @@
               <w:right w:val="nil" w:color="auto" w:sz="0"/>
             </w:tcBorders>
             <w:tcMar>
-              <w:top w:type="dxa" w:w="99"/>
-              <w:left w:type="dxa" w:w="113"/>
-              <w:bottom w:type="dxa" w:w="99"/>
-              <w:right w:type="dxa" w:w="113"/>
+              <w:top w:type="dxa" w:w="79"/>
+              <w:left w:type="dxa" w:w="91"/>
+              <w:bottom w:type="dxa" w:w="79"/>
+              <w:right w:type="dxa" w:w="91"/>
             </w:tcMar>
             <w:vAlign w:val="top"/>
           </w:tcPr>
@@ -17411,10 +17652,10 @@
               <w:right w:val="nil" w:color="auto" w:sz="0"/>
             </w:tcBorders>
             <w:tcMar>
-              <w:top w:type="dxa" w:w="99"/>
-              <w:left w:type="dxa" w:w="113"/>
-              <w:bottom w:type="dxa" w:w="99"/>
-              <w:right w:type="dxa" w:w="113"/>
+              <w:top w:type="dxa" w:w="79"/>
+              <w:left w:type="dxa" w:w="91"/>
+              <w:bottom w:type="dxa" w:w="79"/>
+              <w:right w:type="dxa" w:w="91"/>
             </w:tcMar>
             <w:vAlign w:val="top"/>
           </w:tcPr>
@@ -17446,10 +17687,10 @@
               <w:right w:val="nil" w:color="auto" w:sz="0"/>
             </w:tcBorders>
             <w:tcMar>
-              <w:top w:type="dxa" w:w="99"/>
-              <w:left w:type="dxa" w:w="113"/>
-              <w:bottom w:type="dxa" w:w="99"/>
-              <w:right w:type="dxa" w:w="113"/>
+              <w:top w:type="dxa" w:w="79"/>
+              <w:left w:type="dxa" w:w="91"/>
+              <w:bottom w:type="dxa" w:w="79"/>
+              <w:right w:type="dxa" w:w="91"/>
             </w:tcMar>
             <w:vAlign w:val="top"/>
           </w:tcPr>
@@ -17481,10 +17722,10 @@
               <w:right w:val="nil" w:color="auto" w:sz="0"/>
             </w:tcBorders>
             <w:tcMar>
-              <w:top w:type="dxa" w:w="99"/>
-              <w:left w:type="dxa" w:w="113"/>
-              <w:bottom w:type="dxa" w:w="99"/>
-              <w:right w:type="dxa" w:w="113"/>
+              <w:top w:type="dxa" w:w="79"/>
+              <w:left w:type="dxa" w:w="91"/>
+              <w:bottom w:type="dxa" w:w="79"/>
+              <w:right w:type="dxa" w:w="91"/>
             </w:tcMar>
             <w:vAlign w:val="top"/>
           </w:tcPr>
@@ -17513,18 +17754,18 @@
         </w:trPr>
         <w:tc>
           <w:tcPr>
-            <w:tcW w:type="dxa" w:w="1928"/>
-            <w:tcBorders>
-              <w:top w:val="nil" w:color="auto" w:sz="0"/>
-              <w:left w:val="nil" w:color="auto" w:sz="0"/>
-              <w:bottom w:val="single" w:color="E2DBCD" w:sz="4"/>
-              <w:right w:val="nil" w:color="auto" w:sz="0"/>
-            </w:tcBorders>
-            <w:tcMar>
-              <w:top w:type="dxa" w:w="99"/>
-              <w:left w:type="dxa" w:w="113"/>
-              <w:bottom w:type="dxa" w:w="99"/>
-              <w:right w:type="dxa" w:w="113"/>
+            <w:tcW w:type="dxa" w:w="1814"/>
+            <w:tcBorders>
+              <w:top w:val="nil" w:color="auto" w:sz="0"/>
+              <w:left w:val="nil" w:color="auto" w:sz="0"/>
+              <w:bottom w:val="single" w:color="E2DBCD" w:sz="4"/>
+              <w:right w:val="nil" w:color="auto" w:sz="0"/>
+            </w:tcBorders>
+            <w:tcMar>
+              <w:top w:type="dxa" w:w="79"/>
+              <w:left w:type="dxa" w:w="91"/>
+              <w:bottom w:type="dxa" w:w="79"/>
+              <w:right w:type="dxa" w:w="91"/>
             </w:tcMar>
             <w:vAlign w:val="top"/>
           </w:tcPr>
@@ -17557,18 +17798,18 @@
         </w:tc>
         <w:tc>
           <w:tcPr>
-            <w:tcW w:type="dxa" w:w="3288"/>
-            <w:tcBorders>
-              <w:top w:val="nil" w:color="auto" w:sz="0"/>
-              <w:left w:val="nil" w:color="auto" w:sz="0"/>
-              <w:bottom w:val="single" w:color="E2DBCD" w:sz="4"/>
-              <w:right w:val="nil" w:color="auto" w:sz="0"/>
-            </w:tcBorders>
-            <w:tcMar>
-              <w:top w:type="dxa" w:w="99"/>
-              <w:left w:type="dxa" w:w="113"/>
-              <w:bottom w:type="dxa" w:w="99"/>
-              <w:right w:type="dxa" w:w="113"/>
+            <w:tcW w:type="dxa" w:w="3402"/>
+            <w:tcBorders>
+              <w:top w:val="nil" w:color="auto" w:sz="0"/>
+              <w:left w:val="nil" w:color="auto" w:sz="0"/>
+              <w:bottom w:val="single" w:color="E2DBCD" w:sz="4"/>
+              <w:right w:val="nil" w:color="auto" w:sz="0"/>
+            </w:tcBorders>
+            <w:tcMar>
+              <w:top w:type="dxa" w:w="79"/>
+              <w:left w:type="dxa" w:w="91"/>
+              <w:bottom w:type="dxa" w:w="79"/>
+              <w:right w:type="dxa" w:w="91"/>
             </w:tcMar>
             <w:vAlign w:val="top"/>
           </w:tcPr>
@@ -17599,10 +17840,10 @@
               <w:right w:val="nil" w:color="auto" w:sz="0"/>
             </w:tcBorders>
             <w:tcMar>
-              <w:top w:type="dxa" w:w="99"/>
-              <w:left w:type="dxa" w:w="113"/>
-              <w:bottom w:type="dxa" w:w="99"/>
-              <w:right w:type="dxa" w:w="113"/>
+              <w:top w:type="dxa" w:w="79"/>
+              <w:left w:type="dxa" w:w="91"/>
+              <w:bottom w:type="dxa" w:w="79"/>
+              <w:right w:type="dxa" w:w="91"/>
             </w:tcMar>
             <w:vAlign w:val="top"/>
           </w:tcPr>
@@ -17634,10 +17875,10 @@
               <w:right w:val="nil" w:color="auto" w:sz="0"/>
             </w:tcBorders>
             <w:tcMar>
-              <w:top w:type="dxa" w:w="99"/>
-              <w:left w:type="dxa" w:w="113"/>
-              <w:bottom w:type="dxa" w:w="99"/>
-              <w:right w:type="dxa" w:w="113"/>
+              <w:top w:type="dxa" w:w="79"/>
+              <w:left w:type="dxa" w:w="91"/>
+              <w:bottom w:type="dxa" w:w="79"/>
+              <w:right w:type="dxa" w:w="91"/>
             </w:tcMar>
             <w:vAlign w:val="top"/>
           </w:tcPr>
@@ -17669,10 +17910,10 @@
               <w:right w:val="nil" w:color="auto" w:sz="0"/>
             </w:tcBorders>
             <w:tcMar>
-              <w:top w:type="dxa" w:w="99"/>
-              <w:left w:type="dxa" w:w="113"/>
-              <w:bottom w:type="dxa" w:w="99"/>
-              <w:right w:type="dxa" w:w="113"/>
+              <w:top w:type="dxa" w:w="79"/>
+              <w:left w:type="dxa" w:w="91"/>
+              <w:bottom w:type="dxa" w:w="79"/>
+              <w:right w:type="dxa" w:w="91"/>
             </w:tcMar>
             <w:vAlign w:val="top"/>
           </w:tcPr>
@@ -17704,10 +17945,10 @@
               <w:right w:val="nil" w:color="auto" w:sz="0"/>
             </w:tcBorders>
             <w:tcMar>
-              <w:top w:type="dxa" w:w="99"/>
-              <w:left w:type="dxa" w:w="113"/>
-              <w:bottom w:type="dxa" w:w="99"/>
-              <w:right w:type="dxa" w:w="113"/>
+              <w:top w:type="dxa" w:w="79"/>
+              <w:left w:type="dxa" w:w="91"/>
+              <w:bottom w:type="dxa" w:w="79"/>
+              <w:right w:type="dxa" w:w="91"/>
             </w:tcMar>
             <w:vAlign w:val="top"/>
           </w:tcPr>
@@ -17736,18 +17977,18 @@
         </w:trPr>
         <w:tc>
           <w:tcPr>
-            <w:tcW w:type="dxa" w:w="1928"/>
-            <w:tcBorders>
-              <w:top w:val="nil" w:color="auto" w:sz="0"/>
-              <w:left w:val="nil" w:color="auto" w:sz="0"/>
-              <w:bottom w:val="single" w:color="E2DBCD" w:sz="4"/>
-              <w:right w:val="nil" w:color="auto" w:sz="0"/>
-            </w:tcBorders>
-            <w:tcMar>
-              <w:top w:type="dxa" w:w="99"/>
-              <w:left w:type="dxa" w:w="113"/>
-              <w:bottom w:type="dxa" w:w="99"/>
-              <w:right w:type="dxa" w:w="113"/>
+            <w:tcW w:type="dxa" w:w="1814"/>
+            <w:tcBorders>
+              <w:top w:val="nil" w:color="auto" w:sz="0"/>
+              <w:left w:val="nil" w:color="auto" w:sz="0"/>
+              <w:bottom w:val="single" w:color="E2DBCD" w:sz="4"/>
+              <w:right w:val="nil" w:color="auto" w:sz="0"/>
+            </w:tcBorders>
+            <w:tcMar>
+              <w:top w:type="dxa" w:w="79"/>
+              <w:left w:type="dxa" w:w="91"/>
+              <w:bottom w:type="dxa" w:w="79"/>
+              <w:right w:type="dxa" w:w="91"/>
             </w:tcMar>
             <w:vAlign w:val="top"/>
           </w:tcPr>
@@ -17780,18 +18021,18 @@
         </w:tc>
         <w:tc>
           <w:tcPr>
-            <w:tcW w:type="dxa" w:w="3288"/>
-            <w:tcBorders>
-              <w:top w:val="nil" w:color="auto" w:sz="0"/>
-              <w:left w:val="nil" w:color="auto" w:sz="0"/>
-              <w:bottom w:val="single" w:color="E2DBCD" w:sz="4"/>
-              <w:right w:val="nil" w:color="auto" w:sz="0"/>
-            </w:tcBorders>
-            <w:tcMar>
-              <w:top w:type="dxa" w:w="99"/>
-              <w:left w:type="dxa" w:w="113"/>
-              <w:bottom w:type="dxa" w:w="99"/>
-              <w:right w:type="dxa" w:w="113"/>
+            <w:tcW w:type="dxa" w:w="3402"/>
+            <w:tcBorders>
+              <w:top w:val="nil" w:color="auto" w:sz="0"/>
+              <w:left w:val="nil" w:color="auto" w:sz="0"/>
+              <w:bottom w:val="single" w:color="E2DBCD" w:sz="4"/>
+              <w:right w:val="nil" w:color="auto" w:sz="0"/>
+            </w:tcBorders>
+            <w:tcMar>
+              <w:top w:type="dxa" w:w="79"/>
+              <w:left w:type="dxa" w:w="91"/>
+              <w:bottom w:type="dxa" w:w="79"/>
+              <w:right w:type="dxa" w:w="91"/>
             </w:tcMar>
             <w:vAlign w:val="top"/>
           </w:tcPr>
@@ -17822,10 +18063,10 @@
               <w:right w:val="nil" w:color="auto" w:sz="0"/>
             </w:tcBorders>
             <w:tcMar>
-              <w:top w:type="dxa" w:w="99"/>
-              <w:left w:type="dxa" w:w="113"/>
-              <w:bottom w:type="dxa" w:w="99"/>
-              <w:right w:type="dxa" w:w="113"/>
+              <w:top w:type="dxa" w:w="79"/>
+              <w:left w:type="dxa" w:w="91"/>
+              <w:bottom w:type="dxa" w:w="79"/>
+              <w:right w:type="dxa" w:w="91"/>
             </w:tcMar>
             <w:vAlign w:val="top"/>
           </w:tcPr>
@@ -17857,10 +18098,10 @@
               <w:right w:val="nil" w:color="auto" w:sz="0"/>
             </w:tcBorders>
             <w:tcMar>
-              <w:top w:type="dxa" w:w="99"/>
-              <w:left w:type="dxa" w:w="113"/>
-              <w:bottom w:type="dxa" w:w="99"/>
-              <w:right w:type="dxa" w:w="113"/>
+              <w:top w:type="dxa" w:w="79"/>
+              <w:left w:type="dxa" w:w="91"/>
+              <w:bottom w:type="dxa" w:w="79"/>
+              <w:right w:type="dxa" w:w="91"/>
             </w:tcMar>
             <w:vAlign w:val="top"/>
           </w:tcPr>
@@ -17892,10 +18133,10 @@
               <w:right w:val="nil" w:color="auto" w:sz="0"/>
             </w:tcBorders>
             <w:tcMar>
-              <w:top w:type="dxa" w:w="99"/>
-              <w:left w:type="dxa" w:w="113"/>
-              <w:bottom w:type="dxa" w:w="99"/>
-              <w:right w:type="dxa" w:w="113"/>
+              <w:top w:type="dxa" w:w="79"/>
+              <w:left w:type="dxa" w:w="91"/>
+              <w:bottom w:type="dxa" w:w="79"/>
+              <w:right w:type="dxa" w:w="91"/>
             </w:tcMar>
             <w:vAlign w:val="top"/>
           </w:tcPr>
@@ -17927,10 +18168,10 @@
               <w:right w:val="nil" w:color="auto" w:sz="0"/>
             </w:tcBorders>
             <w:tcMar>
-              <w:top w:type="dxa" w:w="99"/>
-              <w:left w:type="dxa" w:w="113"/>
-              <w:bottom w:type="dxa" w:w="99"/>
-              <w:right w:type="dxa" w:w="113"/>
+              <w:top w:type="dxa" w:w="79"/>
+              <w:left w:type="dxa" w:w="91"/>
+              <w:bottom w:type="dxa" w:w="79"/>
+              <w:right w:type="dxa" w:w="91"/>
             </w:tcMar>
             <w:vAlign w:val="top"/>
           </w:tcPr>
@@ -17959,18 +18200,18 @@
         </w:trPr>
         <w:tc>
           <w:tcPr>
-            <w:tcW w:type="dxa" w:w="1928"/>
-            <w:tcBorders>
-              <w:top w:val="nil" w:color="auto" w:sz="0"/>
-              <w:left w:val="nil" w:color="auto" w:sz="0"/>
-              <w:bottom w:val="single" w:color="E2DBCD" w:sz="4"/>
-              <w:right w:val="nil" w:color="auto" w:sz="0"/>
-            </w:tcBorders>
-            <w:tcMar>
-              <w:top w:type="dxa" w:w="99"/>
-              <w:left w:type="dxa" w:w="113"/>
-              <w:bottom w:type="dxa" w:w="99"/>
-              <w:right w:type="dxa" w:w="113"/>
+            <w:tcW w:type="dxa" w:w="1814"/>
+            <w:tcBorders>
+              <w:top w:val="nil" w:color="auto" w:sz="0"/>
+              <w:left w:val="nil" w:color="auto" w:sz="0"/>
+              <w:bottom w:val="single" w:color="E2DBCD" w:sz="4"/>
+              <w:right w:val="nil" w:color="auto" w:sz="0"/>
+            </w:tcBorders>
+            <w:tcMar>
+              <w:top w:type="dxa" w:w="79"/>
+              <w:left w:type="dxa" w:w="91"/>
+              <w:bottom w:type="dxa" w:w="79"/>
+              <w:right w:type="dxa" w:w="91"/>
             </w:tcMar>
             <w:vAlign w:val="top"/>
           </w:tcPr>
@@ -18003,18 +18244,18 @@
         </w:tc>
         <w:tc>
           <w:tcPr>
-            <w:tcW w:type="dxa" w:w="3288"/>
-            <w:tcBorders>
-              <w:top w:val="nil" w:color="auto" w:sz="0"/>
-              <w:left w:val="nil" w:color="auto" w:sz="0"/>
-              <w:bottom w:val="single" w:color="E2DBCD" w:sz="4"/>
-              <w:right w:val="nil" w:color="auto" w:sz="0"/>
-            </w:tcBorders>
-            <w:tcMar>
-              <w:top w:type="dxa" w:w="99"/>
-              <w:left w:type="dxa" w:w="113"/>
-              <w:bottom w:type="dxa" w:w="99"/>
-              <w:right w:type="dxa" w:w="113"/>
+            <w:tcW w:type="dxa" w:w="3402"/>
+            <w:tcBorders>
+              <w:top w:val="nil" w:color="auto" w:sz="0"/>
+              <w:left w:val="nil" w:color="auto" w:sz="0"/>
+              <w:bottom w:val="single" w:color="E2DBCD" w:sz="4"/>
+              <w:right w:val="nil" w:color="auto" w:sz="0"/>
+            </w:tcBorders>
+            <w:tcMar>
+              <w:top w:type="dxa" w:w="79"/>
+              <w:left w:type="dxa" w:w="91"/>
+              <w:bottom w:type="dxa" w:w="79"/>
+              <w:right w:type="dxa" w:w="91"/>
             </w:tcMar>
             <w:vAlign w:val="top"/>
           </w:tcPr>
@@ -18045,10 +18286,10 @@
               <w:right w:val="nil" w:color="auto" w:sz="0"/>
             </w:tcBorders>
             <w:tcMar>
-              <w:top w:type="dxa" w:w="99"/>
-              <w:left w:type="dxa" w:w="113"/>
-              <w:bottom w:type="dxa" w:w="99"/>
-              <w:right w:type="dxa" w:w="113"/>
+              <w:top w:type="dxa" w:w="79"/>
+              <w:left w:type="dxa" w:w="91"/>
+              <w:bottom w:type="dxa" w:w="79"/>
+              <w:right w:type="dxa" w:w="91"/>
             </w:tcMar>
             <w:vAlign w:val="top"/>
           </w:tcPr>
@@ -18080,10 +18321,10 @@
               <w:right w:val="nil" w:color="auto" w:sz="0"/>
             </w:tcBorders>
             <w:tcMar>
-              <w:top w:type="dxa" w:w="99"/>
-              <w:left w:type="dxa" w:w="113"/>
-              <w:bottom w:type="dxa" w:w="99"/>
-              <w:right w:type="dxa" w:w="113"/>
+              <w:top w:type="dxa" w:w="79"/>
+              <w:left w:type="dxa" w:w="91"/>
+              <w:bottom w:type="dxa" w:w="79"/>
+              <w:right w:type="dxa" w:w="91"/>
             </w:tcMar>
             <w:vAlign w:val="top"/>
           </w:tcPr>
@@ -18115,10 +18356,10 @@
               <w:right w:val="nil" w:color="auto" w:sz="0"/>
             </w:tcBorders>
             <w:tcMar>
-              <w:top w:type="dxa" w:w="99"/>
-              <w:left w:type="dxa" w:w="113"/>
-              <w:bottom w:type="dxa" w:w="99"/>
-              <w:right w:type="dxa" w:w="113"/>
+              <w:top w:type="dxa" w:w="79"/>
+              <w:left w:type="dxa" w:w="91"/>
+              <w:bottom w:type="dxa" w:w="79"/>
+              <w:right w:type="dxa" w:w="91"/>
             </w:tcMar>
             <w:vAlign w:val="top"/>
           </w:tcPr>
@@ -18150,10 +18391,10 @@
               <w:right w:val="nil" w:color="auto" w:sz="0"/>
             </w:tcBorders>
             <w:tcMar>
-              <w:top w:type="dxa" w:w="99"/>
-              <w:left w:type="dxa" w:w="113"/>
-              <w:bottom w:type="dxa" w:w="99"/>
-              <w:right w:type="dxa" w:w="113"/>
+              <w:top w:type="dxa" w:w="79"/>
+              <w:left w:type="dxa" w:w="91"/>
+              <w:bottom w:type="dxa" w:w="79"/>
+              <w:right w:type="dxa" w:w="91"/>
             </w:tcMar>
             <w:vAlign w:val="top"/>
           </w:tcPr>
@@ -18182,7 +18423,7 @@
         </w:trPr>
         <w:tc>
           <w:tcPr>
-            <w:tcW w:type="dxa" w:w="1928"/>
+            <w:tcW w:type="dxa" w:w="1814"/>
             <w:tcBorders>
               <w:top w:val="single" w:color="BA9A58" w:sz="10"/>
               <w:left w:val="nil" w:color="auto" w:sz="0"/>
@@ -18191,9 +18432,9 @@
             </w:tcBorders>
             <w:tcMar>
               <w:top w:type="dxa" w:w="147"/>
-              <w:left w:type="dxa" w:w="113"/>
-              <w:bottom w:type="dxa" w:w="99"/>
-              <w:right w:type="dxa" w:w="113"/>
+              <w:left w:type="dxa" w:w="91"/>
+              <w:bottom w:type="dxa" w:w="79"/>
+              <w:right w:type="dxa" w:w="91"/>
             </w:tcMar>
             <w:vAlign w:val="top"/>
           </w:tcPr>
@@ -18216,7 +18457,7 @@
         </w:tc>
         <w:tc>
           <w:tcPr>
-            <w:tcW w:type="dxa" w:w="3288"/>
+            <w:tcW w:type="dxa" w:w="3402"/>
             <w:tcBorders>
               <w:top w:val="single" w:color="BA9A58" w:sz="10"/>
               <w:left w:val="nil" w:color="auto" w:sz="0"/>
@@ -18225,9 +18466,9 @@
             </w:tcBorders>
             <w:tcMar>
               <w:top w:type="dxa" w:w="147"/>
-              <w:left w:type="dxa" w:w="113"/>
-              <w:bottom w:type="dxa" w:w="99"/>
-              <w:right w:type="dxa" w:w="113"/>
+              <w:left w:type="dxa" w:w="91"/>
+              <w:bottom w:type="dxa" w:w="79"/>
+              <w:right w:type="dxa" w:w="91"/>
             </w:tcMar>
             <w:vAlign w:val="top"/>
           </w:tcPr>
@@ -18259,9 +18500,9 @@
             </w:tcBorders>
             <w:tcMar>
               <w:top w:type="dxa" w:w="147"/>
-              <w:left w:type="dxa" w:w="113"/>
-              <w:bottom w:type="dxa" w:w="99"/>
-              <w:right w:type="dxa" w:w="113"/>
+              <w:left w:type="dxa" w:w="91"/>
+              <w:bottom w:type="dxa" w:w="79"/>
+              <w:right w:type="dxa" w:w="91"/>
             </w:tcMar>
             <w:vAlign w:val="top"/>
           </w:tcPr>
@@ -18294,9 +18535,9 @@
             </w:tcBorders>
             <w:tcMar>
               <w:top w:type="dxa" w:w="147"/>
-              <w:left w:type="dxa" w:w="113"/>
-              <w:bottom w:type="dxa" w:w="99"/>
-              <w:right w:type="dxa" w:w="113"/>
+              <w:left w:type="dxa" w:w="91"/>
+              <w:bottom w:type="dxa" w:w="79"/>
+              <w:right w:type="dxa" w:w="91"/>
             </w:tcMar>
             <w:vAlign w:val="top"/>
           </w:tcPr>
@@ -18329,9 +18570,9 @@
             </w:tcBorders>
             <w:tcMar>
               <w:top w:type="dxa" w:w="147"/>
-              <w:left w:type="dxa" w:w="113"/>
-              <w:bottom w:type="dxa" w:w="99"/>
-              <w:right w:type="dxa" w:w="113"/>
+              <w:left w:type="dxa" w:w="91"/>
+              <w:bottom w:type="dxa" w:w="79"/>
+              <w:right w:type="dxa" w:w="91"/>
             </w:tcMar>
             <w:vAlign w:val="top"/>
           </w:tcPr>
@@ -18364,9 +18605,9 @@
             </w:tcBorders>
             <w:tcMar>
               <w:top w:type="dxa" w:w="147"/>
-              <w:left w:type="dxa" w:w="113"/>
-              <w:bottom w:type="dxa" w:w="99"/>
-              <w:right w:type="dxa" w:w="113"/>
+              <w:left w:type="dxa" w:w="91"/>
+              <w:bottom w:type="dxa" w:w="79"/>
+              <w:right w:type="dxa" w:w="91"/>
             </w:tcMar>
             <w:vAlign w:val="top"/>
           </w:tcPr>
@@ -18395,7 +18636,7 @@
     <w:p>
       <w:pPr>
         <w:keepLines/>
-        <w:spacing w:after="181" w:before="340" w:line="288" w:lineRule="atLeast"/>
+        <w:spacing w:after="181" w:before="227" w:line="288" w:lineRule="atLeast"/>
       </w:pPr>
       <w:r>
         <w:rPr>
@@ -18432,7 +18673,7 @@
         <w:pBdr>
           <w:bottom w:val="single" w:color="BA9A58" w:sz="5" w:space="6"/>
         </w:pBdr>
-        <w:spacing w:after="227" w:before="0" w:line="220" w:lineRule="atLeast"/>
+        <w:spacing w:after="227" w:before="227" w:line="220" w:lineRule="atLeast"/>
       </w:pPr>
       <w:r>
         <w:rPr>
@@ -18494,15 +18735,15 @@
     <w:p>
       <w:pPr>
         <w:keepLines/>
-        <w:spacing w:after="125" w:before="0" w:line="270" w:lineRule="atLeast"/>
+        <w:spacing w:after="170" w:before="0" w:line="288" w:lineRule="atLeast"/>
       </w:pPr>
       <w:r>
         <w:rPr>
           <w:rFonts w:ascii="Inter" w:cs="Inter" w:eastAsia="Inter" w:hAnsi="Inter"/>
           <w:color w:val="1C1A16"/>
           <w:kern w:val="2"/>
-          <w:sz w:val="18"/>
-          <w:szCs w:val="18"/>
+          <w:sz w:val="19"/>
+          <w:szCs w:val="19"/>
         </w:rPr>
         <w:t xml:space="preserve">El precio acordado cubre las partidas, mediciones y calidades incluidas. Los opcionales sin seleccionar y las exclusiones no forman parte del total contratado. Las decisiones abiertas que afecten al precio se resolverán antes de la aceptación.</w:t>
       </w:r>
@@ -18511,7 +18752,7 @@
       <w:pPr>
         <w:keepNext/>
         <w:keepLines/>
-        <w:spacing w:after="125" w:before="238" w:line="280" w:lineRule="atLeast"/>
+        <w:spacing w:after="125" w:before="397" w:line="280" w:lineRule="atLeast"/>
       </w:pPr>
       <w:r>
         <w:rPr>
@@ -18537,15 +18778,15 @@
     <w:p>
       <w:pPr>
         <w:keepLines/>
-        <w:spacing w:after="125" w:before="0" w:line="270" w:lineRule="atLeast"/>
+        <w:spacing w:after="170" w:before="0" w:line="288" w:lineRule="atLeast"/>
       </w:pPr>
       <w:r>
         <w:rPr>
           <w:rFonts w:ascii="Inter" w:cs="Inter" w:eastAsia="Inter" w:hAnsi="Inter"/>
           <w:color w:val="1C1A16"/>
           <w:kern w:val="2"/>
-          <w:sz w:val="18"/>
-          <w:szCs w:val="18"/>
+          <w:sz w:val="19"/>
+          <w:szCs w:val="19"/>
         </w:rPr>
         <w:t xml:space="preserve">Si se solicita un cambio o aparece una condición oculta, documentamos el hallazgo y presentamos su solución, coste con IVA y efecto en el plazo. Se ejecuta tras la aprobación escrita del cliente. Mientras se decide, acordamos las actuaciones afectadas y las medidas necesarias de protección.</w:t>
       </w:r>
@@ -18554,7 +18795,7 @@
       <w:pPr>
         <w:keepNext/>
         <w:keepLines/>
-        <w:spacing w:after="125" w:before="238" w:line="280" w:lineRule="atLeast"/>
+        <w:spacing w:after="125" w:before="397" w:line="280" w:lineRule="atLeast"/>
       </w:pPr>
       <w:r>
         <w:rPr>
@@ -18580,15 +18821,15 @@
     <w:p>
       <w:pPr>
         <w:keepLines/>
-        <w:spacing w:after="125" w:before="0" w:line="270" w:lineRule="atLeast"/>
+        <w:spacing w:after="170" w:before="0" w:line="288" w:lineRule="atLeast"/>
       </w:pPr>
       <w:r>
         <w:rPr>
           <w:rFonts w:ascii="Inter" w:cs="Inter" w:eastAsia="Inter" w:hAnsi="Inter"/>
           <w:color w:val="1C1A16"/>
           <w:kern w:val="2"/>
-          <w:sz w:val="18"/>
-          <w:szCs w:val="18"/>
+          <w:sz w:val="19"/>
+          <w:szCs w:val="19"/>
         </w:rPr>
         <w:t xml:space="preserve">Las referencias incluidas constan en las partidas y anexos. Cualquier cambio de gama o suministro del cliente debe quedar definido antes del pedido, junto con su coste, instalación y fecha de entrega. Las compras a medida se autorizan una vez verificadas las dimensiones.</w:t>
       </w:r>
@@ -18597,7 +18838,7 @@
       <w:pPr>
         <w:keepNext/>
         <w:keepLines/>
-        <w:spacing w:after="125" w:before="238" w:line="280" w:lineRule="atLeast"/>
+        <w:spacing w:after="125" w:before="397" w:line="280" w:lineRule="atLeast"/>
       </w:pPr>
       <w:r>
         <w:rPr>
@@ -18623,15 +18864,15 @@
     <w:p>
       <w:pPr>
         <w:keepLines/>
-        <w:spacing w:after="125" w:before="0" w:line="270" w:lineRule="atLeast"/>
+        <w:spacing w:after="170" w:before="0" w:line="288" w:lineRule="atLeast"/>
       </w:pPr>
       <w:r>
         <w:rPr>
           <w:rFonts w:ascii="Inter" w:cs="Inter" w:eastAsia="Inter" w:hAnsi="Inter"/>
           <w:color w:val="1C1A16"/>
           <w:kern w:val="2"/>
-          <w:sz w:val="18"/>
-          <w:szCs w:val="18"/>
+          <w:sz w:val="19"/>
+          <w:szCs w:val="19"/>
         </w:rPr>
         <w:t xml:space="preserve">El cliente se encargará de las licencias, tasas y documentación técnica necesarias para la obra, salvo que se acuerde expresamente su gestión por Renovare. Asimismo, facilitará el acceso a la vivienda y el suministro de agua y electricidad durante los trabajos. Los horarios se coordinarán con el cliente, respetando las normas de la comunidad y los horarios permitidos.</w:t>
       </w:r>
@@ -18639,15 +18880,15 @@
     <w:p>
       <w:pPr>
         <w:keepLines/>
-        <w:spacing w:after="125" w:before="0" w:line="270" w:lineRule="atLeast"/>
+        <w:spacing w:after="170" w:before="0" w:line="288" w:lineRule="atLeast"/>
       </w:pPr>
       <w:r>
         <w:rPr>
           <w:rFonts w:ascii="Inter" w:cs="Inter" w:eastAsia="Inter" w:hAnsi="Inter"/>
           <w:color w:val="1C1A16"/>
           <w:kern w:val="2"/>
-          <w:sz w:val="18"/>
-          <w:szCs w:val="18"/>
+          <w:sz w:val="19"/>
+          <w:szCs w:val="19"/>
         </w:rPr>
         <w:t xml:space="preserve">Renovare realizará la protección de las zonas de paso y de las zonas comunes afectadas por los trabajos, así como la retirada y gestión de los residuos generados y la limpieza final de obra, conforme a las partidas incluidas en el presupuesto.</w:t>
       </w:r>
@@ -18656,7 +18897,8 @@
       <w:pPr>
         <w:keepNext/>
         <w:keepLines/>
-        <w:spacing w:after="125" w:before="238" w:line="280" w:lineRule="atLeast"/>
+        <w:pageBreakBefore/>
+        <w:spacing w:after="125" w:before="227" w:line="280" w:lineRule="atLeast"/>
       </w:pPr>
       <w:r>
         <w:rPr>
@@ -18682,15 +18924,15 @@
     <w:p>
       <w:pPr>
         <w:keepLines/>
-        <w:spacing w:after="125" w:before="0" w:line="270" w:lineRule="atLeast"/>
+        <w:spacing w:after="170" w:before="0" w:line="288" w:lineRule="atLeast"/>
       </w:pPr>
       <w:r>
         <w:rPr>
           <w:rFonts w:ascii="Inter" w:cs="Inter" w:eastAsia="Inter" w:hAnsi="Inter"/>
           <w:color w:val="1C1A16"/>
           <w:kern w:val="2"/>
-          <w:sz w:val="18"/>
-          <w:szCs w:val="18"/>
+          <w:sz w:val="19"/>
+          <w:szCs w:val="19"/>
         </w:rPr>
         <w:t xml:space="preserve">La planificación corresponde al alcance aceptado. Si cambia el alcance o surge una incidencia que afecta al calendario, comunicamos su causa y acordamos por escrito las fechas actualizadas. Las entregas de materiales a medida se coordinan antes de confirmar el inicio.</w:t>
       </w:r>
@@ -18699,7 +18941,7 @@
       <w:pPr>
         <w:keepNext/>
         <w:keepLines/>
-        <w:spacing w:after="125" w:before="238" w:line="280" w:lineRule="atLeast"/>
+        <w:spacing w:after="125" w:before="397" w:line="280" w:lineRule="atLeast"/>
       </w:pPr>
       <w:r>
         <w:rPr>
@@ -18725,15 +18967,15 @@
     <w:p>
       <w:pPr>
         <w:keepLines/>
-        <w:spacing w:after="125" w:before="0" w:line="270" w:lineRule="atLeast"/>
+        <w:spacing w:after="170" w:before="0" w:line="288" w:lineRule="atLeast"/>
       </w:pPr>
       <w:r>
         <w:rPr>
           <w:rFonts w:ascii="Inter" w:cs="Inter" w:eastAsia="Inter" w:hAnsi="Inter"/>
           <w:color w:val="1C1A16"/>
           <w:kern w:val="2"/>
-          <w:sz w:val="18"/>
-          <w:szCs w:val="18"/>
+          <w:sz w:val="19"/>
+          <w:szCs w:val="19"/>
         </w:rPr>
         <w:t xml:space="preserve">Al finalizar la obra, se realizará una revisión conjunta con el cliente y se firmará un acta de entrega que recogerá las comprobaciones realizadas, la documentación entregada y los posibles remates pendientes, indicando su responsable y fecha prevista de resolución.</w:t>
       </w:r>
@@ -18741,15 +18983,15 @@
     <w:p>
       <w:pPr>
         <w:keepLines/>
-        <w:spacing w:after="125" w:before="0" w:line="270" w:lineRule="atLeast"/>
+        <w:spacing w:after="170" w:before="0" w:line="288" w:lineRule="atLeast"/>
       </w:pPr>
       <w:r>
         <w:rPr>
           <w:rFonts w:ascii="Inter" w:cs="Inter" w:eastAsia="Inter" w:hAnsi="Inter"/>
           <w:color w:val="1C1A16"/>
           <w:kern w:val="2"/>
-          <w:sz w:val="18"/>
-          <w:szCs w:val="18"/>
+          <w:sz w:val="19"/>
+          <w:szCs w:val="19"/>
         </w:rPr>
         <w:t xml:space="preserve">Las incidencias se comunicarán a Sebastián Vanegas, en el teléfono </w:t>
       </w:r>
@@ -18758,8 +19000,8 @@
           <w:rFonts w:ascii="Inter SemiBold" w:cs="Inter SemiBold" w:eastAsia="Inter SemiBold" w:hAnsi="Inter SemiBold"/>
           <w:color w:val="1C1A16"/>
           <w:kern w:val="2"/>
-          <w:sz w:val="18"/>
-          <w:szCs w:val="18"/>
+          <w:sz w:val="19"/>
+          <w:szCs w:val="19"/>
         </w:rPr>
         <w:t xml:space="preserve">624 892 643</w:t>
       </w:r>
@@ -18768,8 +19010,8 @@
           <w:rFonts w:ascii="Inter" w:cs="Inter" w:eastAsia="Inter" w:hAnsi="Inter"/>
           <w:color w:val="1C1A16"/>
           <w:kern w:val="2"/>
-          <w:sz w:val="18"/>
-          <w:szCs w:val="18"/>
+          <w:sz w:val="19"/>
+          <w:szCs w:val="19"/>
         </w:rPr>
         <w:t xml:space="preserve">. Renovare entregará las garantías, instrucciones de uso y mantenimiento y certificados que correspondan a los productos e instalaciones incluidos en el presupuesto. Las garantías de los trabajos y productos se atenderán conforme al contrato y a la normativa aplicable, respetando los derechos del cliente.</w:t>
       </w:r>
@@ -18778,7 +19020,7 @@
       <w:pPr>
         <w:keepNext/>
         <w:keepLines/>
-        <w:spacing w:after="125" w:before="238" w:line="280" w:lineRule="atLeast"/>
+        <w:spacing w:after="125" w:before="397" w:line="280" w:lineRule="atLeast"/>
       </w:pPr>
       <w:r>
         <w:rPr>
@@ -18804,17 +19046,17 @@
     <w:p>
       <w:pPr>
         <w:keepLines/>
-        <w:spacing w:after="125" w:before="0" w:line="270" w:lineRule="atLeast"/>
+        <w:spacing w:after="170" w:before="0" w:line="288" w:lineRule="atLeast"/>
       </w:pPr>
       <w:r>
         <w:rPr>
           <w:rFonts w:ascii="Inter" w:cs="Inter" w:eastAsia="Inter" w:hAnsi="Inter"/>
           <w:color w:val="1C1A16"/>
           <w:kern w:val="2"/>
-          <w:sz w:val="18"/>
-          <w:szCs w:val="18"/>
+          <w:sz w:val="19"/>
+          <w:szCs w:val="19"/>
         </w:rPr>
-        <w:t xml:space="preserve">La propuesta aceptada, sus anexos identificados y los cambios aprobados definen el alcance económico. El contrato de obra recoge las restantes condiciones, incluida cancelación y resolución. Seguro de responsabilidad civil: Occident GCO, S.A.U. de Seguros y Reaseguros, 8-11.477.641-F, con vigencia 03-02-2027.</w:t>
+        <w:t xml:space="preserve">La propuesta aceptada, sus anexos identificados y los cambios aprobados definen el alcance económico. El contrato de obra recoge las restantes condiciones, incluida cancelación y resolución. Seguro de responsabilidad civil: Occident GCO, S.A.U. de Seguros y Reaseguros, 8-11.477.641-F, con vigencia 03/02/2027.</w:t>
       </w:r>
     </w:p>
     <w:p>
@@ -18825,7 +19067,7 @@
         <w:pBdr>
           <w:bottom w:val="single" w:color="BA9A58" w:sz="5" w:space="6"/>
         </w:pBdr>
-        <w:spacing w:after="227" w:before="0" w:line="220" w:lineRule="atLeast"/>
+        <w:spacing w:after="227" w:before="227" w:line="220" w:lineRule="atLeast"/>
       </w:pPr>
       <w:r>
         <w:rPr>
@@ -18895,9 +19137,9 @@
               <w:right w:val="nil" w:color="auto" w:sz="0"/>
             </w:tcBorders>
             <w:tcMar>
-              <w:top w:type="dxa" w:w="79"/>
+              <w:top w:type="dxa" w:w="68"/>
               <w:left w:type="dxa" w:w="0"/>
-              <w:bottom w:type="dxa" w:w="79"/>
+              <w:bottom w:type="dxa" w:w="68"/>
               <w:right w:type="dxa" w:w="136"/>
             </w:tcMar>
             <w:vAlign w:val="top"/>
@@ -18929,9 +19171,9 @@
               <w:right w:val="nil" w:color="auto" w:sz="0"/>
             </w:tcBorders>
             <w:tcMar>
-              <w:top w:type="dxa" w:w="79"/>
+              <w:top w:type="dxa" w:w="68"/>
               <w:left w:type="dxa" w:w="0"/>
-              <w:bottom w:type="dxa" w:w="79"/>
+              <w:bottom w:type="dxa" w:w="68"/>
               <w:right w:type="dxa" w:w="136"/>
             </w:tcMar>
             <w:vAlign w:val="top"/>
@@ -18968,9 +19210,9 @@
               <w:right w:val="nil" w:color="auto" w:sz="0"/>
             </w:tcBorders>
             <w:tcMar>
-              <w:top w:type="dxa" w:w="79"/>
+              <w:top w:type="dxa" w:w="68"/>
               <w:left w:type="dxa" w:w="0"/>
-              <w:bottom w:type="dxa" w:w="79"/>
+              <w:bottom w:type="dxa" w:w="68"/>
               <w:right w:type="dxa" w:w="136"/>
             </w:tcMar>
             <w:vAlign w:val="top"/>
@@ -19002,9 +19244,9 @@
               <w:right w:val="nil" w:color="auto" w:sz="0"/>
             </w:tcBorders>
             <w:tcMar>
-              <w:top w:type="dxa" w:w="79"/>
+              <w:top w:type="dxa" w:w="68"/>
               <w:left w:type="dxa" w:w="0"/>
-              <w:bottom w:type="dxa" w:w="79"/>
+              <w:bottom w:type="dxa" w:w="68"/>
               <w:right w:type="dxa" w:w="136"/>
             </w:tcMar>
             <w:vAlign w:val="top"/>
@@ -19041,9 +19283,9 @@
               <w:right w:val="nil" w:color="auto" w:sz="0"/>
             </w:tcBorders>
             <w:tcMar>
-              <w:top w:type="dxa" w:w="79"/>
+              <w:top w:type="dxa" w:w="68"/>
               <w:left w:type="dxa" w:w="0"/>
-              <w:bottom w:type="dxa" w:w="79"/>
+              <w:bottom w:type="dxa" w:w="68"/>
               <w:right w:type="dxa" w:w="136"/>
             </w:tcMar>
             <w:vAlign w:val="top"/>
@@ -19075,9 +19317,9 @@
               <w:right w:val="nil" w:color="auto" w:sz="0"/>
             </w:tcBorders>
             <w:tcMar>
-              <w:top w:type="dxa" w:w="79"/>
+              <w:top w:type="dxa" w:w="68"/>
               <w:left w:type="dxa" w:w="0"/>
-              <w:bottom w:type="dxa" w:w="79"/>
+              <w:bottom w:type="dxa" w:w="68"/>
               <w:right w:type="dxa" w:w="136"/>
             </w:tcMar>
             <w:vAlign w:val="top"/>
@@ -19681,9 +19923,9 @@
               <w:right w:val="nil" w:color="auto" w:sz="0"/>
             </w:tcBorders>
             <w:tcMar>
-              <w:top w:type="dxa" w:w="108"/>
-              <w:left w:type="dxa" w:w="136"/>
-              <w:bottom w:type="dxa" w:w="108"/>
+              <w:top w:type="dxa" w:w="74"/>
+              <w:left w:type="dxa" w:w="136"/>
+              <w:bottom w:type="dxa" w:w="74"/>
               <w:right w:type="dxa" w:w="136"/>
             </w:tcMar>
             <w:vAlign w:val="top"/>
@@ -19715,9 +19957,9 @@
               <w:right w:val="nil" w:color="auto" w:sz="0"/>
             </w:tcBorders>
             <w:tcMar>
-              <w:top w:type="dxa" w:w="108"/>
-              <w:left w:type="dxa" w:w="136"/>
-              <w:bottom w:type="dxa" w:w="108"/>
+              <w:top w:type="dxa" w:w="74"/>
+              <w:left w:type="dxa" w:w="136"/>
+              <w:bottom w:type="dxa" w:w="74"/>
               <w:right w:type="dxa" w:w="136"/>
             </w:tcMar>
             <w:vAlign w:val="top"/>
@@ -19750,9 +19992,9 @@
               <w:right w:val="nil" w:color="auto" w:sz="0"/>
             </w:tcBorders>
             <w:tcMar>
-              <w:top w:type="dxa" w:w="108"/>
-              <w:left w:type="dxa" w:w="136"/>
-              <w:bottom w:type="dxa" w:w="108"/>
+              <w:top w:type="dxa" w:w="74"/>
+              <w:left w:type="dxa" w:w="136"/>
+              <w:bottom w:type="dxa" w:w="74"/>
               <w:right w:type="dxa" w:w="136"/>
             </w:tcMar>
             <w:vAlign w:val="top"/>
@@ -19790,9 +20032,9 @@
               <w:right w:val="nil" w:color="auto" w:sz="0"/>
             </w:tcBorders>
             <w:tcMar>
-              <w:top w:type="dxa" w:w="108"/>
-              <w:left w:type="dxa" w:w="136"/>
-              <w:bottom w:type="dxa" w:w="108"/>
+              <w:top w:type="dxa" w:w="74"/>
+              <w:left w:type="dxa" w:w="136"/>
+              <w:bottom w:type="dxa" w:w="74"/>
               <w:right w:type="dxa" w:w="136"/>
             </w:tcMar>
             <w:vAlign w:val="top"/>
@@ -19824,9 +20066,9 @@
               <w:right w:val="nil" w:color="auto" w:sz="0"/>
             </w:tcBorders>
             <w:tcMar>
-              <w:top w:type="dxa" w:w="108"/>
-              <w:left w:type="dxa" w:w="136"/>
-              <w:bottom w:type="dxa" w:w="108"/>
+              <w:top w:type="dxa" w:w="74"/>
+              <w:left w:type="dxa" w:w="136"/>
+              <w:bottom w:type="dxa" w:w="74"/>
               <w:right w:type="dxa" w:w="136"/>
             </w:tcMar>
             <w:vAlign w:val="top"/>
@@ -19859,9 +20101,9 @@
               <w:right w:val="nil" w:color="auto" w:sz="0"/>
             </w:tcBorders>
             <w:tcMar>
-              <w:top w:type="dxa" w:w="108"/>
-              <w:left w:type="dxa" w:w="136"/>
-              <w:bottom w:type="dxa" w:w="108"/>
+              <w:top w:type="dxa" w:w="74"/>
+              <w:left w:type="dxa" w:w="136"/>
+              <w:bottom w:type="dxa" w:w="74"/>
               <w:right w:type="dxa" w:w="136"/>
             </w:tcMar>
             <w:vAlign w:val="top"/>
@@ -19900,9 +20142,9 @@
             </w:tcBorders>
             <w:shd w:fill="F3ECDD" w:color="auto" w:val="clear"/>
             <w:tcMar>
-              <w:top w:type="dxa" w:w="108"/>
-              <w:left w:type="dxa" w:w="136"/>
-              <w:bottom w:type="dxa" w:w="108"/>
+              <w:top w:type="dxa" w:w="74"/>
+              <w:left w:type="dxa" w:w="136"/>
+              <w:bottom w:type="dxa" w:w="74"/>
               <w:right w:type="dxa" w:w="136"/>
             </w:tcMar>
             <w:vAlign w:val="top"/>
@@ -19937,9 +20179,9 @@
             </w:tcBorders>
             <w:shd w:fill="F3ECDD" w:color="auto" w:val="clear"/>
             <w:tcMar>
-              <w:top w:type="dxa" w:w="108"/>
-              <w:left w:type="dxa" w:w="136"/>
-              <w:bottom w:type="dxa" w:w="108"/>
+              <w:top w:type="dxa" w:w="74"/>
+              <w:left w:type="dxa" w:w="136"/>
+              <w:bottom w:type="dxa" w:w="74"/>
               <w:right w:type="dxa" w:w="136"/>
             </w:tcMar>
             <w:vAlign w:val="top"/>
@@ -19975,9 +20217,9 @@
             </w:tcBorders>
             <w:shd w:fill="F3ECDD" w:color="auto" w:val="clear"/>
             <w:tcMar>
-              <w:top w:type="dxa" w:w="108"/>
-              <w:left w:type="dxa" w:w="136"/>
-              <w:bottom w:type="dxa" w:w="108"/>
+              <w:top w:type="dxa" w:w="74"/>
+              <w:left w:type="dxa" w:w="136"/>
+              <w:bottom w:type="dxa" w:w="74"/>
               <w:right w:type="dxa" w:w="136"/>
             </w:tcMar>
             <w:vAlign w:val="top"/>
@@ -20017,9 +20259,9 @@
               <w:right w:val="nil" w:color="auto" w:sz="0"/>
             </w:tcBorders>
             <w:tcMar>
-              <w:top w:type="dxa" w:w="108"/>
-              <w:left w:type="dxa" w:w="136"/>
-              <w:bottom w:type="dxa" w:w="108"/>
+              <w:top w:type="dxa" w:w="74"/>
+              <w:left w:type="dxa" w:w="136"/>
+              <w:bottom w:type="dxa" w:w="74"/>
               <w:right w:type="dxa" w:w="136"/>
             </w:tcMar>
             <w:vAlign w:val="top"/>
@@ -20051,9 +20293,9 @@
               <w:right w:val="nil" w:color="auto" w:sz="0"/>
             </w:tcBorders>
             <w:tcMar>
-              <w:top w:type="dxa" w:w="108"/>
-              <w:left w:type="dxa" w:w="136"/>
-              <w:bottom w:type="dxa" w:w="108"/>
+              <w:top w:type="dxa" w:w="74"/>
+              <w:left w:type="dxa" w:w="136"/>
+              <w:bottom w:type="dxa" w:w="74"/>
               <w:right w:type="dxa" w:w="136"/>
             </w:tcMar>
             <w:vAlign w:val="top"/>
@@ -20086,9 +20328,9 @@
               <w:right w:val="nil" w:color="auto" w:sz="0"/>
             </w:tcBorders>
             <w:tcMar>
-              <w:top w:type="dxa" w:w="108"/>
-              <w:left w:type="dxa" w:w="136"/>
-              <w:bottom w:type="dxa" w:w="108"/>
+              <w:top w:type="dxa" w:w="74"/>
+              <w:left w:type="dxa" w:w="136"/>
+              <w:bottom w:type="dxa" w:w="74"/>
               <w:right w:type="dxa" w:w="136"/>
             </w:tcMar>
             <w:vAlign w:val="top"/>
@@ -20116,7 +20358,7 @@
     <w:p>
       <w:pPr>
         <w:keepLines/>
-        <w:spacing w:after="0" w:before="283" w:line="20" w:lineRule="exact"/>
+        <w:spacing w:after="0" w:before="227" w:line="20" w:lineRule="exact"/>
       </w:pPr>
       <w:r>
         <w:rPr>
@@ -20271,7 +20513,7 @@
     <w:p>
       <w:pPr>
         <w:keepLines/>
-        <w:spacing w:after="181" w:before="283" w:line="288" w:lineRule="atLeast"/>
+        <w:spacing w:after="181" w:before="227" w:line="288" w:lineRule="atLeast"/>
       </w:pPr>
       <w:r>
         <w:rPr>
@@ -20287,7 +20529,7 @@
     <w:p>
       <w:pPr>
         <w:keepLines/>
-        <w:spacing w:after="0" w:before="340" w:line="20" w:lineRule="exact"/>
+        <w:spacing w:after="0" w:before="227" w:line="20" w:lineRule="exact"/>
       </w:pPr>
       <w:r>
         <w:rPr>
@@ -20371,7 +20613,7 @@
               <w:pBdr>
                 <w:bottom w:val="single" w:color="1C1A16" w:sz="6"/>
               </w:pBdr>
-              <w:spacing w:after="0" w:before="624" w:line="280" w:lineRule="atLeast"/>
+              <w:spacing w:after="0" w:before="567" w:line="280" w:lineRule="atLeast"/>
             </w:pPr>
             <w:r>
               <w:rPr>
@@ -20493,7 +20735,7 @@
               <w:pBdr>
                 <w:bottom w:val="single" w:color="1C1A16" w:sz="6"/>
               </w:pBdr>
-              <w:spacing w:after="0" w:before="624" w:line="280" w:lineRule="atLeast"/>
+              <w:spacing w:after="0" w:before="567" w:line="280" w:lineRule="atLeast"/>
             </w:pPr>
             <w:r>
               <w:rPr>
@@ -20544,7 +20786,7 @@
     <w:p>
       <w:pPr>
         <w:keepLines/>
-        <w:spacing w:after="0" w:before="283" w:line="20" w:lineRule="exact"/>
+        <w:spacing w:after="0" w:before="340" w:line="20" w:lineRule="exact"/>
       </w:pPr>
       <w:r>
         <w:rPr>

</xml_diff>